<commit_message>
Update Chapter 4 JSON with manual corrections and re-export formatted docx
</commit_message>
<xml_diff>
--- a/第四章/第四章.docx
+++ b/第四章/第四章.docx
@@ -123,7 +123,67 @@
           <w:b w:val="0"/>
           <w:sz w:val="24"/>
         </w:rPr>
-        <w:t>說明：一.復貴院八十八年五月二十八日（八八）校附醫總字第一二〇二九號函。二.關於規定投標之藥品須為業經各院藥事委員會審查通過乙節，該審查機制如符合政府採購法（以下簡稱本法）第十八條第三項「以公告方式預先依一定資格條件辦理廠商資格審查後，再行邀請符合資格之廠商投標。」之規定，則屬妥適。三.關於擬採選擇性招標方式辦理乙節，建議改依本法第二十條第二款至第四款之情形報請上級機關核准，以免無法達到本法第二十一條第三項「經常性採購，應建立六家以上之合格廠商名單。」之規定。四.如依前項建議辦理，每一品項藥品、衛材可分項決標，各項提出資格文件供審查之廠商及實際審查後之投標廠商家數，均不受本法第四十八條第一項關於三家以上合格廠商投標之限制。</w:t>
+        <w:t>說明：</w:t>
+      </w:r>
+    </w:p>
+    <w:p>
+      <w:pPr>
+        <w:pStyle w:val="a9"/>
+        <w:ind w:left="720" w:hanging="480"/>
+        <w:jc w:val="both"/>
+      </w:pPr>
+      <w:r>
+        <w:rPr>
+          <w:rFonts w:ascii="新細明體" w:hAnsi="新細明體" w:eastAsia="新細明體"/>
+          <w:b w:val="0"/>
+          <w:sz w:val="24"/>
+        </w:rPr>
+        <w:t>一、復貴院八十八年五月二十八日（八八）校附醫總字第一二〇二九號函。</w:t>
+      </w:r>
+    </w:p>
+    <w:p>
+      <w:pPr>
+        <w:pStyle w:val="a9"/>
+        <w:ind w:left="720" w:hanging="480"/>
+        <w:jc w:val="both"/>
+      </w:pPr>
+      <w:r>
+        <w:rPr>
+          <w:rFonts w:ascii="新細明體" w:hAnsi="新細明體" w:eastAsia="新細明體"/>
+          <w:b w:val="0"/>
+          <w:sz w:val="24"/>
+        </w:rPr>
+        <w:t>二、關於規定投標之藥品須為業經各院藥事委員會審查通過乙節，該審查機制如符合政府採購法（以下簡稱本法）第十八條第三項「以公告方式預先依一定資格條件辦理廠商資格審查後，再行邀請符合資格之廠商投標。」之規定，則屬妥適。</w:t>
+      </w:r>
+    </w:p>
+    <w:p>
+      <w:pPr>
+        <w:pStyle w:val="a9"/>
+        <w:ind w:left="720" w:hanging="480"/>
+        <w:jc w:val="both"/>
+      </w:pPr>
+      <w:r>
+        <w:rPr>
+          <w:rFonts w:ascii="新細明體" w:hAnsi="新細明體" w:eastAsia="新細明體"/>
+          <w:b w:val="0"/>
+          <w:sz w:val="24"/>
+        </w:rPr>
+        <w:t>三、關於擬採選擇性招標方式辦理乙節，建議改依本法第二十條第二款至第四款之情形報請上級機關核准，以免無法達到本法第二十一條第三項「經常性採購，應建立六家以上之合格廠商名單。」之規定。</w:t>
+      </w:r>
+    </w:p>
+    <w:p>
+      <w:pPr>
+        <w:pStyle w:val="a9"/>
+        <w:ind w:left="720" w:hanging="480"/>
+        <w:jc w:val="both"/>
+      </w:pPr>
+      <w:r>
+        <w:rPr>
+          <w:rFonts w:ascii="新細明體" w:hAnsi="新細明體" w:eastAsia="新細明體"/>
+          <w:b w:val="0"/>
+          <w:sz w:val="24"/>
+        </w:rPr>
+        <w:t>四、如依前項建議辦理，每一品項藥品、衛材可分項決標，各項提出資格文件供審查之廠商及實際審查後之投標廠商家數，均不受本法第四十八條第一項關於三家以上合格廠商投標之限制。</w:t>
       </w:r>
     </w:p>
     <w:p/>
@@ -244,7 +304,7 @@
           <w:b w:val="0"/>
           <w:sz w:val="24"/>
         </w:rPr>
-        <w:t>備註：1. 「註」：「中央機關未達公告金額採購招標辦法」業經本會九十一年九月二十五日（九一）工程企字第〇九一〇〇四〇一九五〇號令修正公布，本函說明二所述「第二條第二項」修正為「第二條第一項第一款」。</w:t>
+        <w:t>備註：1. 「中央機關未達公告金額採購招標辦法」業經本會九十一年九月二十五日（九一）工程企字第〇九一〇〇四〇一九五〇號令修正公布，本函說明二所述「第二條第二項」修正為「第二條第一項第一款」。</w:t>
       </w:r>
     </w:p>
     <w:p>
@@ -462,31 +522,16 @@
     <w:p>
       <w:pPr>
         <w:pStyle w:val="a9"/>
-        <w:ind w:left="960" w:hanging="960"/>
-        <w:jc w:val="both"/>
-      </w:pPr>
-      <w:r>
-        <w:rPr>
-          <w:rFonts w:ascii="新細明體" w:hAnsi="新細明體" w:eastAsia="新細明體"/>
-          <w:b w:val="0"/>
-          <w:sz w:val="24"/>
-        </w:rPr>
-        <w:t>備註：1. 「註」：依本會九十一年九月二十五日（九一）工程企字第〇九一〇〇四〇一九五〇號令修正公布「中央機關未達公告金額採購招標辦法」，本函說明三所述該辦法「第二條第三款」應配合修正為「第二條第一項第二款」。</w:t>
-      </w:r>
-    </w:p>
-    <w:p>
-      <w:pPr>
-        <w:pStyle w:val="a9"/>
-        <w:ind w:left="960" w:hanging="240"/>
-        <w:jc w:val="both"/>
-      </w:pPr>
-      <w:r>
-        <w:rPr>
-          <w:rFonts w:ascii="新細明體" w:hAnsi="新細明體" w:eastAsia="新細明體"/>
-          <w:b w:val="0"/>
-          <w:sz w:val="24"/>
-        </w:rPr>
-        <w:t>2. 「註」：依本會九十一年九月二十五日（九一）工程企字第○九一○○四○一九五○號令修正公布「中央機關未達公告金額採購招標辦法」，本函說明三所述該辦法「第二條第三款」應配合修正為「第二條第一項第二款」。</w:t>
+        <w:ind w:left="720" w:hanging="720"/>
+        <w:jc w:val="both"/>
+      </w:pPr>
+      <w:r>
+        <w:rPr>
+          <w:rFonts w:ascii="新細明體" w:hAnsi="新細明體" w:eastAsia="新細明體"/>
+          <w:b w:val="0"/>
+          <w:sz w:val="24"/>
+        </w:rPr>
+        <w:t>備註：1. 依本會九十一年九月二十五日（九一）工程企字第〇九一〇〇四〇一九五〇號令修正公布「中央機關未達公告金額採購招標辦法」，本函說明三所述該辦法「第二條第三款」應配合修正為「第二條第一項第二款」。</w:t>
       </w:r>
     </w:p>
     <w:p/>
@@ -1038,7 +1083,7 @@
     <w:p>
       <w:pPr>
         <w:pStyle w:val="a9"/>
-        <w:ind w:left="960" w:hanging="960"/>
+        <w:ind w:left="720" w:hanging="720"/>
         <w:jc w:val="both"/>
       </w:pPr>
       <w:r>
@@ -1050,21 +1095,6 @@
         <w:t>備註：1. 「招標期限標準」於九十一年五月八日（九一）工程企字第九一〇一七六九四號令修正發布，本函說明三「特殊採購之等標期不得少於二十八日」之規定業已刪除。</w:t>
       </w:r>
     </w:p>
-    <w:p>
-      <w:pPr>
-        <w:pStyle w:val="a9"/>
-        <w:ind w:left="960" w:hanging="240"/>
-        <w:jc w:val="both"/>
-      </w:pPr>
-      <w:r>
-        <w:rPr>
-          <w:rFonts w:ascii="新細明體" w:hAnsi="新細明體" w:eastAsia="新細明體"/>
-          <w:b w:val="0"/>
-          <w:sz w:val="24"/>
-        </w:rPr>
-        <w:t>2. 「招標期限標準」於九十一年五月八日（九一）工程企字第九一○一七六九四號令修正發布，本函說明三「特殊採購之等標期不得少於二十八日」之規定業已刪除。</w:t>
-      </w:r>
-    </w:p>
     <w:p/>
     <w:p>
       <w:pPr>
@@ -1700,21 +1730,6 @@
           <w:b w:val="0"/>
           <w:sz w:val="24"/>
         </w:rPr>
-        <w:t>聯絡人：技術處蔡倍任 (02)87897681</w:t>
-      </w:r>
-    </w:p>
-    <w:p>
-      <w:pPr>
-        <w:pStyle w:val="a9"/>
-        <w:ind w:left="720" w:hanging="720"/>
-        <w:jc w:val="both"/>
-      </w:pPr>
-      <w:r>
-        <w:rPr>
-          <w:rFonts w:ascii="新細明體" w:hAnsi="新細明體" w:eastAsia="新細明體"/>
-          <w:b w:val="0"/>
-          <w:sz w:val="24"/>
-        </w:rPr>
         <w:t>主旨：有關貴部函詢「各機關辦理公有建築物作業手冊」自100年12月15日不再援用，採購單位擬於取得建照前先行招標，是否有其他法令規定可資援引參考一案，復請查照。</w:t>
       </w:r>
     </w:p>
@@ -1942,7 +1957,112 @@
           <w:b w:val="0"/>
           <w:sz w:val="24"/>
         </w:rPr>
-        <w:t>主旨：各機關招標及履約中之技術服務採購案，因COVID-19疫情持續嚴峻致影響廠商備標或履約者，相關辦理原則如說明，請查照並請主動協助。說明：一、中央流行疫情指揮中心（下稱指揮中心）因應疫情，於110年5月15日起陸續宣布雙北及全國疫情警戒升至第三級，嗣宣布三級警戒延至6月14日。經濟部5月22日建議企業比照中央政府機關推動居家辦公人力至二分之一。二、機關即將招標或於等標期間之技術服務案，應視近期疫情警戒及防疫政策之影響，依個案特性訂定合理招標期限，或依政府採購法（下稱採購法）第41條第2項末段規定妥適延長。三、本會訂定之公共工程技術服務採購契約範本（下稱範本）已訂有因天災或事變等不可抗力或不可歸責於契約當事人之事由，致未能依時履約者（例如廠商因配合指揮中心防疫政策，推動因居家辦公或因防疫需求或測量鑽探工作出工減少等影響時程），廠商得檢具相關事證向機關申請延長履約期限[範本第13條第四款第（五）目、第（十一）目或第（十二）目]。四、履約中之技術服務案，如因疫情展延履約期限者，其增加之必要費用依個案契約類似範本第4條第五款至第七款之約定，由機關負擔；其中屬專案管理及監造部分，因疫情施工期延長增加之專案管理及監造期間，應增加服務費用外，若受工程停工之影響，亦得依類似範本第4條第七款及第九款內容，依停工期間所留之必要人力核實計算增加監造服務費用。個案契約無前約定者，機關得參考上開範本內容主動協助辦理契約變更；又因疫情屬廠商不可預見且無法合理防範之情形，機關亦得比照工程採購契約範本第4條第（八）款第4目之內容，辦理契約變更。五、個案若有實際需要，亦得合意變更調整契約工作內容或工作流程。又廠商依約請求機關付款，請依契約約定之審核及付款期限辦理，以免影響廠商資金調度。六、如有疑義或爭議，機關可依採購法第11條之1及「機關採購工作及審查小組設置及作業辦法」成立採購工作及審查小組協助提供該疑義或爭議處理之諮詢。本會107年1月11日工程企字第10700011360號函（公開於本會網站）並已建立公共建設諮詢機制，協助釐清解決機關與廠商對契約條文認知歧異之問題。另本會已建立「COVID-19疫情問題反映專區」（網址：https://cloudweb01.pcc.gov.tw/message），有關因疫情所衍生之相關問題，為減少公文往返時效，可透過本平台反映，本會將儘速協助處理。</w:t>
+        <w:t>主旨：各機關招標及履約中之技術服務採購案，因COVID-19疫情持續嚴峻致影響廠商備標或履約者，相關辦理原則如說明，請查照並請主動協助。</w:t>
+      </w:r>
+    </w:p>
+    <w:p>
+      <w:pPr>
+        <w:pStyle w:val="a9"/>
+        <w:ind w:left="720" w:hanging="720"/>
+        <w:jc w:val="both"/>
+      </w:pPr>
+      <w:r>
+        <w:rPr>
+          <w:rFonts w:ascii="新細明體" w:hAnsi="新細明體" w:eastAsia="新細明體"/>
+          <w:b w:val="0"/>
+          <w:sz w:val="24"/>
+        </w:rPr>
+        <w:t>說明：</w:t>
+      </w:r>
+    </w:p>
+    <w:p>
+      <w:pPr>
+        <w:pStyle w:val="a9"/>
+        <w:ind w:left="720" w:hanging="480"/>
+        <w:jc w:val="both"/>
+      </w:pPr>
+      <w:r>
+        <w:rPr>
+          <w:rFonts w:ascii="新細明體" w:hAnsi="新細明體" w:eastAsia="新細明體"/>
+          <w:b w:val="0"/>
+          <w:sz w:val="24"/>
+        </w:rPr>
+        <w:t>一、中央流行疫情指揮中心（下稱指揮中心）因應疫情，於110年5月15日起陸續宣布雙北及全國疫情警戒升至第三級，嗣宣布三級警戒延至6月14日。經濟部5月22日建議企業比照中央政府機關推動居家辦公人力至二分之一。</w:t>
+      </w:r>
+    </w:p>
+    <w:p>
+      <w:pPr>
+        <w:pStyle w:val="a9"/>
+        <w:ind w:left="720" w:hanging="480"/>
+        <w:jc w:val="both"/>
+      </w:pPr>
+      <w:r>
+        <w:rPr>
+          <w:rFonts w:ascii="新細明體" w:hAnsi="新細明體" w:eastAsia="新細明體"/>
+          <w:b w:val="0"/>
+          <w:sz w:val="24"/>
+        </w:rPr>
+        <w:t>二、機關即將招標或於等標期間之技術服務案，應視近期疫情警戒及防疫政策之影響，依個案特性訂定合理招標期限，或依政府採購法（下稱採購法）第41條第2項末段規定妥適延長。</w:t>
+      </w:r>
+    </w:p>
+    <w:p>
+      <w:pPr>
+        <w:pStyle w:val="a9"/>
+        <w:ind w:left="720" w:hanging="480"/>
+        <w:jc w:val="both"/>
+      </w:pPr>
+      <w:r>
+        <w:rPr>
+          <w:rFonts w:ascii="新細明體" w:hAnsi="新細明體" w:eastAsia="新細明體"/>
+          <w:b w:val="0"/>
+          <w:sz w:val="24"/>
+        </w:rPr>
+        <w:t>三、本會訂定之公共工程技術服務採購契約範本（下稱範本）已訂有因天災或事變等不可抗力或不可歸責於契約當事人之事由，致未能依時履約者（例如廠商因配合指揮中心防疫政策，推動因居家辦公或因防疫需求或測量鑽探工作出工減少等影響時程），廠商得檢具相關事證向機關申請延長履約期限[範本第13條第四款第（五）目、第（十一）目或第（十二）目]。</w:t>
+      </w:r>
+    </w:p>
+    <w:p>
+      <w:pPr>
+        <w:pStyle w:val="a9"/>
+        <w:ind w:left="720" w:hanging="480"/>
+        <w:jc w:val="both"/>
+      </w:pPr>
+      <w:r>
+        <w:rPr>
+          <w:rFonts w:ascii="新細明體" w:hAnsi="新細明體" w:eastAsia="新細明體"/>
+          <w:b w:val="0"/>
+          <w:sz w:val="24"/>
+        </w:rPr>
+        <w:t>四、履約中之技術服務案，如因疫情展延履約期限者，其增加之必要費用依個案契約類似範本第4條第五款至第七款之約定，由機關負擔；其中屬專案管理及監造部分，因疫情施工期延長增加之專案管理及監造期間，應增加服務費用外，若受工程停工之影響，亦得依類似範本第4條第七款及第九款內容，依停工期間所留之必要人力核實計算增加監造服務費用。個案契約無前約定者，機關得參考上開範本內容主動協助辦理契約變更；又因疫情屬廠商不可預見且無法合理防範之情形，機關亦得比照工程採購契約範本第4條第（八）款第4目之內容，辦理契約變更。</w:t>
+      </w:r>
+    </w:p>
+    <w:p>
+      <w:pPr>
+        <w:pStyle w:val="a9"/>
+        <w:ind w:left="720" w:hanging="480"/>
+        <w:jc w:val="both"/>
+      </w:pPr>
+      <w:r>
+        <w:rPr>
+          <w:rFonts w:ascii="新細明體" w:hAnsi="新細明體" w:eastAsia="新細明體"/>
+          <w:b w:val="0"/>
+          <w:sz w:val="24"/>
+        </w:rPr>
+        <w:t>五、個案若有實際需要，亦得合意變更調整契約工作內容或工作流程。又廠商依約請求機關付款，請依契約約定之審核及付款期限辦理，以免影響廠商資金調度。</w:t>
+      </w:r>
+    </w:p>
+    <w:p>
+      <w:pPr>
+        <w:pStyle w:val="a9"/>
+        <w:ind w:left="720" w:hanging="480"/>
+        <w:jc w:val="both"/>
+      </w:pPr>
+      <w:r>
+        <w:rPr>
+          <w:rFonts w:ascii="新細明體" w:hAnsi="新細明體" w:eastAsia="新細明體"/>
+          <w:b w:val="0"/>
+          <w:sz w:val="24"/>
+        </w:rPr>
+        <w:t>六、如有疑義或爭議，機關可依採購法第11條之1及「機關採購工作及審查小組設置及作業辦法」成立採購工作及審查小組協助提供該疑義或爭議處理之諮詢。本會107年1月11日工程企字第10700011360號函（公開於本會網站）並已建立公共建設諮詢機制，協助釐清解決機關與廠商對契約條文認知歧異之問題。另本會已建立「COVID-19疫情問題反映專區」（網址：https://cloudweb01.pcc.gov.tw/message），有關因疫情所衍生之相關問題，為減少公文往返時效，可透過本平台反映，本會將儘速協助處理。</w:t>
       </w:r>
     </w:p>
     <w:p/>
@@ -3171,7 +3291,22 @@
           <w:b w:val="0"/>
           <w:sz w:val="24"/>
         </w:rPr>
-        <w:t>一、依旨揭辦法第二十條規定，本會前於本（九十三）年元月建置供各機關傳輸其採購專業人員資料之旨揭系統，因其檢核資料正確性及安全性需再加強，爰曾配合系統更新需要暫停該系統受理傳輸功能。二、目前該系統已完成新增、更正、查詢及撤銷等功能，並改以政府採購ＩＣ智慧卡簽章方式始能進行傳輸。系統網址為http://202.39.47.201/GPED/gped_home.jsp，並可經由本會網站(http://www.pcc.gov.tw)\政府採購\採購專業人員相關資訊\採購專業人員資料庫，或經政府採購資訊公告系統(http://web.pcc.gov.tw)\採購專業人員資料庫\進入使用。</w:t>
+        <w:t>一、依旨揭辦法第二十條規定，本會前於本（九十三）年元月建置供各機關傳輸其採購專業人員資料之旨揭系統，因其檢核資料正確性及安全性需再加強，爰曾配合系統更新需要暫停該系統受理傳輸功能。</w:t>
+      </w:r>
+    </w:p>
+    <w:p>
+      <w:pPr>
+        <w:pStyle w:val="a9"/>
+        <w:ind w:left="720" w:hanging="480"/>
+        <w:jc w:val="both"/>
+      </w:pPr>
+      <w:r>
+        <w:rPr>
+          <w:rFonts w:ascii="新細明體" w:hAnsi="新細明體" w:eastAsia="新細明體"/>
+          <w:b w:val="0"/>
+          <w:sz w:val="24"/>
+        </w:rPr>
+        <w:t>二、目前該系統已完成新增、更正、查詢及撤銷等功能，並改以政府採購ＩＣ智慧卡簽章方式始能進行傳輸。系統網址為http://202.39.47.201/GPED/gped_home.jsp，並可經由本會網站(http://www.pcc.gov.tw)\政府採購\採購專業人員相關資訊\採購專業人員資料庫，或經政府採購資訊公告系統(http://web.pcc.gov.tw)\採購專業人員資料庫\進入使用。</w:t>
       </w:r>
     </w:p>
     <w:p>
@@ -4021,7 +4156,112 @@
           <w:b w:val="0"/>
           <w:sz w:val="24"/>
         </w:rPr>
-        <w:t>１、&lt;u近1年&lt;/u以底價得標件數達&lt;u50件以上&lt;/u廠商名單２、&lt;u近1年&lt;/u以底價99%以上但未達100%，得標件數達&lt;u20件以上&lt;/u廠商名單３、&lt;u近1年&lt;/u同一機關遴聘同一外聘委員&lt;u10次以上&lt;/u清單４、&lt;u近1年&lt;/u同一外聘委員參與同一得標廠商之採購案評選會&lt;u7次以上&lt;/u清單５、&lt;u近1年&lt;/u工程採購得標&lt;u50件以上&lt;/u廠商名單６、&lt;u近1年&lt;/u工程採購廠商得標&lt;u50件以上&lt;/u且於同一機關得標&lt;u10件以上&lt;/u之廠商及機關名單７、&lt;u近1年&lt;/u工程採購案廠商於同一機關得標&lt;u20件以上&lt;/u之廠商及機關名單８、&lt;u近1季&lt;/u未經公開決標案件數比率大於或等於&lt;u30%以上&lt;/u機關名單(二)與前述警示訊息有關者，招標機關登入政府電子採購網時，系統會跳出「我的最新消息」視窗，其中「政府採購警示訊息」項目會顯示與登入機關有關之警示項目筆數，使用者可點選「前往處理」按鈕，以顯示警示的項目，及取得相關標案資訊。</w:t>
+        <w:t>１、近1年以底價得標件數達50件以上廠商名單</w:t>
+      </w:r>
+    </w:p>
+    <w:p>
+      <w:pPr>
+        <w:pStyle w:val="a9"/>
+        <w:ind w:left="1225" w:hanging="397"/>
+        <w:jc w:val="both"/>
+      </w:pPr>
+      <w:r>
+        <w:rPr>
+          <w:rFonts w:ascii="新細明體" w:hAnsi="新細明體" w:eastAsia="新細明體"/>
+          <w:b w:val="0"/>
+          <w:sz w:val="24"/>
+        </w:rPr>
+        <w:t>２、近1年以底價99%以上但未達100%，得標件數達20件以上廠商名單</w:t>
+      </w:r>
+    </w:p>
+    <w:p>
+      <w:pPr>
+        <w:pStyle w:val="a9"/>
+        <w:ind w:left="1225" w:hanging="397"/>
+        <w:jc w:val="both"/>
+      </w:pPr>
+      <w:r>
+        <w:rPr>
+          <w:rFonts w:ascii="新細明體" w:hAnsi="新細明體" w:eastAsia="新細明體"/>
+          <w:b w:val="0"/>
+          <w:sz w:val="24"/>
+        </w:rPr>
+        <w:t>３、近1年同一機關遴聘同一外聘委員10次以上清單</w:t>
+      </w:r>
+    </w:p>
+    <w:p>
+      <w:pPr>
+        <w:pStyle w:val="a9"/>
+        <w:ind w:left="1225" w:hanging="397"/>
+        <w:jc w:val="both"/>
+      </w:pPr>
+      <w:r>
+        <w:rPr>
+          <w:rFonts w:ascii="新細明體" w:hAnsi="新細明體" w:eastAsia="新細明體"/>
+          <w:b w:val="0"/>
+          <w:sz w:val="24"/>
+        </w:rPr>
+        <w:t>４、近1年同一外聘委員參與同一得標廠商之採購案評選會7次以上清單</w:t>
+      </w:r>
+    </w:p>
+    <w:p>
+      <w:pPr>
+        <w:pStyle w:val="a9"/>
+        <w:ind w:left="1225" w:hanging="397"/>
+        <w:jc w:val="both"/>
+      </w:pPr>
+      <w:r>
+        <w:rPr>
+          <w:rFonts w:ascii="新細明體" w:hAnsi="新細明體" w:eastAsia="新細明體"/>
+          <w:b w:val="0"/>
+          <w:sz w:val="24"/>
+        </w:rPr>
+        <w:t>５、近1年工程採購得標50件以上廠商名單</w:t>
+      </w:r>
+    </w:p>
+    <w:p>
+      <w:pPr>
+        <w:pStyle w:val="a9"/>
+        <w:ind w:left="1225" w:hanging="397"/>
+        <w:jc w:val="both"/>
+      </w:pPr>
+      <w:r>
+        <w:rPr>
+          <w:rFonts w:ascii="新細明體" w:hAnsi="新細明體" w:eastAsia="新細明體"/>
+          <w:b w:val="0"/>
+          <w:sz w:val="24"/>
+        </w:rPr>
+        <w:t>６、近1年工程採購廠商得標50件以上且於同一機關得標10件以上之廠商及機關名單</w:t>
+      </w:r>
+    </w:p>
+    <w:p>
+      <w:pPr>
+        <w:pStyle w:val="a9"/>
+        <w:ind w:left="1225" w:hanging="397"/>
+        <w:jc w:val="both"/>
+      </w:pPr>
+      <w:r>
+        <w:rPr>
+          <w:rFonts w:ascii="新細明體" w:hAnsi="新細明體" w:eastAsia="新細明體"/>
+          <w:b w:val="0"/>
+          <w:sz w:val="24"/>
+        </w:rPr>
+        <w:t>７、近1年工程採購案廠商於同一機關得標20件以上之廠商及機關名單</w:t>
+      </w:r>
+    </w:p>
+    <w:p>
+      <w:pPr>
+        <w:pStyle w:val="a9"/>
+        <w:ind w:left="1225" w:hanging="397"/>
+        <w:jc w:val="both"/>
+      </w:pPr>
+      <w:r>
+        <w:rPr>
+          <w:rFonts w:ascii="新細明體" w:hAnsi="新細明體" w:eastAsia="新細明體"/>
+          <w:b w:val="0"/>
+          <w:sz w:val="24"/>
+        </w:rPr>
+        <w:t>８、近1季未經公開決標案件數比率大於或等於30%以上機關名單</w:t>
       </w:r>
     </w:p>
     <w:p>
@@ -4036,6 +4276,21 @@
           <w:b w:val="0"/>
           <w:sz w:val="24"/>
         </w:rPr>
+        <w:t>（二）與前述警示訊息有關者，招標機關登入政府電子採購網時，系統會跳出「我的最新消息」視窗，其中「政府採購警示訊息」項目會顯示與登入機關有關之警示項目筆數，使用者可點選「前往處理」按鈕，以顯示警示的項目，及取得相關標案資訊。</w:t>
+      </w:r>
+    </w:p>
+    <w:p>
+      <w:pPr>
+        <w:pStyle w:val="a9"/>
+        <w:ind w:left="964" w:hanging="680"/>
+        <w:jc w:val="both"/>
+      </w:pPr>
+      <w:r>
+        <w:rPr>
+          <w:rFonts w:ascii="新細明體" w:hAnsi="新細明體" w:eastAsia="新細明體"/>
+          <w:b w:val="0"/>
+          <w:sz w:val="24"/>
+        </w:rPr>
         <w:t>（三）系統於警示報表產生時，自動以電子郵件通知法務部廉政署、中央採購稽核小組及本會相關業務單位，作為進行抽查與稽核參考。</w:t>
       </w:r>
     </w:p>
@@ -4385,7 +4640,82 @@
           <w:b w:val="0"/>
           <w:sz w:val="24"/>
         </w:rPr>
-        <w:t>主旨：機關辦理未達公告金額之採購，採購公告公開於政府電子採購網但未刊登政府採購公報者，其公告日修正如說明，請查照並轉知所屬機關。說明：一、依據立法院趙正宇委員111年3月17日立法院第10屆第5會期交通委員會第3次全體委員會議口頭質詢事項辦理。二、機關辦理未達公告金額之採購，依政府採購法（下稱採購法）第49條公開取得廠商書面報價或企劃書者，其公告應公開於採購網站，必要時並得刊登採購公報，政府採購公報及公告發行辦法第5條第3款定有明文。另招標期限標準第11條第1項規定：「本標準所定等標期或截止收件期限，其敘明自公告日或邀標日起算者，應將公告或邀標之當日算入。」三、準此，機關辦理未達公告金額之採購，按現行做法，其採購公告如於當日17時30分系統截止時間前傳送至採購網站，依上開規定，同日即予公開並自當日起算等標期。倘機關採購公告於星期五或連續假日前最後上班日17時30分前傳送完成，又未妥予考量例假日、休息日亦計入等標期而適度延長等標期，將壓縮廠商知悉採購資訊及備標時間。四、為保障廠商權益，爰自111年12月26日起，未達公告金額之採購將以機關傳送採購公告於至採購網站之次一上班日為公告日並起算等標期，以利廠商備標。另旨案修正未生效前，請各機關應合理考量前點之情形，合理訂定等標期。</w:t>
+        <w:t>主旨：機關辦理未達公告金額之採購，採購公告公開於政府電子採購網但未刊登政府採購公報者，其公告日修正如說明，請查照並轉知所屬機關。</w:t>
+      </w:r>
+    </w:p>
+    <w:p>
+      <w:pPr>
+        <w:pStyle w:val="a9"/>
+        <w:ind w:left="720" w:hanging="720"/>
+        <w:jc w:val="both"/>
+      </w:pPr>
+      <w:r>
+        <w:rPr>
+          <w:rFonts w:ascii="新細明體" w:hAnsi="新細明體" w:eastAsia="新細明體"/>
+          <w:b w:val="0"/>
+          <w:sz w:val="24"/>
+        </w:rPr>
+        <w:t>說明：</w:t>
+      </w:r>
+    </w:p>
+    <w:p>
+      <w:pPr>
+        <w:pStyle w:val="a9"/>
+        <w:ind w:left="720" w:hanging="480"/>
+        <w:jc w:val="both"/>
+      </w:pPr>
+      <w:r>
+        <w:rPr>
+          <w:rFonts w:ascii="新細明體" w:hAnsi="新細明體" w:eastAsia="新細明體"/>
+          <w:b w:val="0"/>
+          <w:sz w:val="24"/>
+        </w:rPr>
+        <w:t>一、依據立法院趙正宇委員111年3月17日立法院第10屆第5會期交通委員會第3次全體委員會議口頭質詢事項辦理。</w:t>
+      </w:r>
+    </w:p>
+    <w:p>
+      <w:pPr>
+        <w:pStyle w:val="a9"/>
+        <w:ind w:left="720" w:hanging="480"/>
+        <w:jc w:val="both"/>
+      </w:pPr>
+      <w:r>
+        <w:rPr>
+          <w:rFonts w:ascii="新細明體" w:hAnsi="新細明體" w:eastAsia="新細明體"/>
+          <w:b w:val="0"/>
+          <w:sz w:val="24"/>
+        </w:rPr>
+        <w:t>二、機關辦理未達公告金額之採購，依政府採購法（下稱採購法）第49條公開取得廠商書面報價或企劃書者，其公告應公開於採購網站，必要時並得刊登採購公報，政府採購公報及公告發行辦法第5條第3款定有明文。另招標期限標準第11條第1項規定：「本標準所定等標期或截止收件期限，其敘明自公告日或邀標日起算者，應將公告或邀標之當日算入。」</w:t>
+      </w:r>
+    </w:p>
+    <w:p>
+      <w:pPr>
+        <w:pStyle w:val="a9"/>
+        <w:ind w:left="720" w:hanging="480"/>
+        <w:jc w:val="both"/>
+      </w:pPr>
+      <w:r>
+        <w:rPr>
+          <w:rFonts w:ascii="新細明體" w:hAnsi="新細明體" w:eastAsia="新細明體"/>
+          <w:b w:val="0"/>
+          <w:sz w:val="24"/>
+        </w:rPr>
+        <w:t>三、準此，機關辦理未達公告金額之採購，按現行做法，其採購公告如於當日17時30分系統截止時間前傳送至採購網站，依上開規定，同日即予公開並自當日起算等標期。倘機關採購公告於星期五或連續假日前最後上班日17時30分前傳送完成，又未妥予考量例假日、休息日亦計入等標期而適度延長等標期，將壓縮廠商知悉採購資訊及備標時間。</w:t>
+      </w:r>
+    </w:p>
+    <w:p>
+      <w:pPr>
+        <w:pStyle w:val="a9"/>
+        <w:ind w:left="720" w:hanging="480"/>
+        <w:jc w:val="both"/>
+      </w:pPr>
+      <w:r>
+        <w:rPr>
+          <w:rFonts w:ascii="新細明體" w:hAnsi="新細明體" w:eastAsia="新細明體"/>
+          <w:b w:val="0"/>
+          <w:sz w:val="24"/>
+        </w:rPr>
+        <w:t>四、為保障廠商權益，爰自111年12月26日起，未達公告金額之採購將以機關傳送採購公告於至採購網站之次一上班日為公告日並起算等標期，以利廠商備標。另旨案修正未生效前，請各機關應合理考量前點之情形，合理訂定等標期。</w:t>
       </w:r>
     </w:p>
     <w:p/>
@@ -4416,7 +4746,127 @@
           <w:b w:val="0"/>
           <w:sz w:val="24"/>
         </w:rPr>
-        <w:t>主旨：「政府採購法之查核金額、公告金額及中央機關小額採購金額」修正自112年1月1日生效，其修正生效前後法令適用如說明，請查照並轉知所屬。說明：一、本會111年12月23日工程企字第1110100798號令修正公告金額及中央機關小額採購金額，並自中華民國一百十二年一月一日生效（公開於本會網站）。二、基於法規不溯既往原則，111年12月31日以前採購案已刊登招標公告者，採購程序適用修正前之規定。三、旨揭法令修正生效前後，機關於政府採購資訊網站刊登招標公告之注意事項如下：(一)依現行政府採購法相關規定，機關於111年12月29日17時30分以後傳輸招標公告，將於112年1月3日以後刊登，已跨越旨揭法令修正生效日，請各機關預為依修正後採購金額級距妥為檢視招標文件，並為應政府採購資訊網站系統更新，請避免於111年12月29日17時30分以後至24時傳輸採購金額100萬元以上未達150萬元之採購案件資訊。另有預先傳輸採購資訊並訂於112年1月1日後方刊登招標公告者，請併同檢視調整。(二)機關於旨揭法令修正生效前，已刊登招標公告，嗣無法決標，其後續招標於修正生效日後刊登公告，且因旨揭法令修正其採購金額級距有變動者，辦理方式如下：１、機關依原招標方式續行辦理招標者，得沿用原案號辦理，惟請檢視招標文件，就涉及採購金額級距之內容依修正後規定調整後，再行刊登招標公告。２、採購金額級距自「公告金額以上未達查核金額」變更為「未達公告金額且逾公告金額十分之一」，其招標方式改依政府採購法第49條及中央機關未達公告金額採購招標辦法第2條辦理者，機關應修正招標文件，勿沿用原案號辦理公告，至採購金額級距自「未達公告金額且逾公告金額十分之一」變更為「公告金額十分之一以下」，其招標方式改依前開辦法第5條逕洽廠商採購者，機關得免再登招標公告。</w:t>
+        <w:t>主旨：「政府採購法之查核金額、公告金額及中央機關小額採購金額」修正自112年1月1日生效，其修正生效前後法令適用如說明，請查照並轉知所屬。</w:t>
+      </w:r>
+    </w:p>
+    <w:p>
+      <w:pPr>
+        <w:pStyle w:val="a9"/>
+        <w:ind w:left="720" w:hanging="720"/>
+        <w:jc w:val="both"/>
+      </w:pPr>
+      <w:r>
+        <w:rPr>
+          <w:rFonts w:ascii="新細明體" w:hAnsi="新細明體" w:eastAsia="新細明體"/>
+          <w:b w:val="0"/>
+          <w:sz w:val="24"/>
+        </w:rPr>
+        <w:t>說明：</w:t>
+      </w:r>
+    </w:p>
+    <w:p>
+      <w:pPr>
+        <w:pStyle w:val="a9"/>
+        <w:ind w:left="720" w:hanging="480"/>
+        <w:jc w:val="both"/>
+      </w:pPr>
+      <w:r>
+        <w:rPr>
+          <w:rFonts w:ascii="新細明體" w:hAnsi="新細明體" w:eastAsia="新細明體"/>
+          <w:b w:val="0"/>
+          <w:sz w:val="24"/>
+        </w:rPr>
+        <w:t>一、本會111年12月23日工程企字第1110100798號令修正公告金額及中央機關小額採購金額，並自中華民國一百十二年一月一日生效（公開於本會網站）。</w:t>
+      </w:r>
+    </w:p>
+    <w:p>
+      <w:pPr>
+        <w:pStyle w:val="a9"/>
+        <w:ind w:left="720" w:hanging="480"/>
+        <w:jc w:val="both"/>
+      </w:pPr>
+      <w:r>
+        <w:rPr>
+          <w:rFonts w:ascii="新細明體" w:hAnsi="新細明體" w:eastAsia="新細明體"/>
+          <w:b w:val="0"/>
+          <w:sz w:val="24"/>
+        </w:rPr>
+        <w:t>二、基於法規不溯既往原則，111年12月31日以前採購案已刊登招標公告者，採購程序適用修正前之規定。</w:t>
+      </w:r>
+    </w:p>
+    <w:p>
+      <w:pPr>
+        <w:pStyle w:val="a9"/>
+        <w:ind w:left="720" w:hanging="480"/>
+        <w:jc w:val="both"/>
+      </w:pPr>
+      <w:r>
+        <w:rPr>
+          <w:rFonts w:ascii="新細明體" w:hAnsi="新細明體" w:eastAsia="新細明體"/>
+          <w:b w:val="0"/>
+          <w:sz w:val="24"/>
+        </w:rPr>
+        <w:t>三、旨揭法令修正生效前後，機關於政府採購資訊網站刊登招標公告之注意事項如下：</w:t>
+      </w:r>
+    </w:p>
+    <w:p>
+      <w:pPr>
+        <w:pStyle w:val="a9"/>
+        <w:ind w:left="964" w:hanging="680"/>
+        <w:jc w:val="both"/>
+      </w:pPr>
+      <w:r>
+        <w:rPr>
+          <w:rFonts w:ascii="新細明體" w:hAnsi="新細明體" w:eastAsia="新細明體"/>
+          <w:b w:val="0"/>
+          <w:sz w:val="24"/>
+        </w:rPr>
+        <w:t>（一）依現行政府採購法相關規定，機關於111年12月29日17時30分以後傳輸招標公告，將於112年1月3日以後刊登，已跨越旨揭法令修正生效日，請各機關預為依修正後採購金額級距妥為檢視招標文件，並為應政府採購資訊網站系統更新，請避免於111年12月29日17時30分以後至24時傳輸採購金額100萬元以上未達150萬元之採購案件資訊。另有預先傳輸採購資訊並訂於112年1月1日後方刊登招標公告者，請併同檢視調整。</w:t>
+      </w:r>
+    </w:p>
+    <w:p>
+      <w:pPr>
+        <w:pStyle w:val="a9"/>
+        <w:ind w:left="964" w:hanging="680"/>
+        <w:jc w:val="both"/>
+      </w:pPr>
+      <w:r>
+        <w:rPr>
+          <w:rFonts w:ascii="新細明體" w:hAnsi="新細明體" w:eastAsia="新細明體"/>
+          <w:b w:val="0"/>
+          <w:sz w:val="24"/>
+        </w:rPr>
+        <w:t>（二）機關於旨揭法令修正生效前，已刊登招標公告，嗣無法決標，其後續招標於修正生效日後刊登公告，且因旨揭法令修正其採購金額級距有變動者，辦理方式如下：</w:t>
+      </w:r>
+    </w:p>
+    <w:p>
+      <w:pPr>
+        <w:pStyle w:val="a9"/>
+        <w:ind w:left="1225" w:hanging="397"/>
+        <w:jc w:val="both"/>
+      </w:pPr>
+      <w:r>
+        <w:rPr>
+          <w:rFonts w:ascii="新細明體" w:hAnsi="新細明體" w:eastAsia="新細明體"/>
+          <w:b w:val="0"/>
+          <w:sz w:val="24"/>
+        </w:rPr>
+        <w:t>１、機關依原招標方式續行辦理招標者，得沿用原案號辦理，惟請檢視招標文件，就涉及採購金額級距之內容依修正後規定調整後，再行刊登招標公告。</w:t>
+      </w:r>
+    </w:p>
+    <w:p>
+      <w:pPr>
+        <w:pStyle w:val="a9"/>
+        <w:ind w:left="1225" w:hanging="397"/>
+        <w:jc w:val="both"/>
+      </w:pPr>
+      <w:r>
+        <w:rPr>
+          <w:rFonts w:ascii="新細明體" w:hAnsi="新細明體" w:eastAsia="新細明體"/>
+          <w:b w:val="0"/>
+          <w:sz w:val="24"/>
+        </w:rPr>
+        <w:t>２、採購金額級距自「公告金額以上未達查核金額」變更為「未達公告金額且逾公告金額十分之一」，其招標方式改依政府採購法第49條及中央機關未達公告金額採購招標辦法第2條辦理者，機關應修正招標文件，勿沿用原案號辦理公告，至採購金額級距自「未達公告金額且逾公告金額十分之一」變更為「公告金額十分之一以下」，其招標方式改依前開辦法第5條逕洽廠商採購者，機關得免再登招標公告。</w:t>
       </w:r>
     </w:p>
     <w:p/>
@@ -4447,7 +4897,67 @@
           <w:b w:val="0"/>
           <w:sz w:val="24"/>
         </w:rPr>
-        <w:t>主旨：機關依政府採購法第41條第2項辦理變更或補充招標文件，並延長等標期者，其更正招標公告之傳輸作業及公告日之注意事項如說明，請查照並轉知所屬機關。說明：一、依政府採購法第41條第2項規定：「......其涉及變更或補充招標文件內容者，除選擇性招標之規格標與價格標及限制性招標得以書面通知各廠商外，應另行公告，並視需要延長等標期。機關自行變更或補充招標文件內容者，亦同。」按前開規定，機關辦理變更或補充招標文件，涉及影響廠商權益，其變更或補充應公告予外界知悉，始具有效力。二、依政府採購公告及公報發行辦法第21條及本會99年7月6日工程企字第09900270990號函（公開於本會網站），政府電子採購網(下稱採購網)當日刊登之採購公告及公報，係機關於前一上班日17時30分前所傳輸之資料。據此，機關擬於等標期截止當日(下稱截標日)時限前刊登招標文件補充、變更或等標期展延之公告並對外生效者，至遲須於截標日前一上班日17時30分前傳輸其更正公告資訊；倘於截標日始傳輸更正公告，已無法於當日對外公告並生效，且後續更正公告刊登已逾原截標日，將致廠商無法及時得知相關資訊並衍生爭議。三、為避免前述爭議並保障廠商權益，招標機關辦理變更或補充招標文件，並於政府採購公報刊登更正公告者，其更正公告作業至遲應於截標日前一上班日17時30分前完成傳輸作業，俾利更正公告於截標日前公開於採購網，並利廠商知悉。</w:t>
+        <w:t>主旨：機關依政府採購法第41條第2項辦理變更或補充招標文件，並延長等標期者，其更正招標公告之傳輸作業及公告日之注意事項如說明，請查照並轉知所屬機關。</w:t>
+      </w:r>
+    </w:p>
+    <w:p>
+      <w:pPr>
+        <w:pStyle w:val="a9"/>
+        <w:ind w:left="720" w:hanging="720"/>
+        <w:jc w:val="both"/>
+      </w:pPr>
+      <w:r>
+        <w:rPr>
+          <w:rFonts w:ascii="新細明體" w:hAnsi="新細明體" w:eastAsia="新細明體"/>
+          <w:b w:val="0"/>
+          <w:sz w:val="24"/>
+        </w:rPr>
+        <w:t>說明：</w:t>
+      </w:r>
+    </w:p>
+    <w:p>
+      <w:pPr>
+        <w:pStyle w:val="a9"/>
+        <w:ind w:left="720" w:hanging="480"/>
+        <w:jc w:val="both"/>
+      </w:pPr>
+      <w:r>
+        <w:rPr>
+          <w:rFonts w:ascii="新細明體" w:hAnsi="新細明體" w:eastAsia="新細明體"/>
+          <w:b w:val="0"/>
+          <w:sz w:val="24"/>
+        </w:rPr>
+        <w:t>一、依政府採購法第41條第2項規定：「......其涉及變更或補充招標文件內容者，除選擇性招標之規格標與價格標及限制性招標得以書面通知各廠商外，應另行公告，並視需要延長等標期。機關自行變更或補充招標文件內容者，亦同。」按前開規定，機關辦理變更或補充招標文件，涉及影響廠商權益，其變更或補充應公告予外界知悉，始具有效力。</w:t>
+      </w:r>
+    </w:p>
+    <w:p>
+      <w:pPr>
+        <w:pStyle w:val="a9"/>
+        <w:ind w:left="720" w:hanging="480"/>
+        <w:jc w:val="both"/>
+      </w:pPr>
+      <w:r>
+        <w:rPr>
+          <w:rFonts w:ascii="新細明體" w:hAnsi="新細明體" w:eastAsia="新細明體"/>
+          <w:b w:val="0"/>
+          <w:sz w:val="24"/>
+        </w:rPr>
+        <w:t>二、依政府採購公告及公報發行辦法第21條及本會99年7月6日工程企字第09900270990號函（公開於本會網站），政府電子採購網(下稱採購網)當日刊登之採購公告及公報，係機關於前一上班日17時30分前所傳輸之資料。據此，機關擬於等標期截止當日(下稱截標日)時限前刊登招標文件補充、變更或等標期展延之公告並對外生效者，至遲須於截標日前一上班日17時30分前傳輸其更正公告資訊；倘於截標日始傳輸更正公告，已無法於當日對外公告並生效，且後續更正公告刊登已逾原截標日，將致廠商無法及時得知相關資訊並衍生爭議。</w:t>
+      </w:r>
+    </w:p>
+    <w:p>
+      <w:pPr>
+        <w:pStyle w:val="a9"/>
+        <w:ind w:left="720" w:hanging="480"/>
+        <w:jc w:val="both"/>
+      </w:pPr>
+      <w:r>
+        <w:rPr>
+          <w:rFonts w:ascii="新細明體" w:hAnsi="新細明體" w:eastAsia="新細明體"/>
+          <w:b w:val="0"/>
+          <w:sz w:val="24"/>
+        </w:rPr>
+        <w:t>三、為避免前述爭議並保障廠商權益，招標機關辦理變更或補充招標文件，並於政府採購公報刊登更正公告者，其更正公告作業至遲應於截標日前一上班日17時30分前完成傳輸作業，俾利更正公告於截標日前公開於採購網，並利廠商知悉。</w:t>
       </w:r>
     </w:p>
     <w:p/>
@@ -4711,31 +5221,31 @@
     <w:p>
       <w:pPr>
         <w:pStyle w:val="a9"/>
-        <w:ind w:left="1225" w:hanging="397"/>
-        <w:jc w:val="both"/>
-      </w:pPr>
-      <w:r>
-        <w:rPr>
-          <w:rFonts w:ascii="新細明體" w:hAnsi="新細明體" w:eastAsia="新細明體"/>
-          <w:b w:val="0"/>
-          <w:sz w:val="24"/>
-        </w:rPr>
-        <w:t>1.復貴公司八十七年十月十二日金營府字第一Ｏ一二號函。</w:t>
-      </w:r>
-    </w:p>
-    <w:p>
-      <w:pPr>
-        <w:pStyle w:val="a9"/>
-        <w:ind w:left="1225" w:hanging="397"/>
-        <w:jc w:val="both"/>
-      </w:pPr>
-      <w:r>
-        <w:rPr>
-          <w:rFonts w:ascii="新細明體" w:hAnsi="新細明體" w:eastAsia="新細明體"/>
-          <w:b w:val="0"/>
-          <w:sz w:val="24"/>
-        </w:rPr>
-        <w:t>2.查將於明（八十八）年五月二十七日施行之「政府採購法」第三十三條第一項規定：「廠商之投標文件，應以書面密封，於投標截止期限前，以郵遞或專人送達招標機關或其指定之場所。」亦即係由廠商自行選擇遞送方式，機關不予限定。3.目前部分機關之招標文件仍有規定廠商付郵地點之情形，本會配合政府採購法之施行，業於本(八十七)年六月二十四日以工程企字第八七Ｏ七三Ｏ四號函洽各機關採取調適措施。</w:t>
+        <w:ind w:left="720" w:hanging="480"/>
+        <w:jc w:val="both"/>
+      </w:pPr>
+      <w:r>
+        <w:rPr>
+          <w:rFonts w:ascii="新細明體" w:hAnsi="新細明體" w:eastAsia="新細明體"/>
+          <w:b w:val="0"/>
+          <w:sz w:val="24"/>
+        </w:rPr>
+        <w:t>一、復貴公司八十七年十月十二日金營府字第一Ｏ一二號函。</w:t>
+      </w:r>
+    </w:p>
+    <w:p>
+      <w:pPr>
+        <w:pStyle w:val="a9"/>
+        <w:ind w:left="720" w:hanging="480"/>
+        <w:jc w:val="both"/>
+      </w:pPr>
+      <w:r>
+        <w:rPr>
+          <w:rFonts w:ascii="新細明體" w:hAnsi="新細明體" w:eastAsia="新細明體"/>
+          <w:b w:val="0"/>
+          <w:sz w:val="24"/>
+        </w:rPr>
+        <w:t>二、查將於明（八十八）年五月二十七日施行之「政府採購法」第三十三條第一項規定：「廠商之投標文件，應以書面密封，於投標截止期限前，以郵遞或專人送達招標機關或其指定之場所。」亦即係由廠商自行選擇遞送方式，機關不予限定。3.目前部分機關之招標文件仍有規定廠商付郵地點之情形，本會配合政府採購法之施行，業於本(八十七)年六月二十四日以工程企字第八七Ｏ七三Ｏ四號函洽各機關採取調適措施。</w:t>
       </w:r>
     </w:p>
     <w:p/>
@@ -5158,7 +5668,7 @@
           <w:b w:val="0"/>
           <w:sz w:val="24"/>
         </w:rPr>
-        <w:t>備註：1. [附註]公共藝術設置辦法業經行政院文化建設委員會於97年5月19日以文參字第0973113763號令修正發布。其徵選方式、徵選小組之組成、成員名單之公布已有規定，本函內容與該辦法有異者，應依該辦法為準。[附註]公共藝術設置辦法業經行政院文化建設委員會於97年5月19日以文參字第0973113763號令修正發布。其徵選方式、徵選小組之組成、成員名單之公布已有規定，本函內容與該辦法有異者，應依該辦法為準。</w:t>
+        <w:t>備註：1. 公共藝術設置辦法業經行政院文化建設委員會於97年5月19日以文參字第0973113763號令修正發布。其徵選方式、徵選小組之組成、成員名單之公布已有規定，本函內容與該辦法有異者，應依該辦法為準。</w:t>
       </w:r>
     </w:p>
     <w:p>
@@ -5583,7 +6093,7 @@
           <w:b w:val="0"/>
           <w:sz w:val="24"/>
         </w:rPr>
-        <w:t>備註：1. 附註；工程會業於91年11月27日（91）工程企字第09100507960號令增訂政府採購法施行細則第33條第3項規定為：「第一項規定，於採最低標，且招標文件訂明投標廠商得以同一報價載明二以上標的供機關選擇者，不適用之」。</w:t>
+        <w:t>備註：1. 工程會業於91年11月27日（91）工程企字第09100507960號令增訂政府採購法施行細則第33條第3項規定為：「第一項規定，於採最低標，且招標文件訂明投標廠商得以同一報價載明二以上標的供機關選擇者，不適用之」。</w:t>
       </w:r>
     </w:p>
     <w:p/>
@@ -6984,6 +7494,855 @@
     <w:p>
       <w:pPr>
         <w:pStyle w:val="a9"/>
+        <w:ind w:left="720" w:hanging="720"/>
+        <w:jc w:val="both"/>
+      </w:pPr>
+      <w:r>
+        <w:rPr>
+          <w:rFonts w:ascii="新細明體" w:hAnsi="新細明體" w:eastAsia="新細明體"/>
+          <w:b w:val="0"/>
+          <w:sz w:val="24"/>
+        </w:rPr>
+        <w:t>備註：1. 政府採購法部分條文於九十一年二月六日奉總統華總一義字第〇九一〇〇〇二五六一〇號令修正公布，第三十七條規定廠商之財力資格方得以銀行或保險公司之履約及賠償連帶保證責任、連帶保證保險單代之。</w:t>
+      </w:r>
+    </w:p>
+    <w:p/>
+    <w:p>
+      <w:pPr>
+        <w:pStyle w:val="a9"/>
+        <w:ind w:left="720" w:hanging="720"/>
+        <w:jc w:val="both"/>
+      </w:pPr>
+      <w:r>
+        <w:rPr>
+          <w:rFonts w:ascii="微軟正黑體" w:hAnsi="微軟正黑體" w:eastAsia="微軟正黑體"/>
+          <w:b/>
+          <w:sz w:val="24"/>
+        </w:rPr>
+        <w:t>行政院公共工程委員會88年08月06日(88)工程企字第8811494號函</w:t>
+      </w:r>
+    </w:p>
+    <w:p>
+      <w:pPr>
+        <w:pStyle w:val="a9"/>
+        <w:ind w:left="720" w:hanging="720"/>
+        <w:jc w:val="both"/>
+      </w:pPr>
+      <w:r>
+        <w:rPr>
+          <w:rFonts w:ascii="新細明體" w:hAnsi="新細明體" w:eastAsia="新細明體"/>
+          <w:b w:val="0"/>
+          <w:sz w:val="24"/>
+        </w:rPr>
+        <w:t>主旨：機關以限制性招標辦理未達公告金額但逾公告金額十分之一之採購，除符合政府採購法第三十條第一項各款情形得免收押標金、保證金外，不分其屬國內或國外採購，仍應於招標文件中規定廠商須繳納上開押標金、保證金，復請查照。</w:t>
+      </w:r>
+    </w:p>
+    <w:p>
+      <w:pPr>
+        <w:pStyle w:val="a9"/>
+        <w:ind w:left="720" w:hanging="720"/>
+        <w:jc w:val="both"/>
+      </w:pPr>
+      <w:r>
+        <w:rPr>
+          <w:rFonts w:ascii="新細明體" w:hAnsi="新細明體" w:eastAsia="新細明體"/>
+          <w:b w:val="0"/>
+          <w:sz w:val="24"/>
+        </w:rPr>
+        <w:t>說明：</w:t>
+      </w:r>
+    </w:p>
+    <w:p>
+      <w:pPr>
+        <w:pStyle w:val="a9"/>
+        <w:ind w:left="720" w:hanging="480"/>
+        <w:jc w:val="both"/>
+      </w:pPr>
+      <w:r>
+        <w:rPr>
+          <w:rFonts w:ascii="新細明體" w:hAnsi="新細明體" w:eastAsia="新細明體"/>
+          <w:b w:val="0"/>
+          <w:sz w:val="24"/>
+        </w:rPr>
+        <w:t>一、復貴公司八十八年七月二十六日北捷發字第八八二一一三二六〇〇號函。</w:t>
+      </w:r>
+    </w:p>
+    <w:p>
+      <w:pPr>
+        <w:pStyle w:val="a9"/>
+        <w:ind w:left="720" w:hanging="480"/>
+        <w:jc w:val="both"/>
+      </w:pPr>
+      <w:r>
+        <w:rPr>
+          <w:rFonts w:ascii="新細明體" w:hAnsi="新細明體" w:eastAsia="新細明體"/>
+          <w:b w:val="0"/>
+          <w:sz w:val="24"/>
+        </w:rPr>
+        <w:t>二、「押標金保證金暨其他擔保作業辦法」第十五條【履約保證金額度】及第二十五條【保固保證金額度】對上開保證金額度僅有上限之規定，採購機關可視實際需要自行衡酌訂定其額度。另政府採購法（以下簡稱本法）第一百零六條第一項規定，駐國外機構辦理或受託辦理之採購，因應駐在地國情或實地作業限制，且不違背我國締結之條約或協定者，得不適用本法第三十條有關押標金及保證金之規定，但應於招標文件中另定其處理方式。併請參考。</w:t>
+      </w:r>
+    </w:p>
+    <w:p>
+      <w:pPr>
+        <w:pStyle w:val="a9"/>
+        <w:ind w:left="720" w:hanging="720"/>
+        <w:jc w:val="both"/>
+      </w:pPr>
+      <w:r>
+        <w:rPr>
+          <w:rFonts w:ascii="新細明體" w:hAnsi="新細明體" w:eastAsia="新細明體"/>
+          <w:b w:val="0"/>
+          <w:sz w:val="24"/>
+        </w:rPr>
+        <w:t>備註：1. 108年5月22日總統華總一義字第10800049691號令修正公布政府採購法第30條第1項第1款為「勞務採購，以免收押標金、保證金為原則。」</w:t>
+      </w:r>
+    </w:p>
+    <w:p/>
+    <w:p>
+      <w:pPr>
+        <w:pStyle w:val="a9"/>
+        <w:ind w:left="720" w:hanging="720"/>
+        <w:jc w:val="both"/>
+      </w:pPr>
+      <w:r>
+        <w:rPr>
+          <w:rFonts w:ascii="微軟正黑體" w:hAnsi="微軟正黑體" w:eastAsia="微軟正黑體"/>
+          <w:b/>
+          <w:sz w:val="24"/>
+        </w:rPr>
+        <w:t>行政院公共工程委員會88年08月19日(88)工程企字第8812053號函</w:t>
+      </w:r>
+    </w:p>
+    <w:p>
+      <w:pPr>
+        <w:pStyle w:val="a9"/>
+        <w:ind w:left="720" w:hanging="720"/>
+        <w:jc w:val="both"/>
+      </w:pPr>
+      <w:r>
+        <w:rPr>
+          <w:rFonts w:ascii="新細明體" w:hAnsi="新細明體" w:eastAsia="新細明體"/>
+          <w:b w:val="0"/>
+          <w:sz w:val="24"/>
+        </w:rPr>
+        <w:t>主旨：有關押標金、保證金及其他擔保之種類、額度及繳納、退還、終止方式，機關應依政府採購法第三十條及押標金保證金暨其他擔保作業辦法之規定辦理。請查照。</w:t>
+      </w:r>
+    </w:p>
+    <w:p>
+      <w:pPr>
+        <w:pStyle w:val="a9"/>
+        <w:ind w:left="720" w:hanging="720"/>
+        <w:jc w:val="both"/>
+      </w:pPr>
+      <w:r>
+        <w:rPr>
+          <w:rFonts w:ascii="新細明體" w:hAnsi="新細明體" w:eastAsia="新細明體"/>
+          <w:b w:val="0"/>
+          <w:sz w:val="24"/>
+        </w:rPr>
+        <w:t>說明：</w:t>
+      </w:r>
+    </w:p>
+    <w:p>
+      <w:pPr>
+        <w:pStyle w:val="a9"/>
+        <w:ind w:left="720" w:hanging="480"/>
+        <w:jc w:val="both"/>
+      </w:pPr>
+      <w:r>
+        <w:rPr>
+          <w:rFonts w:ascii="新細明體" w:hAnsi="新細明體" w:eastAsia="新細明體"/>
+          <w:b w:val="0"/>
+          <w:sz w:val="24"/>
+        </w:rPr>
+        <w:t>一、復貴公司八十八年八月九日申請書。</w:t>
+      </w:r>
+    </w:p>
+    <w:p>
+      <w:pPr>
+        <w:pStyle w:val="a9"/>
+        <w:ind w:left="720" w:hanging="480"/>
+        <w:jc w:val="both"/>
+      </w:pPr>
+      <w:r>
+        <w:rPr>
+          <w:rFonts w:ascii="新細明體" w:hAnsi="新細明體" w:eastAsia="新細明體"/>
+          <w:b w:val="0"/>
+          <w:sz w:val="24"/>
+        </w:rPr>
+        <w:t>二、貴公司如發現機關辦理採購違反前揭規定之情者，請依政府採購法第六章規定提出異議、申訴。</w:t>
+      </w:r>
+    </w:p>
+    <w:p/>
+    <w:p>
+      <w:pPr>
+        <w:pStyle w:val="a9"/>
+        <w:ind w:left="720" w:hanging="720"/>
+        <w:jc w:val="both"/>
+      </w:pPr>
+      <w:r>
+        <w:rPr>
+          <w:rFonts w:ascii="微軟正黑體" w:hAnsi="微軟正黑體" w:eastAsia="微軟正黑體"/>
+          <w:b/>
+          <w:sz w:val="24"/>
+        </w:rPr>
+        <w:t>行政院公共工程委員會88年09月01日(88)工程企字第8812908號函</w:t>
+      </w:r>
+    </w:p>
+    <w:p>
+      <w:pPr>
+        <w:pStyle w:val="a9"/>
+        <w:ind w:left="720" w:hanging="720"/>
+        <w:jc w:val="both"/>
+      </w:pPr>
+      <w:r>
+        <w:rPr>
+          <w:rFonts w:ascii="新細明體" w:hAnsi="新細明體" w:eastAsia="新細明體"/>
+          <w:b w:val="0"/>
+          <w:sz w:val="24"/>
+        </w:rPr>
+        <w:t>主旨：本會依「押標金保證金暨其他擔保作業辦法」第三十四條之規定所訂各式押標金及保證金格式，屬參考性質，復請查照。</w:t>
+      </w:r>
+    </w:p>
+    <w:p>
+      <w:pPr>
+        <w:pStyle w:val="a9"/>
+        <w:ind w:left="720" w:hanging="720"/>
+        <w:jc w:val="both"/>
+      </w:pPr>
+      <w:r>
+        <w:rPr>
+          <w:rFonts w:ascii="新細明體" w:hAnsi="新細明體" w:eastAsia="新細明體"/>
+          <w:b w:val="0"/>
+          <w:sz w:val="24"/>
+        </w:rPr>
+        <w:t>說明：</w:t>
+      </w:r>
+    </w:p>
+    <w:p>
+      <w:pPr>
+        <w:pStyle w:val="a9"/>
+        <w:ind w:left="720" w:hanging="480"/>
+        <w:jc w:val="both"/>
+      </w:pPr>
+      <w:r>
+        <w:rPr>
+          <w:rFonts w:ascii="新細明體" w:hAnsi="新細明體" w:eastAsia="新細明體"/>
+          <w:b w:val="0"/>
+          <w:sz w:val="24"/>
+        </w:rPr>
+        <w:t>一、復貴府八十八年八月二十三日八八北府工公字第三二Ｏ五五九號函。</w:t>
+      </w:r>
+    </w:p>
+    <w:p>
+      <w:pPr>
+        <w:pStyle w:val="a9"/>
+        <w:ind w:left="720" w:hanging="480"/>
+        <w:jc w:val="both"/>
+      </w:pPr>
+      <w:r>
+        <w:rPr>
+          <w:rFonts w:ascii="新細明體" w:hAnsi="新細明體" w:eastAsia="新細明體"/>
+          <w:b w:val="0"/>
+          <w:sz w:val="24"/>
+        </w:rPr>
+        <w:t>二、由於本會提供之各式押標金及保證金格式係屬參考性質，如貴府同意銀行以其自訂格式辦理質權設定、保證等，本會無意見；如貴府不同意銀行之自訂格式，建請洽廠商改採用政府採購法第三十條第二項規定之其他方式繳納。</w:t>
+      </w:r>
+    </w:p>
+    <w:p>
+      <w:pPr>
+        <w:pStyle w:val="a9"/>
+        <w:ind w:left="720" w:hanging="480"/>
+        <w:jc w:val="both"/>
+      </w:pPr>
+      <w:r>
+        <w:rPr>
+          <w:rFonts w:ascii="新細明體" w:hAnsi="新細明體" w:eastAsia="新細明體"/>
+          <w:b w:val="0"/>
+          <w:sz w:val="24"/>
+        </w:rPr>
+        <w:t>三、來函建議本會通函各銀行修改其內部有關格式乙節，轉請中華民國銀行商業同業公會全國聯合會參考。</w:t>
+      </w:r>
+    </w:p>
+    <w:p/>
+    <w:p>
+      <w:pPr>
+        <w:pStyle w:val="a9"/>
+        <w:ind w:left="720" w:hanging="720"/>
+        <w:jc w:val="both"/>
+      </w:pPr>
+      <w:r>
+        <w:rPr>
+          <w:rFonts w:ascii="微軟正黑體" w:hAnsi="微軟正黑體" w:eastAsia="微軟正黑體"/>
+          <w:b/>
+          <w:sz w:val="24"/>
+        </w:rPr>
+        <w:t>行政院公共工程委員會88年09月30日(88)工程企字第8814664號函</w:t>
+      </w:r>
+    </w:p>
+    <w:p>
+      <w:pPr>
+        <w:pStyle w:val="a9"/>
+        <w:ind w:left="720" w:hanging="720"/>
+        <w:jc w:val="both"/>
+      </w:pPr>
+      <w:r>
+        <w:rPr>
+          <w:rFonts w:ascii="新細明體" w:hAnsi="新細明體" w:eastAsia="新細明體"/>
+          <w:b w:val="0"/>
+          <w:sz w:val="24"/>
+        </w:rPr>
+        <w:t>主旨：關於廠商未依「押標金保證金暨其他擔保作業辦法」第七條第一項規定於銀行支票上填寫受款人乙節，依票據法第一百二十五條第二項規定，以執票人為受款人，貴所不得據以不決標予該廠商。復請查照。</w:t>
+      </w:r>
+    </w:p>
+    <w:p>
+      <w:pPr>
+        <w:pStyle w:val="a9"/>
+        <w:ind w:left="720" w:hanging="720"/>
+        <w:jc w:val="both"/>
+      </w:pPr>
+      <w:r>
+        <w:rPr>
+          <w:rFonts w:ascii="新細明體" w:hAnsi="新細明體" w:eastAsia="新細明體"/>
+          <w:b w:val="0"/>
+          <w:sz w:val="24"/>
+        </w:rPr>
+        <w:t>說明：復貴所八十八年九月十八日觀技北八十八字第Ｏ二五二號書函。</w:t>
+      </w:r>
+    </w:p>
+    <w:p>
+      <w:pPr>
+        <w:pStyle w:val="a9"/>
+        <w:ind w:left="720" w:hanging="720"/>
+        <w:jc w:val="both"/>
+      </w:pPr>
+      <w:r>
+        <w:rPr>
+          <w:rFonts w:ascii="新細明體" w:hAnsi="新細明體" w:eastAsia="新細明體"/>
+          <w:b w:val="0"/>
+          <w:sz w:val="24"/>
+        </w:rPr>
+        <w:t>備註：1. 本會90年8月24日(90)工程企字第90032047號令修正發布旨揭辦法第7條第1項規定，增訂「未填寫受款人者，以執票之機關為受款人」。</w:t>
+      </w:r>
+    </w:p>
+    <w:p/>
+    <w:p>
+      <w:pPr>
+        <w:pStyle w:val="a9"/>
+        <w:ind w:left="720" w:hanging="720"/>
+        <w:jc w:val="both"/>
+      </w:pPr>
+      <w:r>
+        <w:rPr>
+          <w:rFonts w:ascii="微軟正黑體" w:hAnsi="微軟正黑體" w:eastAsia="微軟正黑體"/>
+          <w:b/>
+          <w:sz w:val="24"/>
+        </w:rPr>
+        <w:t>行政院公共工程委員會88年10月12日(88)工程企字第8814887號函</w:t>
+      </w:r>
+    </w:p>
+    <w:p>
+      <w:pPr>
+        <w:pStyle w:val="a9"/>
+        <w:ind w:left="720" w:hanging="720"/>
+        <w:jc w:val="both"/>
+      </w:pPr>
+      <w:r>
+        <w:rPr>
+          <w:rFonts w:ascii="新細明體" w:hAnsi="新細明體" w:eastAsia="新細明體"/>
+          <w:b w:val="0"/>
+          <w:sz w:val="24"/>
+        </w:rPr>
+        <w:t>主旨：貴處函詢有關政府採購法執行疑義，復如說明，請查照。</w:t>
+      </w:r>
+    </w:p>
+    <w:p>
+      <w:pPr>
+        <w:pStyle w:val="a9"/>
+        <w:ind w:left="720" w:hanging="720"/>
+        <w:jc w:val="both"/>
+      </w:pPr>
+      <w:r>
+        <w:rPr>
+          <w:rFonts w:ascii="新細明體" w:hAnsi="新細明體" w:eastAsia="新細明體"/>
+          <w:b w:val="0"/>
+          <w:sz w:val="24"/>
+        </w:rPr>
+        <w:t>說明：</w:t>
+      </w:r>
+    </w:p>
+    <w:p>
+      <w:pPr>
+        <w:pStyle w:val="a9"/>
+        <w:ind w:left="720" w:hanging="480"/>
+        <w:jc w:val="both"/>
+      </w:pPr>
+      <w:r>
+        <w:rPr>
+          <w:rFonts w:ascii="新細明體" w:hAnsi="新細明體" w:eastAsia="新細明體"/>
+          <w:b w:val="0"/>
+          <w:sz w:val="24"/>
+        </w:rPr>
+        <w:t>一、復貴處八十八年九月二十三日（八八）處秘四字第二四八九六號函。</w:t>
+      </w:r>
+    </w:p>
+    <w:p>
+      <w:pPr>
+        <w:pStyle w:val="a9"/>
+        <w:ind w:left="720" w:hanging="480"/>
+        <w:jc w:val="both"/>
+      </w:pPr>
+      <w:r>
+        <w:rPr>
+          <w:rFonts w:ascii="新細明體" w:hAnsi="新細明體" w:eastAsia="新細明體"/>
+          <w:b w:val="0"/>
+          <w:sz w:val="24"/>
+        </w:rPr>
+        <w:t>二、關於「押標金保證金暨其他擔保作業辦法」第十四條第一項規定，得標廠商押標金金額超出招標文件規定之履約保證金金額，如廠商自願或堅持不必退還該超出之部分，可併轉為履約保證金。</w:t>
+      </w:r>
+    </w:p>
+    <w:p>
+      <w:pPr>
+        <w:pStyle w:val="a9"/>
+        <w:ind w:left="720" w:hanging="480"/>
+        <w:jc w:val="both"/>
+      </w:pPr>
+      <w:r>
+        <w:rPr>
+          <w:rFonts w:ascii="新細明體" w:hAnsi="新細明體" w:eastAsia="新細明體"/>
+          <w:b w:val="0"/>
+          <w:sz w:val="24"/>
+        </w:rPr>
+        <w:t>三、機關對於得標廠商繳納代金情形之管制，請參考工程、財物或勞務採購契約範本有關「契約價金之給付條件」中之規定：「廠商於國內員工總人數逾一百人，履約期間僱用殘障人士及原住民人數低於總人數百分之二者，應繳納代金。繳納代金之證明文件，應（每月／每二個月／每三個月／每四個月／每半年／於驗收付款前；由機關於招標時載明）送機關查核，以憑付款。」辦理。</w:t>
+      </w:r>
+    </w:p>
+    <w:p>
+      <w:pPr>
+        <w:pStyle w:val="a9"/>
+        <w:ind w:left="720" w:hanging="480"/>
+        <w:jc w:val="both"/>
+      </w:pPr>
+      <w:r>
+        <w:rPr>
+          <w:rFonts w:ascii="新細明體" w:hAnsi="新細明體" w:eastAsia="新細明體"/>
+          <w:b w:val="0"/>
+          <w:sz w:val="24"/>
+        </w:rPr>
+        <w:t>四、關於議價決標之案件，如屬公告金額以上之採購，仍適用政府採購法（以下簡稱本法）第六十一條書面通知廠商之規定。</w:t>
+      </w:r>
+    </w:p>
+    <w:p>
+      <w:pPr>
+        <w:pStyle w:val="a9"/>
+        <w:ind w:left="720" w:hanging="480"/>
+        <w:jc w:val="both"/>
+      </w:pPr>
+      <w:r>
+        <w:rPr>
+          <w:rFonts w:ascii="新細明體" w:hAnsi="新細明體" w:eastAsia="新細明體"/>
+          <w:b w:val="0"/>
+          <w:sz w:val="24"/>
+        </w:rPr>
+        <w:t>五、機關依本法第五十八條之規定，限期請廠商提出說明或擔保，廠商未提出前不得先行辦理決標，各合格廠商之標及押標金，機關得斟酌決定全部或部分保留，並依押標金保證金暨其他擔保作業辦法第十二條之規定發還押標金。</w:t>
+      </w:r>
+    </w:p>
+    <w:p>
+      <w:pPr>
+        <w:pStyle w:val="a9"/>
+        <w:ind w:left="720" w:hanging="480"/>
+        <w:jc w:val="both"/>
+      </w:pPr>
+      <w:r>
+        <w:rPr>
+          <w:rFonts w:ascii="新細明體" w:hAnsi="新細明體" w:eastAsia="新細明體"/>
+          <w:b w:val="0"/>
+          <w:sz w:val="24"/>
+        </w:rPr>
+        <w:t>六、本法施行細則第七十二條及第七十三條所稱「合於招標文件規定之投標廠商僅有一家」，係指開標後審查結果，符合招標文件規定之投標廠商僅有一家之情形。如機關辦理比減價格一次或二次後，僅餘一家廠商繼續減價時，仍為本法第五十三條第一項及第五十四條之比減程序，適用本法施行細則第七十二條第一項規定，不適用同條第二項規定。（本項說明更正如後函）</w:t>
+      </w:r>
+    </w:p>
+    <w:p/>
+    <w:p>
+      <w:pPr>
+        <w:pStyle w:val="a9"/>
+        <w:ind w:left="720" w:hanging="720"/>
+        <w:jc w:val="both"/>
+      </w:pPr>
+      <w:r>
+        <w:rPr>
+          <w:rFonts w:ascii="微軟正黑體" w:hAnsi="微軟正黑體" w:eastAsia="微軟正黑體"/>
+          <w:b/>
+          <w:sz w:val="24"/>
+        </w:rPr>
+        <w:t>行政院公共工程委員會88年10月25日(88)工程企字第8817555號函</w:t>
+      </w:r>
+    </w:p>
+    <w:p>
+      <w:pPr>
+        <w:pStyle w:val="a9"/>
+        <w:ind w:left="720" w:hanging="720"/>
+        <w:jc w:val="both"/>
+      </w:pPr>
+      <w:r>
+        <w:rPr>
+          <w:rFonts w:ascii="新細明體" w:hAnsi="新細明體" w:eastAsia="新細明體"/>
+          <w:b w:val="0"/>
+          <w:sz w:val="24"/>
+        </w:rPr>
+        <w:t>主旨：關於貴中心函詢外國銀行得否為「押標金保證金暨其他擔保作業辦法」第七條規定銀行之各項擔保乙節，復如說明，請查照。</w:t>
+      </w:r>
+    </w:p>
+    <w:p>
+      <w:pPr>
+        <w:pStyle w:val="a9"/>
+        <w:ind w:left="720" w:hanging="720"/>
+        <w:jc w:val="both"/>
+      </w:pPr>
+      <w:r>
+        <w:rPr>
+          <w:rFonts w:ascii="新細明體" w:hAnsi="新細明體" w:eastAsia="新細明體"/>
+          <w:b w:val="0"/>
+          <w:sz w:val="24"/>
+        </w:rPr>
+        <w:t>說明：</w:t>
+      </w:r>
+    </w:p>
+    <w:p>
+      <w:pPr>
+        <w:pStyle w:val="a9"/>
+        <w:ind w:left="720" w:hanging="480"/>
+        <w:jc w:val="both"/>
+      </w:pPr>
+      <w:r>
+        <w:rPr>
+          <w:rFonts w:ascii="新細明體" w:hAnsi="新細明體" w:eastAsia="新細明體"/>
+          <w:b w:val="0"/>
+          <w:sz w:val="24"/>
+        </w:rPr>
+        <w:t>一、復貴中心八十八年八月二十四日八十八人發秘字第Ｏ二二Ｏ六號函。</w:t>
+      </w:r>
+    </w:p>
+    <w:p>
+      <w:pPr>
+        <w:pStyle w:val="a9"/>
+        <w:ind w:left="720" w:hanging="480"/>
+        <w:jc w:val="both"/>
+      </w:pPr>
+      <w:r>
+        <w:rPr>
+          <w:rFonts w:ascii="新細明體" w:hAnsi="新細明體" w:eastAsia="新細明體"/>
+          <w:b w:val="0"/>
+          <w:sz w:val="24"/>
+        </w:rPr>
+        <w:t>二、依政府採購法第三十條及「押標金保證金暨其他擔保作業辦法」（以下簡稱本辦法）第二條所定「銀行」之意旨，外國銀行如符合銀行法第一百十六條「依照外國法律組織登記之銀行，經中華民國政府認許，在中華民國境內依公司法及本法登記營業之分行」之規定，且依同法第一百二十一條規定，於經中央銀行許可經營業務之範圍內，得為本辦法第七條規定銀行之各項擔保。</w:t>
+      </w:r>
+    </w:p>
+    <w:p>
+      <w:pPr>
+        <w:pStyle w:val="a9"/>
+        <w:ind w:left="720" w:hanging="720"/>
+        <w:jc w:val="both"/>
+      </w:pPr>
+      <w:r>
+        <w:rPr>
+          <w:rFonts w:ascii="新細明體" w:hAnsi="新細明體" w:eastAsia="新細明體"/>
+          <w:b w:val="0"/>
+          <w:sz w:val="24"/>
+        </w:rPr>
+        <w:t>備註：1. 108年4月17日總統修正公布之「銀行法」第116條規定：「本法稱外國銀行，謂依照外國法律組織登記之銀行，在中華民國境內依公司法及本法登記營業之分行。」</w:t>
+      </w:r>
+    </w:p>
+    <w:p/>
+    <w:p>
+      <w:pPr>
+        <w:pStyle w:val="a9"/>
+        <w:ind w:left="720" w:hanging="720"/>
+        <w:jc w:val="both"/>
+      </w:pPr>
+      <w:r>
+        <w:rPr>
+          <w:rFonts w:ascii="微軟正黑體" w:hAnsi="微軟正黑體" w:eastAsia="微軟正黑體"/>
+          <w:b/>
+          <w:sz w:val="24"/>
+        </w:rPr>
+        <w:t>行政院公共工程委員會88年10月25日(88)工程企字第8817556號函</w:t>
+      </w:r>
+    </w:p>
+    <w:p>
+      <w:pPr>
+        <w:pStyle w:val="a9"/>
+        <w:ind w:left="720" w:hanging="720"/>
+        <w:jc w:val="both"/>
+      </w:pPr>
+      <w:r>
+        <w:rPr>
+          <w:rFonts w:ascii="新細明體" w:hAnsi="新細明體" w:eastAsia="新細明體"/>
+          <w:b w:val="0"/>
+          <w:sz w:val="24"/>
+        </w:rPr>
+        <w:t>主旨：關於貴府函詢外國銀行開立之本行本票、支票、設定質權之定期存單、開發或保兌之不可撤銷擔保信用狀或其書面保證，是否符合政府採購法第三十條規定之執行疑義，復如說明，請查照。</w:t>
+      </w:r>
+    </w:p>
+    <w:p>
+      <w:pPr>
+        <w:pStyle w:val="a9"/>
+        <w:ind w:left="720" w:hanging="720"/>
+        <w:jc w:val="both"/>
+      </w:pPr>
+      <w:r>
+        <w:rPr>
+          <w:rFonts w:ascii="新細明體" w:hAnsi="新細明體" w:eastAsia="新細明體"/>
+          <w:b w:val="0"/>
+          <w:sz w:val="24"/>
+        </w:rPr>
+        <w:t>說明：</w:t>
+      </w:r>
+    </w:p>
+    <w:p>
+      <w:pPr>
+        <w:pStyle w:val="a9"/>
+        <w:ind w:left="720" w:hanging="480"/>
+        <w:jc w:val="both"/>
+      </w:pPr>
+      <w:r>
+        <w:rPr>
+          <w:rFonts w:ascii="新細明體" w:hAnsi="新細明體" w:eastAsia="新細明體"/>
+          <w:b w:val="0"/>
+          <w:sz w:val="24"/>
+        </w:rPr>
+        <w:t>一、復貴府八十八年九月二十三日八八北府工公字第三六一七六六號函。</w:t>
+      </w:r>
+    </w:p>
+    <w:p>
+      <w:pPr>
+        <w:pStyle w:val="a9"/>
+        <w:ind w:left="720" w:hanging="480"/>
+        <w:jc w:val="both"/>
+      </w:pPr>
+      <w:r>
+        <w:rPr>
+          <w:rFonts w:ascii="新細明體" w:hAnsi="新細明體" w:eastAsia="新細明體"/>
+          <w:b w:val="0"/>
+          <w:sz w:val="24"/>
+        </w:rPr>
+        <w:t>二、依政府採購法第三十條及「押標金保證金暨其他擔保作業辦法」第二條所定「銀行」之意旨，外國銀行如符合銀行法第一百十六條「依照外國法律組織登記之銀行，經中華民國政府認許，在中華民國境內依公司法及本法登記營業之分行」之規定，且依同法第一百二十一條規定，於經中央銀行許可經營業務之範圍內，得依規定開立本行本票、支票、設定質權之定期存款單、開發或保兌之不可撤銷擔保信用狀或書面連帶保證，供廠商作為押標金、保證金之用。</w:t>
+      </w:r>
+    </w:p>
+    <w:p>
+      <w:pPr>
+        <w:pStyle w:val="a9"/>
+        <w:ind w:left="720" w:hanging="720"/>
+        <w:jc w:val="both"/>
+      </w:pPr>
+      <w:r>
+        <w:rPr>
+          <w:rFonts w:ascii="新細明體" w:hAnsi="新細明體" w:eastAsia="新細明體"/>
+          <w:b w:val="0"/>
+          <w:sz w:val="24"/>
+        </w:rPr>
+        <w:t>備註：1. 108年4月17日總統修正公布之「銀行法」第116條規定：「本法稱外國銀行，謂依照外國法律組織登記之銀行，在中華民國境內依公司法及本法登記營業之分行。」</w:t>
+      </w:r>
+    </w:p>
+    <w:p/>
+    <w:p>
+      <w:pPr>
+        <w:pStyle w:val="a9"/>
+        <w:ind w:left="720" w:hanging="720"/>
+        <w:jc w:val="both"/>
+      </w:pPr>
+      <w:r>
+        <w:rPr>
+          <w:rFonts w:ascii="微軟正黑體" w:hAnsi="微軟正黑體" w:eastAsia="微軟正黑體"/>
+          <w:b/>
+          <w:sz w:val="24"/>
+        </w:rPr>
+        <w:t>行政院公共工程委員會89年01月05日(89)工程企字第88022788號函</w:t>
+      </w:r>
+    </w:p>
+    <w:p>
+      <w:pPr>
+        <w:pStyle w:val="a9"/>
+        <w:ind w:left="720" w:hanging="720"/>
+        <w:jc w:val="both"/>
+      </w:pPr>
+      <w:r>
+        <w:rPr>
+          <w:rFonts w:ascii="新細明體" w:hAnsi="新細明體" w:eastAsia="新細明體"/>
+          <w:b w:val="0"/>
+          <w:sz w:val="24"/>
+        </w:rPr>
+        <w:t>主旨：貴處函詢政府採購法(以下簡稱本法)適用疑義，復如說明，請查照。</w:t>
+      </w:r>
+    </w:p>
+    <w:p>
+      <w:pPr>
+        <w:pStyle w:val="a9"/>
+        <w:ind w:left="720" w:hanging="720"/>
+        <w:jc w:val="both"/>
+      </w:pPr>
+      <w:r>
+        <w:rPr>
+          <w:rFonts w:ascii="新細明體" w:hAnsi="新細明體" w:eastAsia="新細明體"/>
+          <w:b w:val="0"/>
+          <w:sz w:val="24"/>
+        </w:rPr>
+        <w:t>說明：</w:t>
+      </w:r>
+    </w:p>
+    <w:p>
+      <w:pPr>
+        <w:pStyle w:val="a9"/>
+        <w:ind w:left="720" w:hanging="480"/>
+        <w:jc w:val="both"/>
+      </w:pPr>
+      <w:r>
+        <w:rPr>
+          <w:rFonts w:ascii="新細明體" w:hAnsi="新細明體" w:eastAsia="新細明體"/>
+          <w:b w:val="0"/>
+          <w:sz w:val="24"/>
+        </w:rPr>
+        <w:t>一、復貴處八十八年十二月二十七日(八八)處秘四字第三三四一七號函。</w:t>
+      </w:r>
+    </w:p>
+    <w:p>
+      <w:pPr>
+        <w:pStyle w:val="a9"/>
+        <w:ind w:left="720" w:hanging="480"/>
+        <w:jc w:val="both"/>
+      </w:pPr>
+      <w:r>
+        <w:rPr>
+          <w:rFonts w:ascii="新細明體" w:hAnsi="新細明體" w:eastAsia="新細明體"/>
+          <w:b w:val="0"/>
+          <w:sz w:val="24"/>
+        </w:rPr>
+        <w:t>二、關於來函說明一，機關於宣布保留決標時，仍應製作紀錄。其後於作成決標或廢標之決定時，得免另訂時間及地點公開為之。另依本法第五十二條第三項規定，決標時得不通知投標廠商到場，其結果應通知各投標廠商。</w:t>
+      </w:r>
+    </w:p>
+    <w:p>
+      <w:pPr>
+        <w:pStyle w:val="a9"/>
+        <w:ind w:left="720" w:hanging="480"/>
+        <w:jc w:val="both"/>
+      </w:pPr>
+      <w:r>
+        <w:rPr>
+          <w:rFonts w:ascii="新細明體" w:hAnsi="新細明體" w:eastAsia="新細明體"/>
+          <w:b w:val="0"/>
+          <w:sz w:val="24"/>
+        </w:rPr>
+        <w:t>三、關於來函說明二，廠商依本法第三十條及「押標金保證金暨其他擔保作業辦法」規定繳納押標金，機關是否辦理對保、對保之時機及辦理人員，由機關本於權責自行決定。至於廠商以銀行之書面連帶保證繳納押標金或履約保證金，其所使用之格式內容如有擅自增刪，是否影響保證書效力，宜視招標文件之規定及增刪內容而定。</w:t>
+      </w:r>
+    </w:p>
+    <w:p/>
+    <w:p>
+      <w:pPr>
+        <w:pStyle w:val="a9"/>
+        <w:ind w:left="720" w:hanging="720"/>
+        <w:jc w:val="both"/>
+      </w:pPr>
+      <w:r>
+        <w:rPr>
+          <w:rFonts w:ascii="微軟正黑體" w:hAnsi="微軟正黑體" w:eastAsia="微軟正黑體"/>
+          <w:b/>
+          <w:sz w:val="24"/>
+        </w:rPr>
+        <w:t>行政院公共工程委員會89年01月19日(89)工程企字第89000318號函</w:t>
+      </w:r>
+    </w:p>
+    <w:p>
+      <w:pPr>
+        <w:pStyle w:val="a9"/>
+        <w:ind w:left="720" w:hanging="720"/>
+        <w:jc w:val="both"/>
+      </w:pPr>
+      <w:r>
+        <w:rPr>
+          <w:rFonts w:ascii="新細明體" w:hAnsi="新細明體" w:eastAsia="新細明體"/>
+          <w:b w:val="0"/>
+          <w:sz w:val="24"/>
+        </w:rPr>
+        <w:t>主旨：關於貴會辦理「中醫藥典籍電子資料庫計畫」招標，發現三家投標廠商之押標金本票連號乙案，其處理方式復如說明，請查照。</w:t>
+      </w:r>
+    </w:p>
+    <w:p>
+      <w:pPr>
+        <w:pStyle w:val="a9"/>
+        <w:ind w:left="720" w:hanging="720"/>
+        <w:jc w:val="both"/>
+      </w:pPr>
+      <w:r>
+        <w:rPr>
+          <w:rFonts w:ascii="新細明體" w:hAnsi="新細明體" w:eastAsia="新細明體"/>
+          <w:b w:val="0"/>
+          <w:sz w:val="24"/>
+        </w:rPr>
+        <w:t>說明：</w:t>
+      </w:r>
+    </w:p>
+    <w:p>
+      <w:pPr>
+        <w:pStyle w:val="a9"/>
+        <w:ind w:left="720" w:hanging="480"/>
+        <w:jc w:val="both"/>
+      </w:pPr>
+      <w:r>
+        <w:rPr>
+          <w:rFonts w:ascii="新細明體" w:hAnsi="新細明體" w:eastAsia="新細明體"/>
+          <w:b w:val="0"/>
+          <w:sz w:val="24"/>
+        </w:rPr>
+        <w:t>一、復貴會八十九年一月四日衛中會秘字第八〇八一三五三六號函。</w:t>
+      </w:r>
+    </w:p>
+    <w:p>
+      <w:pPr>
+        <w:pStyle w:val="a9"/>
+        <w:ind w:left="720" w:hanging="480"/>
+        <w:jc w:val="both"/>
+      </w:pPr>
+      <w:r>
+        <w:rPr>
+          <w:rFonts w:ascii="新細明體" w:hAnsi="新細明體" w:eastAsia="新細明體"/>
+          <w:b w:val="0"/>
+          <w:sz w:val="24"/>
+        </w:rPr>
+        <w:t>二、依來函說明一，三家投標廠商(龍捲風電腦公司、毅欣資訊有限公司、大人物管理顧問有限公司)之押標金為台灣銀行連號本票，且皆為大人物管理顧問有限公司於八十八年十二月九日向台灣銀行公館分行申請，如大人物管理顧問有限公司有政府採購法(以下簡稱本法)第三十一條第二項第二款之情形，應依招標文件規定不發還該三家廠商之押標金，其已發還者，並予追繳。如貴會發現該三家廠商有本法第四十八條第一項第二款或第五十條第一項第三款至五款情形之一，或其人員涉有犯本法第八十七條之罪者，茲依本法第三十一條第二項第八款規定，認定該等廠商有影響採購公正之違反法令行為，其押標金亦應不發還或追繳。</w:t>
+      </w:r>
+    </w:p>
+    <w:p>
+      <w:pPr>
+        <w:pStyle w:val="a9"/>
+        <w:ind w:left="720" w:hanging="480"/>
+        <w:jc w:val="both"/>
+      </w:pPr>
+      <w:r>
+        <w:rPr>
+          <w:rFonts w:ascii="新細明體" w:hAnsi="新細明體" w:eastAsia="新細明體"/>
+          <w:b w:val="0"/>
+          <w:sz w:val="24"/>
+        </w:rPr>
+        <w:t>三、來函說明二，貴會限制該三家廠商一年不得參與貴會任何採購招標案乙節，與本法第一百零一條至第一百零三條之規定不符，應改依第一百零一條規定，就所發現之情形，將其事實及理由通知廠商，並附記如未提出異議者，將刊登政府採購公報。</w:t>
+      </w:r>
+    </w:p>
+    <w:p>
+      <w:pPr>
+        <w:pStyle w:val="a9"/>
+        <w:ind w:left="720" w:hanging="480"/>
+        <w:jc w:val="both"/>
+      </w:pPr>
+      <w:r>
+        <w:rPr>
+          <w:rFonts w:ascii="新細明體" w:hAnsi="新細明體" w:eastAsia="新細明體"/>
+          <w:b w:val="0"/>
+          <w:sz w:val="24"/>
+        </w:rPr>
+        <w:t>四、至於是否依本法第八十七條規定處置，建請將相關事證移送檢調單位處理。</w:t>
+      </w:r>
+    </w:p>
+    <w:p>
+      <w:pPr>
+        <w:pStyle w:val="a9"/>
         <w:ind w:left="960" w:hanging="960"/>
         <w:jc w:val="both"/>
       </w:pPr>
@@ -6993,7 +8352,7 @@
           <w:b w:val="0"/>
           <w:sz w:val="24"/>
         </w:rPr>
-        <w:t>備註：1. 政府採購法部分條文於九十一年二月六日奉總統華總一義字第〇九一〇〇〇二五六一〇號令修正公布，第三十七條規定廠商之財力資格方得以銀行或保險公司之履約及賠償連帶保證責任、連帶保證保險單代之。</w:t>
+        <w:t>備註：1. 說明二所述政府採購法第五十條第一項第五款規定「影響採購公正之違反法令行為」，經九十一年二月六日總統華總一義字第〇九一〇〇〇二五六一〇號令修正公布之條文，業移列為第五十條第一項第七款，並增列「其他」二字為「其他影響採購公正之違反法令行為」。政府採購法第31條第2項第8款「其他經主管機關認定有影響採購公正之違反法令行為」，本會另於104年7月17日以工程企字第10400225210號令發布。</w:t>
       </w:r>
     </w:p>
     <w:p>
@@ -7008,7 +8367,22 @@
           <w:b w:val="0"/>
           <w:sz w:val="24"/>
         </w:rPr>
-        <w:t>2. 政府採購法部分條文於九十一年二月六日奉  總統華總一義字第○九一○○○二五六一○號令修正公布，第三十七條規定廠商之財力資格方得以銀行或保險公司之履約及賠償連帶保證責任、連帶保證保險單代之。</w:t>
+        <w:t>2. 政府採購法第31條第2項第8款「其他經主管機關認定有影響採購公正之違反法令行為」，本會已於104年7月17日以工程企字第10400225210號令發布。</w:t>
+      </w:r>
+    </w:p>
+    <w:p>
+      <w:pPr>
+        <w:pStyle w:val="a9"/>
+        <w:ind w:left="960" w:hanging="240"/>
+        <w:jc w:val="both"/>
+      </w:pPr>
+      <w:r>
+        <w:rPr>
+          <w:rFonts w:ascii="新細明體" w:hAnsi="新細明體" w:eastAsia="新細明體"/>
+          <w:b w:val="0"/>
+          <w:sz w:val="24"/>
+        </w:rPr>
+        <w:t>3. 108年5月22日總統華總一義字第10800049691號令公布修正政府採購法部分條文，其第31條第2項規定刪除「機關得於招標文件中規定」之文字，並將第31條第2項第8款修正為第31條第2項第7款。另「依政府採購法第31條第2項第7款認定屬影響採購公正之違反法令行為」，業經本會108年9月16日工程企字第1080100733號令修正發布。</w:t>
       </w:r>
     </w:p>
     <w:p/>
@@ -7024,22 +8398,22 @@
           <w:b/>
           <w:sz w:val="24"/>
         </w:rPr>
-        <w:t>行政院公共工程委員會88年08月06日(88)工程企字第8811494號函</w:t>
-      </w:r>
-    </w:p>
-    <w:p>
-      <w:pPr>
-        <w:pStyle w:val="a9"/>
-        <w:ind w:left="720" w:hanging="720"/>
-        <w:jc w:val="both"/>
-      </w:pPr>
-      <w:r>
-        <w:rPr>
-          <w:rFonts w:ascii="新細明體" w:hAnsi="新細明體" w:eastAsia="新細明體"/>
-          <w:b w:val="0"/>
-          <w:sz w:val="24"/>
-        </w:rPr>
-        <w:t>主旨：機關以限制性招標辦理未達公告金額但逾公告金額十分之一之採購，除符合政府採購法第三十條第一項各款情形得免收押標金、保證金外，不分其屬國內或國外採購，仍應於招標文件中規定廠商須繳納上開押標金、保證金，復請查照。</w:t>
+        <w:t>行政院公共工程委員會91年01月14日(91)工程企字第91001515號函</w:t>
+      </w:r>
+    </w:p>
+    <w:p>
+      <w:pPr>
+        <w:pStyle w:val="a9"/>
+        <w:ind w:left="720" w:hanging="720"/>
+        <w:jc w:val="both"/>
+      </w:pPr>
+      <w:r>
+        <w:rPr>
+          <w:rFonts w:ascii="新細明體" w:hAnsi="新細明體" w:eastAsia="新細明體"/>
+          <w:b w:val="0"/>
+          <w:sz w:val="24"/>
+        </w:rPr>
+        <w:t>主旨：有關貴鎮鎮立托兒所二、三樓增建工程（第三期）第七次公開招標，是否退還王記營造股份有限公司之押標金，請依投標須知第六十點規定本於權責自行核處，復請查照。</w:t>
       </w:r>
     </w:p>
     <w:p>
@@ -7069,37 +8443,37 @@
           <w:b w:val="0"/>
           <w:sz w:val="24"/>
         </w:rPr>
-        <w:t>一、復貴公司八十八年七月二十六日北捷發字第八八二一一三二六〇〇號函。</w:t>
-      </w:r>
-    </w:p>
-    <w:p>
-      <w:pPr>
-        <w:pStyle w:val="a9"/>
-        <w:ind w:left="720" w:hanging="480"/>
-        <w:jc w:val="both"/>
-      </w:pPr>
-      <w:r>
-        <w:rPr>
-          <w:rFonts w:ascii="新細明體" w:hAnsi="新細明體" w:eastAsia="新細明體"/>
-          <w:b w:val="0"/>
-          <w:sz w:val="24"/>
-        </w:rPr>
-        <w:t>二、「押標金保證金暨其他擔保作業辦法」第十五條【履約保證金額度】及第二十五條【保固保證金額度】對上開保證金額度僅有上限之規定，採購機關可視實際需要自行衡酌訂定其額度。另政府採購法（以下簡稱本法）第一百零六條第一項規定，駐國外機構辦理或受託辦理之採購，因應駐在地國情或實地作業限制，且不違背我國締結之條約或協定者，得不適用本法第三十條有關押標金及保證金之規定，但應於招標文件中另定其處理方式。併請參考。</w:t>
-      </w:r>
-    </w:p>
-    <w:p>
-      <w:pPr>
-        <w:pStyle w:val="a9"/>
-        <w:ind w:left="720" w:hanging="720"/>
-        <w:jc w:val="both"/>
-      </w:pPr>
-      <w:r>
-        <w:rPr>
-          <w:rFonts w:ascii="新細明體" w:hAnsi="新細明體" w:eastAsia="新細明體"/>
-          <w:b w:val="0"/>
-          <w:sz w:val="24"/>
-        </w:rPr>
-        <w:t>備註：1. 108年5月22日總統華總一義字第10800049691號令修正公布政府採購法第30條第1項第1款為「勞務採購，以免收押標金、保證金為原則。」</w:t>
+        <w:t>一、復貴公所九十一年一月八日（九一）鹿鎮建字第四０五號函。</w:t>
+      </w:r>
+    </w:p>
+    <w:p>
+      <w:pPr>
+        <w:pStyle w:val="a9"/>
+        <w:ind w:left="720" w:hanging="480"/>
+        <w:jc w:val="both"/>
+      </w:pPr>
+      <w:r>
+        <w:rPr>
+          <w:rFonts w:ascii="新細明體" w:hAnsi="新細明體" w:eastAsia="新細明體"/>
+          <w:b w:val="0"/>
+          <w:sz w:val="24"/>
+        </w:rPr>
+        <w:t>二、茲提供下列意見供參考：旨揭廠商於參與比減價格並減至新台幣二０七０萬元後表示不願意承包，建議依旨揭投標須知第六十點第（五）款不發還其押標金。</w:t>
+      </w:r>
+    </w:p>
+    <w:p>
+      <w:pPr>
+        <w:pStyle w:val="a9"/>
+        <w:ind w:left="720" w:hanging="480"/>
+        <w:jc w:val="both"/>
+      </w:pPr>
+      <w:r>
+        <w:rPr>
+          <w:rFonts w:ascii="新細明體" w:hAnsi="新細明體" w:eastAsia="新細明體"/>
+          <w:b w:val="0"/>
+          <w:sz w:val="24"/>
+        </w:rPr>
+        <w:t>三、另查貴公所辦理本案第四次至第六次招標時，均以投標廠商未達法定三家而予流標，不符本法第四十八條第二項規定，請檢討改進。</w:t>
       </w:r>
     </w:p>
     <w:p/>
@@ -7115,22 +8489,99 @@
           <w:b/>
           <w:sz w:val="24"/>
         </w:rPr>
-        <w:t>行政院公共工程委員會88年08月19日(88)工程企字第8812053號函</w:t>
-      </w:r>
-    </w:p>
-    <w:p>
-      <w:pPr>
-        <w:pStyle w:val="a9"/>
-        <w:ind w:left="720" w:hanging="720"/>
-        <w:jc w:val="both"/>
-      </w:pPr>
-      <w:r>
-        <w:rPr>
-          <w:rFonts w:ascii="新細明體" w:hAnsi="新細明體" w:eastAsia="新細明體"/>
-          <w:b w:val="0"/>
-          <w:sz w:val="24"/>
-        </w:rPr>
-        <w:t>主旨：有關押標金、保證金及其他擔保之種類、額度及繳納、退還、終止方式，機關應依政府採購法第三十條及押標金保證金暨其他擔保作業辦法之規定辦理。請查照。</w:t>
+        <w:t>行政院公共工程委員會91年02月08日(91)工程企字第91006199號令函</w:t>
+      </w:r>
+    </w:p>
+    <w:p>
+      <w:pPr>
+        <w:pStyle w:val="a9"/>
+        <w:ind w:left="720" w:hanging="720"/>
+        <w:jc w:val="both"/>
+      </w:pPr>
+      <w:r>
+        <w:rPr>
+          <w:rFonts w:ascii="新細明體" w:hAnsi="新細明體" w:eastAsia="新細明體"/>
+          <w:b w:val="0"/>
+          <w:sz w:val="24"/>
+        </w:rPr>
+        <w:t>廠商所繳押標金不予發還之情形，應以政府採購法第三十一條第二項規定為限，機關不得於招標文件中規定「得標廠商須於決標後一定期間內就原投標文件中之影本，檢送正本供查驗，逾期檢送者按日扣罰一定比例押標金」，以免牴觸上開條文之規定。</w:t>
+      </w:r>
+    </w:p>
+    <w:p/>
+    <w:p>
+      <w:pPr>
+        <w:pStyle w:val="a9"/>
+        <w:ind w:left="720" w:hanging="720"/>
+        <w:jc w:val="both"/>
+      </w:pPr>
+      <w:r>
+        <w:rPr>
+          <w:rFonts w:ascii="微軟正黑體" w:hAnsi="微軟正黑體" w:eastAsia="微軟正黑體"/>
+          <w:b/>
+          <w:sz w:val="24"/>
+        </w:rPr>
+        <w:t>財政部國庫署91年07月22日台庫1字第0910307998號函</w:t>
+      </w:r>
+    </w:p>
+    <w:p>
+      <w:pPr>
+        <w:pStyle w:val="a9"/>
+        <w:ind w:left="720" w:hanging="720"/>
+        <w:jc w:val="both"/>
+      </w:pPr>
+      <w:r>
+        <w:rPr>
+          <w:rFonts w:ascii="新細明體" w:hAnsi="新細明體" w:eastAsia="新細明體"/>
+          <w:b w:val="0"/>
+          <w:sz w:val="24"/>
+        </w:rPr>
+        <w:t>主旨：關於國立交通大學以國庫專戶存款支票繳納押標金一案，查國庫專戶存款支票，依最高法院民事判決六〇臺上一五四八號判例解釋，票據法上之支票，其付款人以銀錢業者或信用合作社為限，公庫支票之付款人為公庫，並非一般之銀錢業者或信用合作社，是公庫支票並非票據法上之支票，而僅為指示證券之一種。至是否符合政府採購法第三十條第三十條第二項得為押標金或保證金，仍請貴會以該法主管機關之立場審酌，請查照</w:t>
+      </w:r>
+    </w:p>
+    <w:p>
+      <w:pPr>
+        <w:pStyle w:val="a9"/>
+        <w:ind w:left="720" w:hanging="720"/>
+        <w:jc w:val="both"/>
+      </w:pPr>
+      <w:r>
+        <w:rPr>
+          <w:rFonts w:ascii="新細明體" w:hAnsi="新細明體" w:eastAsia="新細明體"/>
+          <w:b w:val="0"/>
+          <w:sz w:val="24"/>
+        </w:rPr>
+        <w:t>說明：依據財政部金融局九十一年七月十一日台融局（二）字第〇九一〇〇三一六六八號移文單移來貴會九十一年七月三日（九一）工程企傳字第一二八〇號傳真信函辦理。</w:t>
+      </w:r>
+    </w:p>
+    <w:p/>
+    <w:p>
+      <w:pPr>
+        <w:pStyle w:val="a9"/>
+        <w:ind w:left="720" w:hanging="720"/>
+        <w:jc w:val="both"/>
+      </w:pPr>
+      <w:r>
+        <w:rPr>
+          <w:rFonts w:ascii="微軟正黑體" w:hAnsi="微軟正黑體" w:eastAsia="微軟正黑體"/>
+          <w:b/>
+          <w:sz w:val="24"/>
+        </w:rPr>
+        <w:t>行政院公共工程委員會91年08月06日工程企字第09100334510號函</w:t>
+      </w:r>
+    </w:p>
+    <w:p>
+      <w:pPr>
+        <w:pStyle w:val="a9"/>
+        <w:ind w:left="720" w:hanging="720"/>
+        <w:jc w:val="both"/>
+      </w:pPr>
+      <w:r>
+        <w:rPr>
+          <w:rFonts w:ascii="新細明體" w:hAnsi="新細明體" w:eastAsia="新細明體"/>
+          <w:b w:val="0"/>
+          <w:sz w:val="24"/>
+        </w:rPr>
+        <w:t>主旨：檢送政府採購「電子押標金／電子保證金規格書(一‧一版)」之電子檔案已公開於本會全球資訊網網站（http://www.pcc.gov.tw/e_gpl），請查照。</w:t>
       </w:r>
     </w:p>
     <w:p>
@@ -7160,22 +8611,22 @@
           <w:b w:val="0"/>
           <w:sz w:val="24"/>
         </w:rPr>
-        <w:t>一、復貴公司八十八年八月九日申請書。</w:t>
-      </w:r>
-    </w:p>
-    <w:p>
-      <w:pPr>
-        <w:pStyle w:val="a9"/>
-        <w:ind w:left="720" w:hanging="480"/>
-        <w:jc w:val="both"/>
-      </w:pPr>
-      <w:r>
-        <w:rPr>
-          <w:rFonts w:ascii="新細明體" w:hAnsi="新細明體" w:eastAsia="新細明體"/>
-          <w:b w:val="0"/>
-          <w:sz w:val="24"/>
-        </w:rPr>
-        <w:t>二、貴公司如發現機關辦理採購違反前揭規定之情者，請依政府採購法第六章規定提出異議、申訴。</w:t>
+        <w:t>一、依據「電子採購作業辦法」第十三條規定辦理，旨揭格式由主管機關公開於指定之資訊系統。</w:t>
+      </w:r>
+    </w:p>
+    <w:p>
+      <w:pPr>
+        <w:pStyle w:val="a9"/>
+        <w:ind w:left="720" w:hanging="480"/>
+        <w:jc w:val="both"/>
+      </w:pPr>
+      <w:r>
+        <w:rPr>
+          <w:rFonts w:ascii="新細明體" w:hAnsi="新細明體" w:eastAsia="新細明體"/>
+          <w:b w:val="0"/>
+          <w:sz w:val="24"/>
+        </w:rPr>
+        <w:t>二、旨揭電子押標金及電子保證金係配合本會「政府採購電子領投標系統」，由金融機構提供電子憑證，交由廠商於電子投標時使用，以符合政府採購法第三十條繳納押標金或第三十七條第二項廠商之財力資格連帶保證之規定。</w:t>
       </w:r>
     </w:p>
     <w:p/>
@@ -7191,22 +8642,84 @@
           <w:b/>
           <w:sz w:val="24"/>
         </w:rPr>
-        <w:t>行政院公共工程委員會88年09月01日(88)工程企字第8812908號函</w:t>
-      </w:r>
-    </w:p>
-    <w:p>
-      <w:pPr>
-        <w:pStyle w:val="a9"/>
-        <w:ind w:left="720" w:hanging="720"/>
-        <w:jc w:val="both"/>
-      </w:pPr>
-      <w:r>
-        <w:rPr>
-          <w:rFonts w:ascii="新細明體" w:hAnsi="新細明體" w:eastAsia="新細明體"/>
-          <w:b w:val="0"/>
-          <w:sz w:val="24"/>
-        </w:rPr>
-        <w:t>主旨：本會依「押標金保證金暨其他擔保作業辦法」第三十四條之規定所訂各式押標金及保證金格式，屬參考性質，復請查照。</w:t>
+        <w:t>行政院公共工程委員會92年07月23日工程企字第09200305371號函</w:t>
+      </w:r>
+    </w:p>
+    <w:p>
+      <w:pPr>
+        <w:pStyle w:val="a9"/>
+        <w:ind w:left="720" w:hanging="720"/>
+        <w:jc w:val="both"/>
+      </w:pPr>
+      <w:r>
+        <w:rPr>
+          <w:rFonts w:ascii="新細明體" w:hAnsi="新細明體" w:eastAsia="新細明體"/>
+          <w:b w:val="0"/>
+          <w:sz w:val="24"/>
+        </w:rPr>
+        <w:t>主旨：「押標金／保證金連帶保證書格式」、「履約保證金／保固保證金連帶保證書格式」、「預付款還款保證連帶保證書格式」及「廠商資格履約及賠償連帶保證書格式」業經本會於九十二年七月二十三日以工程企字第０九二００三０五三七０號令修正發布，茲檢送發布令影本乙份如附件，請查照並轉知所屬（轄）機關。</w:t>
+      </w:r>
+    </w:p>
+    <w:p/>
+    <w:p>
+      <w:pPr>
+        <w:pStyle w:val="a9"/>
+        <w:ind w:left="720" w:hanging="720"/>
+        <w:jc w:val="both"/>
+      </w:pPr>
+      <w:r>
+        <w:rPr>
+          <w:rFonts w:ascii="微軟正黑體" w:hAnsi="微軟正黑體" w:eastAsia="微軟正黑體"/>
+          <w:b/>
+          <w:sz w:val="24"/>
+        </w:rPr>
+        <w:t>行政院公共工程委員會92年10月30日工程企字第09200443351號函</w:t>
+      </w:r>
+    </w:p>
+    <w:p>
+      <w:pPr>
+        <w:pStyle w:val="a9"/>
+        <w:ind w:left="720" w:hanging="720"/>
+        <w:jc w:val="both"/>
+      </w:pPr>
+      <w:r>
+        <w:rPr>
+          <w:rFonts w:ascii="新細明體" w:hAnsi="新細明體" w:eastAsia="新細明體"/>
+          <w:b w:val="0"/>
+          <w:sz w:val="24"/>
+        </w:rPr>
+        <w:t>主旨：「定期存款單質權設定申請書格式」、「定期存款單質權設定覆函格式」業經本會於九十二年十月三十日以工程企字０９２００４４３３５０號令修正發布，茲檢送發布令影本乙份如附件，請查照並轉知所屬（轄）機關。</w:t>
+      </w:r>
+    </w:p>
+    <w:p/>
+    <w:p>
+      <w:pPr>
+        <w:pStyle w:val="a9"/>
+        <w:ind w:left="720" w:hanging="720"/>
+        <w:jc w:val="both"/>
+      </w:pPr>
+      <w:r>
+        <w:rPr>
+          <w:rFonts w:ascii="微軟正黑體" w:hAnsi="微軟正黑體" w:eastAsia="微軟正黑體"/>
+          <w:b/>
+          <w:sz w:val="24"/>
+        </w:rPr>
+        <w:t>行政院公共工程委員會94年03月10日工程管字第09400079440號函</w:t>
+      </w:r>
+    </w:p>
+    <w:p>
+      <w:pPr>
+        <w:pStyle w:val="a9"/>
+        <w:ind w:left="720" w:hanging="720"/>
+        <w:jc w:val="both"/>
+      </w:pPr>
+      <w:r>
+        <w:rPr>
+          <w:rFonts w:ascii="新細明體" w:hAnsi="新細明體" w:eastAsia="新細明體"/>
+          <w:b w:val="0"/>
+          <w:sz w:val="24"/>
+        </w:rPr>
+        <w:t>主旨：請依「公共工程金質獎頒發作業要點」第9點規定辦理押標金或保證金之減收，並得於招標文件中規定繳納後方為金質獎得獎或入圍廠商者，不予減收，請查照並轉知所屬。</w:t>
       </w:r>
     </w:p>
     <w:p>
@@ -7236,37 +8749,37 @@
           <w:b w:val="0"/>
           <w:sz w:val="24"/>
         </w:rPr>
-        <w:t>一、復貴府八十八年八月二十三日八八北府工公字第三二Ｏ五五九號函。</w:t>
-      </w:r>
-    </w:p>
-    <w:p>
-      <w:pPr>
-        <w:pStyle w:val="a9"/>
-        <w:ind w:left="720" w:hanging="480"/>
-        <w:jc w:val="both"/>
-      </w:pPr>
-      <w:r>
-        <w:rPr>
-          <w:rFonts w:ascii="新細明體" w:hAnsi="新細明體" w:eastAsia="新細明體"/>
-          <w:b w:val="0"/>
-          <w:sz w:val="24"/>
-        </w:rPr>
-        <w:t>二、由於本會提供之各式押標金及保證金格式係屬參考性質，如貴府同意銀行以其自訂格式辦理質權設定、保證等，本會無意見；如貴府不同意銀行之自訂格式，建請洽廠商改採用政府採購法第三十條第二項規定之其他方式繳納。</w:t>
-      </w:r>
-    </w:p>
-    <w:p>
-      <w:pPr>
-        <w:pStyle w:val="a9"/>
-        <w:ind w:left="720" w:hanging="480"/>
-        <w:jc w:val="both"/>
-      </w:pPr>
-      <w:r>
-        <w:rPr>
-          <w:rFonts w:ascii="新細明體" w:hAnsi="新細明體" w:eastAsia="新細明體"/>
-          <w:b w:val="0"/>
-          <w:sz w:val="24"/>
-        </w:rPr>
-        <w:t>三、來函建議本會通函各銀行修改其內部有關格式乙節，轉請中華民國銀行商業同業公會全國聯合會參考。</w:t>
+        <w:t>一、依榮民工程股份有限公司94年2月1日榮工業一字第0940001296號函及交通部鐵路改建工程局94年1月31日鐵工工字第0940000989號函辦理。</w:t>
+      </w:r>
+    </w:p>
+    <w:p>
+      <w:pPr>
+        <w:pStyle w:val="a9"/>
+        <w:ind w:left="720" w:hanging="480"/>
+        <w:jc w:val="both"/>
+      </w:pPr>
+      <w:r>
+        <w:rPr>
+          <w:rFonts w:ascii="新細明體" w:hAnsi="新細明體" w:eastAsia="新細明體"/>
+          <w:b w:val="0"/>
+          <w:sz w:val="24"/>
+        </w:rPr>
+        <w:t>二、依旨揭金質獎要點第9點第1項第1款第3目及第2款第3目規定，各機關得於招標文件中明訂對工程採購得獎廠商，自頒獎之次年1月1日起1年內；對工程採購入圍廠商，自頒獎之次年1月1日起半年內，其應繳納之押標金、履約保證金或保固保證金金額得予減收。減收額度於招標文件中載明，但以不逾原定應繳納總額之百分之五十為限。繳納後方為得獎或入圍廠商者，依招標文件規定適用之。查本會業以93年7月13日工程管字第09300273130號函及93年12月16日工程管字第09300476912號函，請各機關依上開獎勵規定辦理在案，諒達。</w:t>
+      </w:r>
+    </w:p>
+    <w:p>
+      <w:pPr>
+        <w:pStyle w:val="a9"/>
+        <w:ind w:left="720" w:hanging="480"/>
+        <w:jc w:val="both"/>
+      </w:pPr>
+      <w:r>
+        <w:rPr>
+          <w:rFonts w:ascii="新細明體" w:hAnsi="新細明體" w:eastAsia="新細明體"/>
+          <w:b w:val="0"/>
+          <w:sz w:val="24"/>
+        </w:rPr>
+        <w:t>三、有關第五屆公共工程金質獎得獎及入圍廠商名單業公告於政府採購公告資訊網站，請轉知所屬(轄)各工程主辦機關，依旨揭金質獎要點第9點獎勵規定辦理，並得於招標文件中規定繳納後方為金質獎得獎或入圍廠商者，不予減收押標金或保證金之優惠。</w:t>
       </w:r>
     </w:p>
     <w:p/>
@@ -7282,52 +8795,82 @@
           <w:b/>
           <w:sz w:val="24"/>
         </w:rPr>
-        <w:t>行政院公共工程委員會88年09月30日(88)工程企字第8814664號函</w:t>
-      </w:r>
-    </w:p>
-    <w:p>
-      <w:pPr>
-        <w:pStyle w:val="a9"/>
-        <w:ind w:left="720" w:hanging="720"/>
-        <w:jc w:val="both"/>
-      </w:pPr>
-      <w:r>
-        <w:rPr>
-          <w:rFonts w:ascii="新細明體" w:hAnsi="新細明體" w:eastAsia="新細明體"/>
-          <w:b w:val="0"/>
-          <w:sz w:val="24"/>
-        </w:rPr>
-        <w:t>主旨：關於廠商未依「押標金保證金暨其他擔保作業辦法」第七條第一項規定於銀行支票上填寫受款人乙節，依票據法第一百二十五條第二項規定，以執票人為受款人，貴所不得據以不決標予該廠商。復請查照。</w:t>
-      </w:r>
-    </w:p>
-    <w:p>
-      <w:pPr>
-        <w:pStyle w:val="a9"/>
-        <w:ind w:left="720" w:hanging="720"/>
-        <w:jc w:val="both"/>
-      </w:pPr>
-      <w:r>
-        <w:rPr>
-          <w:rFonts w:ascii="新細明體" w:hAnsi="新細明體" w:eastAsia="新細明體"/>
-          <w:b w:val="0"/>
-          <w:sz w:val="24"/>
-        </w:rPr>
-        <w:t>說明：復貴所八十八年九月十八日觀技北八十八字第Ｏ二五二號書函。</w:t>
-      </w:r>
-    </w:p>
-    <w:p>
-      <w:pPr>
-        <w:pStyle w:val="a9"/>
-        <w:ind w:left="720" w:hanging="720"/>
-        <w:jc w:val="both"/>
-      </w:pPr>
-      <w:r>
-        <w:rPr>
-          <w:rFonts w:ascii="新細明體" w:hAnsi="新細明體" w:eastAsia="新細明體"/>
-          <w:b w:val="0"/>
-          <w:sz w:val="24"/>
-        </w:rPr>
-        <w:t>備註：1. 本會90年8月24日(90)工程企字第90032047號令修正發布旨揭辦法第7條第1項規定，增訂「未填寫受款人者，以執票之機關為受款人」。</w:t>
+        <w:t>行政院公共工程委員會95年07月26日工程企字第09500279830號函</w:t>
+      </w:r>
+    </w:p>
+    <w:p>
+      <w:pPr>
+        <w:pStyle w:val="a9"/>
+        <w:ind w:left="720" w:hanging="720"/>
+        <w:jc w:val="both"/>
+      </w:pPr>
+      <w:r>
+        <w:rPr>
+          <w:rFonts w:ascii="新細明體" w:hAnsi="新細明體" w:eastAsia="新細明體"/>
+          <w:b w:val="0"/>
+          <w:sz w:val="24"/>
+        </w:rPr>
+        <w:t>主旨：為利民間團體協助政府推動社會福利工作，各機關辦理限以身心障礙者、身心障礙福利機構及社福團體為投標對象之採購，建請考量其採購個案性質，依政府採購法（以下簡稱本法）第30條第1項規定免收取押標金、保證金，請查照。</w:t>
+      </w:r>
+    </w:p>
+    <w:p>
+      <w:pPr>
+        <w:pStyle w:val="a9"/>
+        <w:ind w:left="720" w:hanging="720"/>
+        <w:jc w:val="both"/>
+      </w:pPr>
+      <w:r>
+        <w:rPr>
+          <w:rFonts w:ascii="新細明體" w:hAnsi="新細明體" w:eastAsia="新細明體"/>
+          <w:b w:val="0"/>
+          <w:sz w:val="24"/>
+        </w:rPr>
+        <w:t>說明：</w:t>
+      </w:r>
+    </w:p>
+    <w:p>
+      <w:pPr>
+        <w:pStyle w:val="a9"/>
+        <w:ind w:left="720" w:hanging="480"/>
+        <w:jc w:val="both"/>
+      </w:pPr>
+      <w:r>
+        <w:rPr>
+          <w:rFonts w:ascii="新細明體" w:hAnsi="新細明體" w:eastAsia="新細明體"/>
+          <w:b w:val="0"/>
+          <w:sz w:val="24"/>
+        </w:rPr>
+        <w:t>一、依行政院社會福利推動委員會95年7月14日台院福推字第095008號函辦理。</w:t>
+      </w:r>
+    </w:p>
+    <w:p>
+      <w:pPr>
+        <w:pStyle w:val="a9"/>
+        <w:ind w:left="720" w:hanging="480"/>
+        <w:jc w:val="both"/>
+      </w:pPr>
+      <w:r>
+        <w:rPr>
+          <w:rFonts w:ascii="新細明體" w:hAnsi="新細明體" w:eastAsia="新細明體"/>
+          <w:b w:val="0"/>
+          <w:sz w:val="24"/>
+        </w:rPr>
+        <w:t>二、依政府採購法第30條第1項規定，機關辦理勞務採購（不限金額）、未達公告金額之財物採購，得免收取押標金、保證金；以議價方式辦理之採購，得免收取押標金。準此，針對限以身心障礙者、身心障礙福利機構及社福團體為投標對象（包括議、比價）之採購，機關可依上開規定於招標文件載明免收取押標金或保證金，以減少社福團體參與政府採購障礙。</w:t>
+      </w:r>
+    </w:p>
+    <w:p>
+      <w:pPr>
+        <w:pStyle w:val="a9"/>
+        <w:ind w:left="720" w:hanging="720"/>
+        <w:jc w:val="both"/>
+      </w:pPr>
+      <w:r>
+        <w:rPr>
+          <w:rFonts w:ascii="新細明體" w:hAnsi="新細明體" w:eastAsia="新細明體"/>
+          <w:b w:val="0"/>
+          <w:sz w:val="24"/>
+        </w:rPr>
+        <w:t>備註：1. 108年5月22日總統華總一義字第10800049691號令公布修正政府採購法部分條文，其第30條第1項第1款修正為：「勞務採購，以免收押標金、保證金為原則」。</w:t>
       </w:r>
     </w:p>
     <w:p/>
@@ -7343,22 +8886,113 @@
           <w:b/>
           <w:sz w:val="24"/>
         </w:rPr>
-        <w:t>行政院公共工程委員會88年10月12日(88)工程企字第8814887號函</w:t>
-      </w:r>
-    </w:p>
-    <w:p>
-      <w:pPr>
-        <w:pStyle w:val="a9"/>
-        <w:ind w:left="720" w:hanging="720"/>
-        <w:jc w:val="both"/>
-      </w:pPr>
-      <w:r>
-        <w:rPr>
-          <w:rFonts w:ascii="新細明體" w:hAnsi="新細明體" w:eastAsia="新細明體"/>
-          <w:b w:val="0"/>
-          <w:sz w:val="24"/>
-        </w:rPr>
-        <w:t>主旨：貴處函詢有關政府採購法執行疑義，復如說明，請查照。</w:t>
+        <w:t>行政院公共工程委員會95年12月21日工程企字第09500499370號函</w:t>
+      </w:r>
+    </w:p>
+    <w:p>
+      <w:pPr>
+        <w:pStyle w:val="a9"/>
+        <w:ind w:left="720" w:hanging="720"/>
+        <w:jc w:val="both"/>
+      </w:pPr>
+      <w:r>
+        <w:rPr>
+          <w:rFonts w:ascii="新細明體" w:hAnsi="新細明體" w:eastAsia="新細明體"/>
+          <w:b w:val="0"/>
+          <w:sz w:val="24"/>
+        </w:rPr>
+        <w:t>主旨：檢送本會95年12月18日「研商以國（公）庫支票及國庫專戶存款支票繳納押標金保證金之適法性問題」會議紀錄乙份，請查照。</w:t>
+        <w:br/>
+        <w:t>「研商以國(公)庫支票及國庫專戶存款支票繳納押標金保證金之適法性問題」會議紀錄</w:t>
+        <w:br/>
+        <w:t>壹、時間：95年12月18日上午9時30分</w:t>
+        <w:br/>
+        <w:t>柒、會議結論</w:t>
+        <w:br/>
+        <w:t>一、「國庫支票」與「國庫專戶存款支票」性質上皆屬支付工具，惟前者係由中央銀行之國庫存款戶支付，由財政部地區支付機構憑中央政府各機關所簽具之付款憑單簽發；後者係由機關自行保管款項(屬特種基金或中央政府各機關歲入以外，其他公款及保管款之依法令所定，應專戶存管之款項)支付，由相關權責人員簽名或蓋章後簽發。</w:t>
+        <w:br/>
+        <w:t>二、國庫支票係由國庫支付且由支付機構統一簽發作業，斷無退票之可能性；惟依國庫法第14條第2項規定，各項歲出之支付，應依據預算及其核定分配預算規定之法定用途與條件辦理，爰國庫支票用以支付押標金或保證金，必須已於預算編列，方符合上開規定。另國庫專戶存款支票可能因簽發作業瑕疵，如用印不清楚或背書不符等，難謂無拒兌之可能性；而因存款不足遭退票之情形，則尚無前例。</w:t>
+        <w:br/>
+        <w:t>三、至由直轄市庫、縣 (市) 庫、鄉 (鎮、市) 庫簽發之公庫支票，亦有預算使用目的之限制 ，且是否可能因地方政府財政拮据，致公庫支票無法兌現，不無疑慮。</w:t>
+        <w:br/>
+        <w:t>四、綜上所述，國(公)庫支票及國庫專戶存款支票，既不符合押標金保證金暨其他擔保作業辦法第2條第1項第3款定義，且皆有使用目的或擔保效力之限制，均不納入政府採購法第30條第2項所定押標金、保證金之繳納方式。</w:t>
+      </w:r>
+    </w:p>
+    <w:p/>
+    <w:p>
+      <w:pPr>
+        <w:pStyle w:val="a9"/>
+        <w:ind w:left="720" w:hanging="720"/>
+        <w:jc w:val="both"/>
+      </w:pPr>
+      <w:r>
+        <w:rPr>
+          <w:rFonts w:ascii="微軟正黑體" w:hAnsi="微軟正黑體" w:eastAsia="微軟正黑體"/>
+          <w:b/>
+          <w:sz w:val="24"/>
+        </w:rPr>
+        <w:t>行政院公共工程委員會96年03月22日工程企字第09600114640號函</w:t>
+      </w:r>
+    </w:p>
+    <w:p>
+      <w:pPr>
+        <w:pStyle w:val="a9"/>
+        <w:ind w:left="720" w:hanging="720"/>
+        <w:jc w:val="both"/>
+      </w:pPr>
+      <w:r>
+        <w:rPr>
+          <w:rFonts w:ascii="新細明體" w:hAnsi="新細明體" w:eastAsia="新細明體"/>
+          <w:b w:val="0"/>
+          <w:sz w:val="24"/>
+        </w:rPr>
+        <w:t>主旨：為健全履約保證金之效力，機關得視個案情形及實際需要於招標文件中規定如說明，請查照並轉知所屬（轄）機關（構）。</w:t>
+      </w:r>
+    </w:p>
+    <w:p>
+      <w:pPr>
+        <w:pStyle w:val="a9"/>
+        <w:ind w:left="720" w:hanging="720"/>
+        <w:jc w:val="both"/>
+      </w:pPr>
+      <w:r>
+        <w:rPr>
+          <w:rFonts w:ascii="新細明體" w:hAnsi="新細明體" w:eastAsia="新細明體"/>
+          <w:b w:val="0"/>
+          <w:sz w:val="24"/>
+        </w:rPr>
+        <w:t>說明：機關依契約規定有不發還廠商履約保證金情形，為免廠商之書面連帶保證銀行推諉拖延拒不付款，致機關必須提出訴訟請求，造成機關人力、物力浪費，並防杜銀行、廠商藉興訟拖延付款時日之行為，機關得視個案情形及實際需要於招標文件中規定：「廠商如以銀行之書面連帶保證或開發或保兌之不可撤銷擔保信用狀繳納履約保證金者，機關得視該銀行之債信、過去履行連帶保證之紀錄等，經機關審核後始予接受。廠商以押標金轉換為履約保證金時，亦同。」。</w:t>
+      </w:r>
+    </w:p>
+    <w:p/>
+    <w:p>
+      <w:pPr>
+        <w:pStyle w:val="a9"/>
+        <w:ind w:left="720" w:hanging="720"/>
+        <w:jc w:val="both"/>
+      </w:pPr>
+      <w:r>
+        <w:rPr>
+          <w:rFonts w:ascii="微軟正黑體" w:hAnsi="微軟正黑體" w:eastAsia="微軟正黑體"/>
+          <w:b/>
+          <w:sz w:val="24"/>
+        </w:rPr>
+        <w:t>行政院公共工程委員會99年02月12日工程企字第09800574960號函</w:t>
+      </w:r>
+    </w:p>
+    <w:p>
+      <w:pPr>
+        <w:pStyle w:val="a9"/>
+        <w:ind w:left="720" w:hanging="720"/>
+        <w:jc w:val="both"/>
+      </w:pPr>
+      <w:r>
+        <w:rPr>
+          <w:rFonts w:ascii="新細明體" w:hAnsi="新細明體" w:eastAsia="新細明體"/>
+          <w:b w:val="0"/>
+          <w:sz w:val="24"/>
+        </w:rPr>
+        <w:t>主旨：貴公司函詢得否繼受榮民工程股份有限公司（下稱榮民公司）既有之優良廠商資格參與政府採購案件乙節，復如說明，請查照。</w:t>
       </w:r>
     </w:p>
     <w:p>
@@ -7388,82 +9022,52 @@
           <w:b w:val="0"/>
           <w:sz w:val="24"/>
         </w:rPr>
-        <w:t>一、復貴處八十八年九月二十三日（八八）處秘四字第二四八九六號函。</w:t>
-      </w:r>
-    </w:p>
-    <w:p>
-      <w:pPr>
-        <w:pStyle w:val="a9"/>
-        <w:ind w:left="720" w:hanging="480"/>
-        <w:jc w:val="both"/>
-      </w:pPr>
-      <w:r>
-        <w:rPr>
-          <w:rFonts w:ascii="新細明體" w:hAnsi="新細明體" w:eastAsia="新細明體"/>
-          <w:b w:val="0"/>
-          <w:sz w:val="24"/>
-        </w:rPr>
-        <w:t>二、關於「押標金保證金暨其他擔保作業辦法」第十四條第一項規定，得標廠商押標金金額超出招標文件規定之履約保證金金額，如廠商自願或堅持不必退還該超出之部分，可併轉為履約保證金。</w:t>
-      </w:r>
-    </w:p>
-    <w:p>
-      <w:pPr>
-        <w:pStyle w:val="a9"/>
-        <w:ind w:left="720" w:hanging="480"/>
-        <w:jc w:val="both"/>
-      </w:pPr>
-      <w:r>
-        <w:rPr>
-          <w:rFonts w:ascii="新細明體" w:hAnsi="新細明體" w:eastAsia="新細明體"/>
-          <w:b w:val="0"/>
-          <w:sz w:val="24"/>
-        </w:rPr>
-        <w:t>三、機關對於得標廠商繳納代金情形之管制，請參考工程、財物或勞務採購契約範本有關「契約價金之給付條件」中之規定：「廠商於國內員工總人數逾一百人，履約期間僱用殘障人士及原住民人數低於總人數百分之二者，應繳納代金。繳納代金之證明文件，應（每月／每二個月／每三個月／每四個月／每半年／於驗收付款前；由機關於招標時載明）送機關查核，以憑付款。」辦理。</w:t>
-      </w:r>
-    </w:p>
-    <w:p>
-      <w:pPr>
-        <w:pStyle w:val="a9"/>
-        <w:ind w:left="720" w:hanging="480"/>
-        <w:jc w:val="both"/>
-      </w:pPr>
-      <w:r>
-        <w:rPr>
-          <w:rFonts w:ascii="新細明體" w:hAnsi="新細明體" w:eastAsia="新細明體"/>
-          <w:b w:val="0"/>
-          <w:sz w:val="24"/>
-        </w:rPr>
-        <w:t>四、關於議價決標之案件，如屬公告金額以上之採購，仍適用政府採購法（以下簡稱本法）第六十一條書面通知廠商之規定。</w:t>
-      </w:r>
-    </w:p>
-    <w:p>
-      <w:pPr>
-        <w:pStyle w:val="a9"/>
-        <w:ind w:left="720" w:hanging="480"/>
-        <w:jc w:val="both"/>
-      </w:pPr>
-      <w:r>
-        <w:rPr>
-          <w:rFonts w:ascii="新細明體" w:hAnsi="新細明體" w:eastAsia="新細明體"/>
-          <w:b w:val="0"/>
-          <w:sz w:val="24"/>
-        </w:rPr>
-        <w:t>五、機關依本法第五十八條之規定，限期請廠商提出說明或擔保，廠商未提出前不得先行辦理決標，各合格廠商之標及押標金，機關得斟酌決定全部或部分保留，並依押標金保證金暨其他擔保作業辦法第十二條之規定發還押標金。</w:t>
-      </w:r>
-    </w:p>
-    <w:p>
-      <w:pPr>
-        <w:pStyle w:val="a9"/>
-        <w:ind w:left="720" w:hanging="480"/>
-        <w:jc w:val="both"/>
-      </w:pPr>
-      <w:r>
-        <w:rPr>
-          <w:rFonts w:ascii="新細明體" w:hAnsi="新細明體" w:eastAsia="新細明體"/>
-          <w:b w:val="0"/>
-          <w:sz w:val="24"/>
-        </w:rPr>
-        <w:t>六、本法施行細則第七十二條及第七十三條所稱「合於招標文件規定之投標廠商僅有一家」，係指開標後審查結果，符合招標文件規定之投標廠商僅有一家之情形。如機關辦理比減價格一次或二次後，僅餘一家廠商繼續減價時，仍為本法第五十三條第一項及第五十四條之比減程序，適用本法施行細則第七十二條第一項規定，不適用同條第二項規定。（本項說明更正如後函）</w:t>
+        <w:t>一、復貴公司98年12月28日（2009）榮工字第0090號函。</w:t>
+      </w:r>
+    </w:p>
+    <w:p>
+      <w:pPr>
+        <w:pStyle w:val="a9"/>
+        <w:ind w:left="720" w:hanging="480"/>
+        <w:jc w:val="both"/>
+      </w:pPr>
+      <w:r>
+        <w:rPr>
+          <w:rFonts w:ascii="新細明體" w:hAnsi="新細明體" w:eastAsia="新細明體"/>
+          <w:b w:val="0"/>
+          <w:sz w:val="24"/>
+        </w:rPr>
+        <w:t>二、茲提供下列意見供參考：</w:t>
+      </w:r>
+    </w:p>
+    <w:p>
+      <w:pPr>
+        <w:pStyle w:val="a9"/>
+        <w:ind w:left="964" w:hanging="680"/>
+        <w:jc w:val="both"/>
+      </w:pPr>
+      <w:r>
+        <w:rPr>
+          <w:rFonts w:ascii="新細明體" w:hAnsi="新細明體" w:eastAsia="新細明體"/>
+          <w:b w:val="0"/>
+          <w:sz w:val="24"/>
+        </w:rPr>
+        <w:t>（一）「押標金保證金暨其他擔保作業辦法」第33條之5第2項規定「前項優良廠商，指經主管機關或相關中央目的事業主管機關依履約成果等評為優良，並經主管機關認定而於指定之資料庫公告，且在獎勵期間內者」。</w:t>
+      </w:r>
+    </w:p>
+    <w:p>
+      <w:pPr>
+        <w:pStyle w:val="a9"/>
+        <w:ind w:left="964" w:hanging="680"/>
+        <w:jc w:val="both"/>
+      </w:pPr>
+      <w:r>
+        <w:rPr>
+          <w:rFonts w:ascii="新細明體" w:hAnsi="新細明體" w:eastAsia="新細明體"/>
+          <w:b w:val="0"/>
+          <w:sz w:val="24"/>
+        </w:rPr>
+        <w:t>（二）來函所述榮民公司仍然存在，原經相關中央目的事業主管機關依履約成果等評為優良之對象為榮民公司，榮民公司之履約成果亦難謂係貴公司之履約成果，自不生繼受榮民公司既有之優良廠商資格問題。</w:t>
       </w:r>
     </w:p>
     <w:p/>
@@ -7479,22 +9083,22 @@
           <w:b/>
           <w:sz w:val="24"/>
         </w:rPr>
-        <w:t>行政院公共工程委員會88年10月25日(88)工程企字第8817555號函</w:t>
-      </w:r>
-    </w:p>
-    <w:p>
-      <w:pPr>
-        <w:pStyle w:val="a9"/>
-        <w:ind w:left="720" w:hanging="720"/>
-        <w:jc w:val="both"/>
-      </w:pPr>
-      <w:r>
-        <w:rPr>
-          <w:rFonts w:ascii="新細明體" w:hAnsi="新細明體" w:eastAsia="新細明體"/>
-          <w:b w:val="0"/>
-          <w:sz w:val="24"/>
-        </w:rPr>
-        <w:t>主旨：關於貴中心函詢外國銀行得否為「押標金保證金暨其他擔保作業辦法」第七條規定銀行之各項擔保乙節，復如說明，請查照。</w:t>
+        <w:t>行政院公共工程委員會101年04月10日工程企字第10100102920號函</w:t>
+      </w:r>
+    </w:p>
+    <w:p>
+      <w:pPr>
+        <w:pStyle w:val="a9"/>
+        <w:ind w:left="720" w:hanging="720"/>
+        <w:jc w:val="both"/>
+      </w:pPr>
+      <w:r>
+        <w:rPr>
+          <w:rFonts w:ascii="新細明體" w:hAnsi="新細明體" w:eastAsia="新細明體"/>
+          <w:b w:val="0"/>
+          <w:sz w:val="24"/>
+        </w:rPr>
+        <w:t>主旨：廠商或其代表人、代理人、受雇人或其他從業人員參與政府採購，對公務員行求、期約或交付賄賂或其他不正利益者，茲依政府採購法（下稱本法）第31條第2項第8款認定該廠商有影響採購公正之違反法令行為，請查照並轉知所屬機關。</w:t>
       </w:r>
     </w:p>
     <w:p>
@@ -7524,37 +9128,52 @@
           <w:b w:val="0"/>
           <w:sz w:val="24"/>
         </w:rPr>
-        <w:t>一、復貴中心八十八年八月二十四日八十八人發秘字第Ｏ二二Ｏ六號函。</w:t>
-      </w:r>
-    </w:p>
-    <w:p>
-      <w:pPr>
-        <w:pStyle w:val="a9"/>
-        <w:ind w:left="720" w:hanging="480"/>
-        <w:jc w:val="both"/>
-      </w:pPr>
-      <w:r>
-        <w:rPr>
-          <w:rFonts w:ascii="新細明體" w:hAnsi="新細明體" w:eastAsia="新細明體"/>
-          <w:b w:val="0"/>
-          <w:sz w:val="24"/>
-        </w:rPr>
-        <w:t>二、依政府採購法第三十條及「押標金保證金暨其他擔保作業辦法」（以下簡稱本辦法）第二條所定「銀行」之意旨，外國銀行如符合銀行法第一百十六條「依照外國法律組織登記之銀行，經中華民國政府認許，在中華民國境內依公司法及本法登記營業之分行」之規定，且依同法第一百二十一條規定，於經中央銀行許可經營業務之範圍內，得為本辦法第七條規定銀行之各項擔保。</w:t>
-      </w:r>
-    </w:p>
-    <w:p>
-      <w:pPr>
-        <w:pStyle w:val="a9"/>
-        <w:ind w:left="720" w:hanging="720"/>
-        <w:jc w:val="both"/>
-      </w:pPr>
-      <w:r>
-        <w:rPr>
-          <w:rFonts w:ascii="新細明體" w:hAnsi="新細明體" w:eastAsia="新細明體"/>
-          <w:b w:val="0"/>
-          <w:sz w:val="24"/>
-        </w:rPr>
-        <w:t>備註：1. 108年4月17日總統修正公布之「銀行法」第116條規定：「本法稱外國銀行，謂依照外國法律組織登記之銀行，在中華民國境內依公司法及本法登記營業之分行。」</w:t>
+        <w:t>一、本法第31條第2項第8款規定：「機關得於招標文件中規定，廠商有下列情形之一者，其所繳納之押標金，不予發還，其已發還者，並予追繳︰...八、其他經主管機關認定有影響採購公正之違反法令行為者。」</w:t>
+      </w:r>
+    </w:p>
+    <w:p>
+      <w:pPr>
+        <w:pStyle w:val="a9"/>
+        <w:ind w:left="720" w:hanging="480"/>
+        <w:jc w:val="both"/>
+      </w:pPr>
+      <w:r>
+        <w:rPr>
+          <w:rFonts w:ascii="新細明體" w:hAnsi="新細明體" w:eastAsia="新細明體"/>
+          <w:b w:val="0"/>
+          <w:sz w:val="24"/>
+        </w:rPr>
+        <w:t>二、貪污治罪條例第11條第1項及100年6月29日修正公布增訂之第2項規定：「對於第二條人員，關於違背職務之行為，行求、期約或交付賄賂或其他不正利益者，處一年以上七年以下有期徒刑，得併科新臺幣三百萬元以下罰金（第1項）。對於第二條人員，關於不違背職務之行為，行求、期約或交付賄賂或其他不正利益者，處三年以下有期徒刑、拘役或科或併科新臺幣五十萬元以下罰金（第2項）。」</w:t>
+      </w:r>
+    </w:p>
+    <w:p>
+      <w:pPr>
+        <w:pStyle w:val="a9"/>
+        <w:ind w:left="960" w:hanging="960"/>
+        <w:jc w:val="both"/>
+      </w:pPr>
+      <w:r>
+        <w:rPr>
+          <w:rFonts w:ascii="新細明體" w:hAnsi="新細明體" w:eastAsia="新細明體"/>
+          <w:b w:val="0"/>
+          <w:sz w:val="24"/>
+        </w:rPr>
+        <w:t>備註：1. 政府採購法第31條第2項第8款「其他經主管機關認定有影響採購公正之違反法令行為」，本會已於104年7月17日以工程企字第10400225210號令發布。</w:t>
+      </w:r>
+    </w:p>
+    <w:p>
+      <w:pPr>
+        <w:pStyle w:val="a9"/>
+        <w:ind w:left="960" w:hanging="240"/>
+        <w:jc w:val="both"/>
+      </w:pPr>
+      <w:r>
+        <w:rPr>
+          <w:rFonts w:ascii="新細明體" w:hAnsi="新細明體" w:eastAsia="新細明體"/>
+          <w:b w:val="0"/>
+          <w:sz w:val="24"/>
+        </w:rPr>
+        <w:t>2. 本會111年12月23日工程企字第1110100798號令修正政府採購法公告金額為150萬元，及中央機關小額採購金額為15萬元，並自112年1月1日生效。</w:t>
       </w:r>
     </w:p>
     <w:p/>
@@ -7570,22 +9189,22 @@
           <w:b/>
           <w:sz w:val="24"/>
         </w:rPr>
-        <w:t>行政院公共工程委員會88年10月25日(88)工程企字第8817556號函</w:t>
-      </w:r>
-    </w:p>
-    <w:p>
-      <w:pPr>
-        <w:pStyle w:val="a9"/>
-        <w:ind w:left="720" w:hanging="720"/>
-        <w:jc w:val="both"/>
-      </w:pPr>
-      <w:r>
-        <w:rPr>
-          <w:rFonts w:ascii="新細明體" w:hAnsi="新細明體" w:eastAsia="新細明體"/>
-          <w:b w:val="0"/>
-          <w:sz w:val="24"/>
-        </w:rPr>
-        <w:t>主旨：關於貴府函詢外國銀行開立之本行本票、支票、設定質權之定期存單、開發或保兌之不可撤銷擔保信用狀或其書面保證，是否符合政府採購法第三十條規定之執行疑義，復如說明，請查照。</w:t>
+        <w:t>行政院公共工程委員會103年03月06日工程企字第10300065503號函</w:t>
+      </w:r>
+    </w:p>
+    <w:p>
+      <w:pPr>
+        <w:pStyle w:val="a9"/>
+        <w:ind w:left="720" w:hanging="720"/>
+        <w:jc w:val="both"/>
+      </w:pPr>
+      <w:r>
+        <w:rPr>
+          <w:rFonts w:ascii="新細明體" w:hAnsi="新細明體" w:eastAsia="新細明體"/>
+          <w:b w:val="0"/>
+          <w:sz w:val="24"/>
+        </w:rPr>
+        <w:t>主旨：「工程技術顧問業全球化廠商審定作業要點」業經本會於103年3月6日以工程技字第10300065500號令訂定發布，檢附發布令影本（含法規條文）乙份，請查照並轉知所屬（轄）機關。</w:t>
       </w:r>
     </w:p>
     <w:p>
@@ -7615,37 +9234,82 @@
           <w:b w:val="0"/>
           <w:sz w:val="24"/>
         </w:rPr>
-        <w:t>一、復貴府八十八年九月二十三日八八北府工公字第三六一七六六號函。</w:t>
-      </w:r>
-    </w:p>
-    <w:p>
-      <w:pPr>
-        <w:pStyle w:val="a9"/>
-        <w:ind w:left="720" w:hanging="480"/>
-        <w:jc w:val="both"/>
-      </w:pPr>
-      <w:r>
-        <w:rPr>
-          <w:rFonts w:ascii="新細明體" w:hAnsi="新細明體" w:eastAsia="新細明體"/>
-          <w:b w:val="0"/>
-          <w:sz w:val="24"/>
-        </w:rPr>
-        <w:t>二、依政府採購法第三十條及「押標金保證金暨其他擔保作業辦法」第二條所定「銀行」之意旨，外國銀行如符合銀行法第一百十六條「依照外國法律組織登記之銀行，經中華民國政府認許，在中華民國境內依公司法及本法登記營業之分行」之規定，且依同法第一百二十一條規定，於經中央銀行許可經營業務之範圍內，得依規定開立本行本票、支票、設定質權之定期存款單、開發或保兌之不可撤銷擔保信用狀或書面連帶保證，供廠商作為押標金、保證金之用。</w:t>
-      </w:r>
-    </w:p>
-    <w:p>
-      <w:pPr>
-        <w:pStyle w:val="a9"/>
-        <w:ind w:left="720" w:hanging="720"/>
-        <w:jc w:val="both"/>
-      </w:pPr>
-      <w:r>
-        <w:rPr>
-          <w:rFonts w:ascii="新細明體" w:hAnsi="新細明體" w:eastAsia="新細明體"/>
-          <w:b w:val="0"/>
-          <w:sz w:val="24"/>
-        </w:rPr>
-        <w:t>備註：1. 108年4月17日總統修正公布之「銀行法」第116條規定：「本法稱外國銀行，謂依照外國法律組織登記之銀行，在中華民國境內依公司法及本法登記營業之分行。」</w:t>
+        <w:t>一、配合執行押標金保證金暨其他擔保作業辦法第33條之6第2項規定，辦理工程技術顧問公司及技師事務所申請審定為全球化廠商，爰訂定旨揭要點，其要點如下：</w:t>
+      </w:r>
+    </w:p>
+    <w:p>
+      <w:pPr>
+        <w:pStyle w:val="a9"/>
+        <w:ind w:left="964" w:hanging="680"/>
+        <w:jc w:val="both"/>
+      </w:pPr>
+      <w:r>
+        <w:rPr>
+          <w:rFonts w:ascii="新細明體" w:hAnsi="新細明體" w:eastAsia="新細明體"/>
+          <w:b w:val="0"/>
+          <w:sz w:val="24"/>
+        </w:rPr>
+        <w:t>（一）明定工程技術顧問公司及技師事務所向本會申請為全球化廠商之適用條件及期限。</w:t>
+      </w:r>
+    </w:p>
+    <w:p>
+      <w:pPr>
+        <w:pStyle w:val="a9"/>
+        <w:ind w:left="964" w:hanging="680"/>
+        <w:jc w:val="both"/>
+      </w:pPr>
+      <w:r>
+        <w:rPr>
+          <w:rFonts w:ascii="新細明體" w:hAnsi="新細明體" w:eastAsia="新細明體"/>
+          <w:b w:val="0"/>
+          <w:sz w:val="24"/>
+        </w:rPr>
+        <w:t>（二）明定工程技術顧問公司及技師事務所向本會申請前，應先將得標我國以外之政府工程技術服務採購標案資訊，傳輸至本會「技師與工程技術顧問公司管理資訊系統」，並應檢附申請表及相關證明文件。</w:t>
+      </w:r>
+    </w:p>
+    <w:p>
+      <w:pPr>
+        <w:pStyle w:val="a9"/>
+        <w:ind w:left="964" w:hanging="680"/>
+        <w:jc w:val="both"/>
+      </w:pPr>
+      <w:r>
+        <w:rPr>
+          <w:rFonts w:ascii="新細明體" w:hAnsi="新細明體" w:eastAsia="新細明體"/>
+          <w:b w:val="0"/>
+          <w:sz w:val="24"/>
+        </w:rPr>
+        <w:t>（三）為利審查認定及登錄公告工程技術顧問業全球化廠商，明定工程技術顧問公司及技師事務所向本會申請全球化廠商應檢附申請表、「得標我國以外之政府採購標案」證明文件；證明文件為外文者，應檢附相關中文譯本。</w:t>
+      </w:r>
+    </w:p>
+    <w:p>
+      <w:pPr>
+        <w:pStyle w:val="a9"/>
+        <w:ind w:left="964" w:hanging="680"/>
+        <w:jc w:val="both"/>
+      </w:pPr>
+      <w:r>
+        <w:rPr>
+          <w:rFonts w:ascii="新細明體" w:hAnsi="新細明體" w:eastAsia="新細明體"/>
+          <w:b w:val="0"/>
+          <w:sz w:val="24"/>
+        </w:rPr>
+        <w:t>（四）明定本會審查期間及審查結果之通知、補正及取消全球化廠商資格情形。</w:t>
+      </w:r>
+    </w:p>
+    <w:p>
+      <w:pPr>
+        <w:pStyle w:val="a9"/>
+        <w:ind w:left="720" w:hanging="480"/>
+        <w:jc w:val="both"/>
+      </w:pPr>
+      <w:r>
+        <w:rPr>
+          <w:rFonts w:ascii="新細明體" w:hAnsi="新細明體" w:eastAsia="新細明體"/>
+          <w:b w:val="0"/>
+          <w:sz w:val="24"/>
+        </w:rPr>
+        <w:t>二、另依旨揭要點第5點第1款規定，訂定「工程技術顧問公司」申請審定為全球化廠商申請表及「技師事務所」申請審定為全球化廠商申請表。</w:t>
       </w:r>
     </w:p>
     <w:p/>
@@ -7661,22 +9325,204 @@
           <w:b/>
           <w:sz w:val="24"/>
         </w:rPr>
-        <w:t>行政院公共工程委員會89年01月05日(89)工程企字第88022788號函</w:t>
-      </w:r>
-    </w:p>
-    <w:p>
-      <w:pPr>
-        <w:pStyle w:val="a9"/>
-        <w:ind w:left="720" w:hanging="720"/>
-        <w:jc w:val="both"/>
-      </w:pPr>
-      <w:r>
-        <w:rPr>
-          <w:rFonts w:ascii="新細明體" w:hAnsi="新細明體" w:eastAsia="新細明體"/>
-          <w:b w:val="0"/>
-          <w:sz w:val="24"/>
-        </w:rPr>
-        <w:t>主旨：貴處函詢政府採購法(以下簡稱本法)適用疑義，復如說明，請查照。</w:t>
+        <w:t>行政院公共工程委員會104年07月17日工程企字第10400225210號令函</w:t>
+      </w:r>
+    </w:p>
+    <w:p>
+      <w:pPr>
+        <w:pStyle w:val="a9"/>
+        <w:ind w:left="720" w:hanging="720"/>
+        <w:jc w:val="both"/>
+      </w:pPr>
+      <w:r>
+        <w:rPr>
+          <w:rFonts w:ascii="新細明體" w:hAnsi="新細明體" w:eastAsia="新細明體"/>
+          <w:b w:val="0"/>
+          <w:sz w:val="24"/>
+        </w:rPr>
+        <w:t>機關辦理採購，廠商有下列情形之一者，依政府採購法第三十一條第二項第八款認定屬「其他經主管機關認定有影響採購公正之違反法令行為者」情形，並自即日生效：</w:t>
+      </w:r>
+    </w:p>
+    <w:p>
+      <w:pPr>
+        <w:pStyle w:val="a9"/>
+        <w:ind w:left="720" w:hanging="480"/>
+        <w:jc w:val="both"/>
+      </w:pPr>
+      <w:r>
+        <w:rPr>
+          <w:rFonts w:ascii="新細明體" w:hAnsi="新細明體" w:eastAsia="新細明體"/>
+          <w:b w:val="0"/>
+          <w:sz w:val="24"/>
+        </w:rPr>
+        <w:t>一、有政府採購法第四十八條第一項第二款之「足以影響採購公正之違法行為者」情形。</w:t>
+      </w:r>
+    </w:p>
+    <w:p>
+      <w:pPr>
+        <w:pStyle w:val="a9"/>
+        <w:ind w:left="720" w:hanging="480"/>
+        <w:jc w:val="both"/>
+      </w:pPr>
+      <w:r>
+        <w:rPr>
+          <w:rFonts w:ascii="新細明體" w:hAnsi="新細明體" w:eastAsia="新細明體"/>
+          <w:b w:val="0"/>
+          <w:sz w:val="24"/>
+        </w:rPr>
+        <w:t>二、有政府採購法第五十條第一項第三款至第五款、第七款情形之一。</w:t>
+      </w:r>
+    </w:p>
+    <w:p>
+      <w:pPr>
+        <w:pStyle w:val="a9"/>
+        <w:ind w:left="720" w:hanging="480"/>
+        <w:jc w:val="both"/>
+      </w:pPr>
+      <w:r>
+        <w:rPr>
+          <w:rFonts w:ascii="新細明體" w:hAnsi="新細明體" w:eastAsia="新細明體"/>
+          <w:b w:val="0"/>
+          <w:sz w:val="24"/>
+        </w:rPr>
+        <w:t>三、容許他人借用本人名義或證件參加投標。</w:t>
+      </w:r>
+    </w:p>
+    <w:p>
+      <w:pPr>
+        <w:pStyle w:val="a9"/>
+        <w:ind w:left="720" w:hanging="480"/>
+        <w:jc w:val="both"/>
+      </w:pPr>
+      <w:r>
+        <w:rPr>
+          <w:rFonts w:ascii="新細明體" w:hAnsi="新細明體" w:eastAsia="新細明體"/>
+          <w:b w:val="0"/>
+          <w:sz w:val="24"/>
+        </w:rPr>
+        <w:t>四、廠商或其代表人、代理人、受雇人或其他從業人員有政府採購法第八十七條各項構成要件事實之一。</w:t>
+      </w:r>
+    </w:p>
+    <w:p>
+      <w:pPr>
+        <w:pStyle w:val="a9"/>
+        <w:ind w:left="720" w:hanging="480"/>
+        <w:jc w:val="both"/>
+      </w:pPr>
+      <w:r>
+        <w:rPr>
+          <w:rFonts w:ascii="新細明體" w:hAnsi="新細明體" w:eastAsia="新細明體"/>
+          <w:b w:val="0"/>
+          <w:sz w:val="24"/>
+        </w:rPr>
+        <w:t>五、廠商或其代表人、代理人、受雇人或其他從業人員，就有關招標、審標、決標事項，對公務員行求、期約或交付賄賂或其他不正利益。</w:t>
+      </w:r>
+    </w:p>
+    <w:p>
+      <w:pPr>
+        <w:pStyle w:val="a9"/>
+        <w:ind w:left="960" w:hanging="960"/>
+        <w:jc w:val="both"/>
+      </w:pPr>
+      <w:r>
+        <w:rPr>
+          <w:rFonts w:ascii="新細明體" w:hAnsi="新細明體" w:eastAsia="新細明體"/>
+          <w:b w:val="0"/>
+          <w:sz w:val="24"/>
+        </w:rPr>
+        <w:t>備註：1. 108年5月22日總統華總一義字第10800049691號令公布修正政府採購法第31條，該條第2項第8款移列為第7款。另「依政府採購法第三十一條第二項第七款認定屬影響採購公正之違反法令行為」，業經本會108年9月16日工程企字第1080100733號令修正發布。</w:t>
+      </w:r>
+    </w:p>
+    <w:p>
+      <w:pPr>
+        <w:pStyle w:val="a9"/>
+        <w:ind w:left="960" w:hanging="240"/>
+        <w:jc w:val="both"/>
+      </w:pPr>
+      <w:r>
+        <w:rPr>
+          <w:rFonts w:ascii="新細明體" w:hAnsi="新細明體" w:eastAsia="新細明體"/>
+          <w:b w:val="0"/>
+          <w:sz w:val="24"/>
+        </w:rPr>
+        <w:t>2. 「依政府採購法第三十一條第二項第七款認定屬影響採購公正之違反法令行為」，本會業於114年7月10日工程企字第 1140100343號令修正發布。</w:t>
+      </w:r>
+    </w:p>
+    <w:p/>
+    <w:p>
+      <w:pPr>
+        <w:pStyle w:val="a9"/>
+        <w:ind w:left="720" w:hanging="720"/>
+        <w:jc w:val="both"/>
+      </w:pPr>
+      <w:r>
+        <w:rPr>
+          <w:rFonts w:ascii="微軟正黑體" w:hAnsi="微軟正黑體" w:eastAsia="微軟正黑體"/>
+          <w:b/>
+          <w:sz w:val="24"/>
+        </w:rPr>
+        <w:t>行政院公共工程委員會104年07月17日工程企字第10400225215號函</w:t>
+      </w:r>
+    </w:p>
+    <w:p>
+      <w:pPr>
+        <w:pStyle w:val="a9"/>
+        <w:ind w:left="720" w:hanging="720"/>
+        <w:jc w:val="both"/>
+      </w:pPr>
+      <w:r>
+        <w:rPr>
+          <w:rFonts w:ascii="新細明體" w:hAnsi="新細明體" w:eastAsia="新細明體"/>
+          <w:b w:val="0"/>
+          <w:sz w:val="24"/>
+        </w:rPr>
+        <w:t>主旨：「依政府採購法第三十一條第二項第八款認定屬影響採購公正之違反法令行為」業經本會於104年7月17日以工程企字第10400225210號令發布，茲檢送發布令影本乙份，請查照並轉知所屬（轄）機關。</w:t>
+      </w:r>
+    </w:p>
+    <w:p>
+      <w:pPr>
+        <w:pStyle w:val="a9"/>
+        <w:ind w:left="720" w:hanging="720"/>
+        <w:jc w:val="both"/>
+      </w:pPr>
+      <w:r>
+        <w:rPr>
+          <w:rFonts w:ascii="新細明體" w:hAnsi="新細明體" w:eastAsia="新細明體"/>
+          <w:b w:val="0"/>
+          <w:sz w:val="24"/>
+        </w:rPr>
+        <w:t>說明：旨揭令係彙整本會歷年依政府採購法第31條第2項第8款認定之行為。</w:t>
+      </w:r>
+    </w:p>
+    <w:p/>
+    <w:p>
+      <w:pPr>
+        <w:pStyle w:val="a9"/>
+        <w:ind w:left="720" w:hanging="720"/>
+        <w:jc w:val="both"/>
+      </w:pPr>
+      <w:r>
+        <w:rPr>
+          <w:rFonts w:ascii="微軟正黑體" w:hAnsi="微軟正黑體" w:eastAsia="微軟正黑體"/>
+          <w:b/>
+          <w:sz w:val="24"/>
+        </w:rPr>
+        <w:t>行政院公共工程委員會108年06月11日工程企字第1080100518號函</w:t>
+      </w:r>
+    </w:p>
+    <w:p>
+      <w:pPr>
+        <w:pStyle w:val="a9"/>
+        <w:ind w:left="720" w:hanging="720"/>
+        <w:jc w:val="both"/>
+      </w:pPr>
+      <w:r>
+        <w:rPr>
+          <w:rFonts w:ascii="新細明體" w:hAnsi="新細明體" w:eastAsia="新細明體"/>
+          <w:b w:val="0"/>
+          <w:sz w:val="24"/>
+        </w:rPr>
+        <w:t>主旨：為利廠商以電子化方式繳納押標金，本會將自108年7月1日起啟用政府電子採購網「線上繳納押標金」服務，機關後續招標作業詳如說明，請查照並轉知所屬機關。</w:t>
       </w:r>
     </w:p>
     <w:p>
@@ -7706,37 +9552,97 @@
           <w:b w:val="0"/>
           <w:sz w:val="24"/>
         </w:rPr>
-        <w:t>一、復貴處八十八年十二月二十七日(八八)處秘四字第三三四一七號函。</w:t>
-      </w:r>
-    </w:p>
-    <w:p>
-      <w:pPr>
-        <w:pStyle w:val="a9"/>
-        <w:ind w:left="720" w:hanging="480"/>
-        <w:jc w:val="both"/>
-      </w:pPr>
-      <w:r>
-        <w:rPr>
-          <w:rFonts w:ascii="新細明體" w:hAnsi="新細明體" w:eastAsia="新細明體"/>
-          <w:b w:val="0"/>
-          <w:sz w:val="24"/>
-        </w:rPr>
-        <w:t>二、關於來函說明一，機關於宣布保留決標時，仍應製作紀錄。其後於作成決標或廢標之決定時，得免另訂時間及地點公開為之。另依本法第五十二條第三項規定，決標時得不通知投標廠商到場，其結果應通知各投標廠商。</w:t>
-      </w:r>
-    </w:p>
-    <w:p>
-      <w:pPr>
-        <w:pStyle w:val="a9"/>
-        <w:ind w:left="720" w:hanging="480"/>
-        <w:jc w:val="both"/>
-      </w:pPr>
-      <w:r>
-        <w:rPr>
-          <w:rFonts w:ascii="新細明體" w:hAnsi="新細明體" w:eastAsia="新細明體"/>
-          <w:b w:val="0"/>
-          <w:sz w:val="24"/>
-        </w:rPr>
-        <w:t>三、關於來函說明二，廠商依本法第三十條及「押標金保證金暨其他擔保作業辦法」規定繳納押標金，機關是否辦理對保、對保之時機及辦理人員，由機關本於權責自行決定。至於廠商以銀行之書面連帶保證繳納押標金或履約保證金，其所使用之格式內容如有擅自增刪，是否影響保證書效力，宜視招標文件之規定及增刪內容而定。</w:t>
+        <w:t>一、按政府採購法第30條第2項規定略以：「押標金及保證金應由廠商以現金、金融機構簽發之本票或支票、......為之。」；押標金保證金暨其他擔保作業辦法第5條規定略以：「廠商得以本法第30條第2項規定之二種以上方式繳納押標金或保證金。...... 」，第11條規定略以：「廠商得將繳納押標金之單據附於下列投標文件檢送。但現金應繳納至指定之收受處所或金融機構帳號。......」，爰繳納押標金之方式，係由廠商選擇，合先敘明。</w:t>
+      </w:r>
+    </w:p>
+    <w:p>
+      <w:pPr>
+        <w:pStyle w:val="a9"/>
+        <w:ind w:left="720" w:hanging="480"/>
+        <w:jc w:val="both"/>
+      </w:pPr>
+      <w:r>
+        <w:rPr>
+          <w:rFonts w:ascii="新細明體" w:hAnsi="新細明體" w:eastAsia="新細明體"/>
+          <w:b w:val="0"/>
+          <w:sz w:val="24"/>
+        </w:rPr>
+        <w:t>二、經本會訪談廠商表示，繳納押標金時，廠商多需親至金融機構辦理，相當耗時且費力，希望能有便捷之電子化繳納方式。</w:t>
+      </w:r>
+    </w:p>
+    <w:p>
+      <w:pPr>
+        <w:pStyle w:val="a9"/>
+        <w:ind w:left="720" w:hanging="480"/>
+        <w:jc w:val="both"/>
+      </w:pPr>
+      <w:r>
+        <w:rPr>
+          <w:rFonts w:ascii="新細明體" w:hAnsi="新細明體" w:eastAsia="新細明體"/>
+          <w:b w:val="0"/>
+          <w:sz w:val="24"/>
+        </w:rPr>
+        <w:t>三、基上需求，本會業與台灣票據交換所合作，由政府電子採購網介接該所「金融業即時代收服務繳費平臺」(eFCS)，提供「線上繳納押標金」服務（下稱本服務，說明簡報如附件一），提供廠商於政府電子採購網線上即時繳納押標金；機關開標時可線上查詢及審查廠商繳納押標金情形之功能，以節省廠商及機關之人力與時間，並可減少錯誤。復本會自107年起，已就本服務陸續向機關及廠商說明逾20場次，各界皆認同其方式與效益，並希望本會儘速推動機關辦理。</w:t>
+      </w:r>
+    </w:p>
+    <w:p>
+      <w:pPr>
+        <w:pStyle w:val="a9"/>
+        <w:ind w:left="720" w:hanging="480"/>
+        <w:jc w:val="both"/>
+      </w:pPr>
+      <w:r>
+        <w:rPr>
+          <w:rFonts w:ascii="新細明體" w:hAnsi="新細明體" w:eastAsia="新細明體"/>
+          <w:b w:val="0"/>
+          <w:sz w:val="24"/>
+        </w:rPr>
+        <w:t>四、目前本服務介接eFCS之合作銀行包括臺灣銀行、臺灣土地銀行、彰化銀行、上海商業儲蓄銀行、台北富邦銀行、兆豐國際商業銀行、臺灣中小企業銀行、新光銀行、台新銀行計9家，爰各機關收受押標金之帳戶如屬前開9家合作銀行者，請於108年6月底前至政府電子採購網完成押標金收款帳戶設定；自108年7月1日起，有收取押標金者，請允許廠商線上繳納押標金，以利廠商參與政府採購。</w:t>
+      </w:r>
+    </w:p>
+    <w:p>
+      <w:pPr>
+        <w:pStyle w:val="a9"/>
+        <w:ind w:left="720" w:hanging="480"/>
+        <w:jc w:val="both"/>
+      </w:pPr>
+      <w:r>
+        <w:rPr>
+          <w:rFonts w:ascii="新細明體" w:hAnsi="新細明體" w:eastAsia="新細明體"/>
+          <w:b w:val="0"/>
+          <w:sz w:val="24"/>
+        </w:rPr>
+        <w:t>五、另配合本服務上線，「公開取得電子報價單」採購機制亦將同步擴大適用至須繳納押標金之案件，惟108年度達成率計算方式不變（如附件二），且目標維持為20%。</w:t>
+      </w:r>
+    </w:p>
+    <w:p>
+      <w:pPr>
+        <w:pStyle w:val="a9"/>
+        <w:ind w:left="720" w:hanging="480"/>
+        <w:jc w:val="both"/>
+      </w:pPr>
+      <w:r>
+        <w:rPr>
+          <w:rFonts w:ascii="新細明體" w:hAnsi="新細明體" w:eastAsia="新細明體"/>
+          <w:b w:val="0"/>
+          <w:sz w:val="24"/>
+        </w:rPr>
+        <w:t>六、有關本服務之系統操作問題，請多加利用政府電子採購網「首頁如何使用線上教學」瀏覽教學影片，或至「首頁下載專區系統使用手冊」下載系統使用手冊。如有其他系統操作問題，請逕洽政府電子採購網客服專線電話：0800-080512。</w:t>
+      </w:r>
+    </w:p>
+    <w:p>
+      <w:pPr>
+        <w:pStyle w:val="a9"/>
+        <w:ind w:left="720" w:hanging="480"/>
+        <w:jc w:val="both"/>
+      </w:pPr>
+      <w:r>
+        <w:rPr>
+          <w:rFonts w:ascii="新細明體" w:hAnsi="新細明體" w:eastAsia="新細明體"/>
+          <w:b w:val="0"/>
+          <w:sz w:val="24"/>
+        </w:rPr>
+        <w:t>七、本會將請政府電子採購網營運廠商（中華電信股份有限公司數據通信分公司）擇期辦理本服務之機關說明會，詳細資訊由該公司另函通知，屆時請各機關踴躍參加。</w:t>
       </w:r>
     </w:p>
     <w:p/>
@@ -7752,1313 +9658,6 @@
           <w:b/>
           <w:sz w:val="24"/>
         </w:rPr>
-        <w:t>行政院公共工程委員會89年01月19日(89)工程企字第89000318號函</w:t>
-      </w:r>
-    </w:p>
-    <w:p>
-      <w:pPr>
-        <w:pStyle w:val="a9"/>
-        <w:ind w:left="720" w:hanging="720"/>
-        <w:jc w:val="both"/>
-      </w:pPr>
-      <w:r>
-        <w:rPr>
-          <w:rFonts w:ascii="新細明體" w:hAnsi="新細明體" w:eastAsia="新細明體"/>
-          <w:b w:val="0"/>
-          <w:sz w:val="24"/>
-        </w:rPr>
-        <w:t>主旨：關於貴會辦理「中醫藥典籍電子資料庫計畫」招標，發現三家投標廠商之押標金本票連號乙案，其處理方式復如說明，請查照。</w:t>
-      </w:r>
-    </w:p>
-    <w:p>
-      <w:pPr>
-        <w:pStyle w:val="a9"/>
-        <w:ind w:left="720" w:hanging="720"/>
-        <w:jc w:val="both"/>
-      </w:pPr>
-      <w:r>
-        <w:rPr>
-          <w:rFonts w:ascii="新細明體" w:hAnsi="新細明體" w:eastAsia="新細明體"/>
-          <w:b w:val="0"/>
-          <w:sz w:val="24"/>
-        </w:rPr>
-        <w:t>說明：</w:t>
-      </w:r>
-    </w:p>
-    <w:p>
-      <w:pPr>
-        <w:pStyle w:val="a9"/>
-        <w:ind w:left="720" w:hanging="480"/>
-        <w:jc w:val="both"/>
-      </w:pPr>
-      <w:r>
-        <w:rPr>
-          <w:rFonts w:ascii="新細明體" w:hAnsi="新細明體" w:eastAsia="新細明體"/>
-          <w:b w:val="0"/>
-          <w:sz w:val="24"/>
-        </w:rPr>
-        <w:t>一、復貴會八十九年一月四日衛中會秘字第八〇八一三五三六號函。</w:t>
-      </w:r>
-    </w:p>
-    <w:p>
-      <w:pPr>
-        <w:pStyle w:val="a9"/>
-        <w:ind w:left="720" w:hanging="480"/>
-        <w:jc w:val="both"/>
-      </w:pPr>
-      <w:r>
-        <w:rPr>
-          <w:rFonts w:ascii="新細明體" w:hAnsi="新細明體" w:eastAsia="新細明體"/>
-          <w:b w:val="0"/>
-          <w:sz w:val="24"/>
-        </w:rPr>
-        <w:t>二、依來函說明一，三家投標廠商(龍捲風電腦公司、毅欣資訊有限公司、大人物管理顧問有限公司)之押標金為台灣銀行連號本票，且皆為大人物管理顧問有限公司於八十八年十二月九日向台灣銀行公館分行申請，如大人物管理顧問有限公司有政府採購法(以下簡稱本法)第三十一條第二項第二款之情形，應依招標文件規定不發還該三家廠商之押標金，其已發還者，並予追繳。如貴會發現該三家廠商有本法第四十八條第一項第二款或第五十條第一項第三款至五款情形之一，或其人員涉有犯本法第八十七條之罪者，茲依本法第三十一條第二項第八款規定，認定該等廠商有影響採購公正之違反法令行為，其押標金亦應不發還或追繳。</w:t>
-      </w:r>
-    </w:p>
-    <w:p>
-      <w:pPr>
-        <w:pStyle w:val="a9"/>
-        <w:ind w:left="720" w:hanging="480"/>
-        <w:jc w:val="both"/>
-      </w:pPr>
-      <w:r>
-        <w:rPr>
-          <w:rFonts w:ascii="新細明體" w:hAnsi="新細明體" w:eastAsia="新細明體"/>
-          <w:b w:val="0"/>
-          <w:sz w:val="24"/>
-        </w:rPr>
-        <w:t>三、來函說明二，貴會限制該三家廠商一年不得參與貴會任何採購招標案乙節，與本法第一百零一條至第一百零三條之規定不符，應改依第一百零一條規定，就所發現之情形，將其事實及理由通知廠商，並附記如未提出異議者，將刊登政府採購公報。</w:t>
-      </w:r>
-    </w:p>
-    <w:p>
-      <w:pPr>
-        <w:pStyle w:val="a9"/>
-        <w:ind w:left="720" w:hanging="480"/>
-        <w:jc w:val="both"/>
-      </w:pPr>
-      <w:r>
-        <w:rPr>
-          <w:rFonts w:ascii="新細明體" w:hAnsi="新細明體" w:eastAsia="新細明體"/>
-          <w:b w:val="0"/>
-          <w:sz w:val="24"/>
-        </w:rPr>
-        <w:t>四、至於是否依本法第八十七條規定處置，建請將相關事證移送檢調單位處理。</w:t>
-      </w:r>
-    </w:p>
-    <w:p>
-      <w:pPr>
-        <w:pStyle w:val="a9"/>
-        <w:ind w:left="960" w:hanging="960"/>
-        <w:jc w:val="both"/>
-      </w:pPr>
-      <w:r>
-        <w:rPr>
-          <w:rFonts w:ascii="新細明體" w:hAnsi="新細明體" w:eastAsia="新細明體"/>
-          <w:b w:val="0"/>
-          <w:sz w:val="24"/>
-        </w:rPr>
-        <w:t>備註：1. [備註]:說明二所述政府採購法第五十條第一項第五款規定「影響採購公正之違反法令行為」，經九十一年二月六日總統華總一義字第〇九一〇〇〇二五六一〇號令修正公布之條文，業移列為第五十條第一項第七款，並增列「其他」二字為「其他影響採購公正之違反法令行為」。政府採購法第31條第2項第8款「其他經主管機關認定有影響採購公正之違反法令行為」，本會另於104年7月17日以工程企字第10400225210號令發布。</w:t>
-      </w:r>
-    </w:p>
-    <w:p>
-      <w:pPr>
-        <w:pStyle w:val="a9"/>
-        <w:ind w:left="960" w:hanging="240"/>
-        <w:jc w:val="both"/>
-      </w:pPr>
-      <w:r>
-        <w:rPr>
-          <w:rFonts w:ascii="新細明體" w:hAnsi="新細明體" w:eastAsia="新細明體"/>
-          <w:b w:val="0"/>
-          <w:sz w:val="24"/>
-        </w:rPr>
-        <w:t>2. 108年5月22日總統華總一義字第10800049691號令公布修正政府採購法部分條文，其第31條第2項規定刪除「機關得於招標文件中規定」之文字，並將第31條第2項第8款修正為第31條第2項第7款。另「依政府採購法第31條第2項第7款認定屬影響採購公正之違反法令行為」，業經本會108年9月16日工程企字第1080100733號令修正發布。</w:t>
-      </w:r>
-    </w:p>
-    <w:p>
-      <w:pPr>
-        <w:pStyle w:val="a9"/>
-        <w:ind w:left="960" w:hanging="240"/>
-        <w:jc w:val="both"/>
-      </w:pPr>
-      <w:r>
-        <w:rPr>
-          <w:rFonts w:ascii="新細明體" w:hAnsi="新細明體" w:eastAsia="新細明體"/>
-          <w:b w:val="0"/>
-          <w:sz w:val="24"/>
-        </w:rPr>
-        <w:t>3. 政府採購法第31條第2項第8款「其他經主管機關認定有影響採購公正之違反法令行為」，本會已於104年7月17日以工程企字第10400225210號令發布。</w:t>
-      </w:r>
-    </w:p>
-    <w:p/>
-    <w:p>
-      <w:pPr>
-        <w:pStyle w:val="a9"/>
-        <w:ind w:left="720" w:hanging="720"/>
-        <w:jc w:val="both"/>
-      </w:pPr>
-      <w:r>
-        <w:rPr>
-          <w:rFonts w:ascii="微軟正黑體" w:hAnsi="微軟正黑體" w:eastAsia="微軟正黑體"/>
-          <w:b/>
-          <w:sz w:val="24"/>
-        </w:rPr>
-        <w:t>行政院公共工程委員會91年01月14日(91)工程企字第91001515號函</w:t>
-      </w:r>
-    </w:p>
-    <w:p>
-      <w:pPr>
-        <w:pStyle w:val="a9"/>
-        <w:ind w:left="720" w:hanging="720"/>
-        <w:jc w:val="both"/>
-      </w:pPr>
-      <w:r>
-        <w:rPr>
-          <w:rFonts w:ascii="新細明體" w:hAnsi="新細明體" w:eastAsia="新細明體"/>
-          <w:b w:val="0"/>
-          <w:sz w:val="24"/>
-        </w:rPr>
-        <w:t>主旨：有關貴鎮鎮立托兒所二、三樓增建工程（第三期）第七次公開招標，是否退還王記營造股份有限公司之押標金，請依投標須知第六十點規定本於權責自行核處，復請查照。</w:t>
-      </w:r>
-    </w:p>
-    <w:p>
-      <w:pPr>
-        <w:pStyle w:val="a9"/>
-        <w:ind w:left="720" w:hanging="720"/>
-        <w:jc w:val="both"/>
-      </w:pPr>
-      <w:r>
-        <w:rPr>
-          <w:rFonts w:ascii="新細明體" w:hAnsi="新細明體" w:eastAsia="新細明體"/>
-          <w:b w:val="0"/>
-          <w:sz w:val="24"/>
-        </w:rPr>
-        <w:t>說明：</w:t>
-      </w:r>
-    </w:p>
-    <w:p>
-      <w:pPr>
-        <w:pStyle w:val="a9"/>
-        <w:ind w:left="720" w:hanging="480"/>
-        <w:jc w:val="both"/>
-      </w:pPr>
-      <w:r>
-        <w:rPr>
-          <w:rFonts w:ascii="新細明體" w:hAnsi="新細明體" w:eastAsia="新細明體"/>
-          <w:b w:val="0"/>
-          <w:sz w:val="24"/>
-        </w:rPr>
-        <w:t>一、復貴公所九十一年一月八日（九一）鹿鎮建字第四０五號函。</w:t>
-      </w:r>
-    </w:p>
-    <w:p>
-      <w:pPr>
-        <w:pStyle w:val="a9"/>
-        <w:ind w:left="720" w:hanging="480"/>
-        <w:jc w:val="both"/>
-      </w:pPr>
-      <w:r>
-        <w:rPr>
-          <w:rFonts w:ascii="新細明體" w:hAnsi="新細明體" w:eastAsia="新細明體"/>
-          <w:b w:val="0"/>
-          <w:sz w:val="24"/>
-        </w:rPr>
-        <w:t>二、茲提供下列意見供參考：旨揭廠商於參與比減價格並減至新台幣二０七０萬元後表示不願意承包，建議依旨揭投標須知第六十點第（五）款不發還其押標金。</w:t>
-      </w:r>
-    </w:p>
-    <w:p>
-      <w:pPr>
-        <w:pStyle w:val="a9"/>
-        <w:ind w:left="720" w:hanging="480"/>
-        <w:jc w:val="both"/>
-      </w:pPr>
-      <w:r>
-        <w:rPr>
-          <w:rFonts w:ascii="新細明體" w:hAnsi="新細明體" w:eastAsia="新細明體"/>
-          <w:b w:val="0"/>
-          <w:sz w:val="24"/>
-        </w:rPr>
-        <w:t>三、另查貴公所辦理本案第四次至第六次招標時，均以投標廠商未達法定三家而予流標，不符本法第四十八條第二項規定，請檢討改進。</w:t>
-      </w:r>
-    </w:p>
-    <w:p/>
-    <w:p>
-      <w:pPr>
-        <w:pStyle w:val="a9"/>
-        <w:ind w:left="720" w:hanging="720"/>
-        <w:jc w:val="both"/>
-      </w:pPr>
-      <w:r>
-        <w:rPr>
-          <w:rFonts w:ascii="微軟正黑體" w:hAnsi="微軟正黑體" w:eastAsia="微軟正黑體"/>
-          <w:b/>
-          <w:sz w:val="24"/>
-        </w:rPr>
-        <w:t>行政院公共工程委員會91年02月08日(91)工程企字第91006199號令函</w:t>
-      </w:r>
-    </w:p>
-    <w:p>
-      <w:pPr>
-        <w:pStyle w:val="a9"/>
-        <w:ind w:left="720" w:hanging="720"/>
-        <w:jc w:val="both"/>
-      </w:pPr>
-      <w:r>
-        <w:rPr>
-          <w:rFonts w:ascii="新細明體" w:hAnsi="新細明體" w:eastAsia="新細明體"/>
-          <w:b w:val="0"/>
-          <w:sz w:val="24"/>
-        </w:rPr>
-        <w:t>廠商所繳押標金不予發還之情形，應以政府採購法第三十一條第二項規定為限，機關不得於招標文件中規定「得標廠商須於決標後一定期間內就原投標文件中之影本，檢送正本供查驗，逾期檢送者按日扣罰一定比例押標金」，以免牴觸上開條文之規定。</w:t>
-      </w:r>
-    </w:p>
-    <w:p/>
-    <w:p>
-      <w:pPr>
-        <w:pStyle w:val="a9"/>
-        <w:ind w:left="720" w:hanging="720"/>
-        <w:jc w:val="both"/>
-      </w:pPr>
-      <w:r>
-        <w:rPr>
-          <w:rFonts w:ascii="微軟正黑體" w:hAnsi="微軟正黑體" w:eastAsia="微軟正黑體"/>
-          <w:b/>
-          <w:sz w:val="24"/>
-        </w:rPr>
-        <w:t>財政部國庫署91年07月22日台庫1字第0910307998號函</w:t>
-      </w:r>
-    </w:p>
-    <w:p>
-      <w:pPr>
-        <w:pStyle w:val="a9"/>
-        <w:ind w:left="720" w:hanging="720"/>
-        <w:jc w:val="both"/>
-      </w:pPr>
-      <w:r>
-        <w:rPr>
-          <w:rFonts w:ascii="新細明體" w:hAnsi="新細明體" w:eastAsia="新細明體"/>
-          <w:b w:val="0"/>
-          <w:sz w:val="24"/>
-        </w:rPr>
-        <w:t>主旨：關於國立交通大學以國庫專戶存款支票繳納押標金一案，查國庫專戶存款支票，依最高法院民事判決六〇臺上一五四八號判例解釋，票據法上之支票，其付款人以銀錢業者或信用合作社為限，公庫支票之付款人為公庫，並非一般之銀錢業者或信用合作社，是公庫支票並非票據法上之支票，而僅為指示證券之一種。至是否符合政府採購法第三十條第三十條第二項得為押標金或保證金，仍請貴會以該法主管機關之立場審酌，請查照</w:t>
-      </w:r>
-    </w:p>
-    <w:p>
-      <w:pPr>
-        <w:pStyle w:val="a9"/>
-        <w:ind w:left="720" w:hanging="720"/>
-        <w:jc w:val="both"/>
-      </w:pPr>
-      <w:r>
-        <w:rPr>
-          <w:rFonts w:ascii="新細明體" w:hAnsi="新細明體" w:eastAsia="新細明體"/>
-          <w:b w:val="0"/>
-          <w:sz w:val="24"/>
-        </w:rPr>
-        <w:t>說明：依據財政部金融局九十一年七月十一日台融局（二）字第〇九一〇〇三一六六八號移文單移來貴會九十一年七月三日（九一）工程企傳字第一二八〇號傳真信函辦理。</w:t>
-      </w:r>
-    </w:p>
-    <w:p/>
-    <w:p>
-      <w:pPr>
-        <w:pStyle w:val="a9"/>
-        <w:ind w:left="720" w:hanging="720"/>
-        <w:jc w:val="both"/>
-      </w:pPr>
-      <w:r>
-        <w:rPr>
-          <w:rFonts w:ascii="微軟正黑體" w:hAnsi="微軟正黑體" w:eastAsia="微軟正黑體"/>
-          <w:b/>
-          <w:sz w:val="24"/>
-        </w:rPr>
-        <w:t>行政院公共工程委員會91年08月06日工程企字第09100334510號函</w:t>
-      </w:r>
-    </w:p>
-    <w:p>
-      <w:pPr>
-        <w:pStyle w:val="a9"/>
-        <w:ind w:left="720" w:hanging="720"/>
-        <w:jc w:val="both"/>
-      </w:pPr>
-      <w:r>
-        <w:rPr>
-          <w:rFonts w:ascii="新細明體" w:hAnsi="新細明體" w:eastAsia="新細明體"/>
-          <w:b w:val="0"/>
-          <w:sz w:val="24"/>
-        </w:rPr>
-        <w:t>主旨：檢送政府採購「電子押標金／電子保證金規格書(一‧一版)」之電子檔案已公開於本會全球資訊網網站（http://www.pcc.gov.tw/e_gpl），請查照。</w:t>
-      </w:r>
-    </w:p>
-    <w:p>
-      <w:pPr>
-        <w:pStyle w:val="a9"/>
-        <w:ind w:left="720" w:hanging="720"/>
-        <w:jc w:val="both"/>
-      </w:pPr>
-      <w:r>
-        <w:rPr>
-          <w:rFonts w:ascii="新細明體" w:hAnsi="新細明體" w:eastAsia="新細明體"/>
-          <w:b w:val="0"/>
-          <w:sz w:val="24"/>
-        </w:rPr>
-        <w:t>說明：</w:t>
-      </w:r>
-    </w:p>
-    <w:p>
-      <w:pPr>
-        <w:pStyle w:val="a9"/>
-        <w:ind w:left="720" w:hanging="480"/>
-        <w:jc w:val="both"/>
-      </w:pPr>
-      <w:r>
-        <w:rPr>
-          <w:rFonts w:ascii="新細明體" w:hAnsi="新細明體" w:eastAsia="新細明體"/>
-          <w:b w:val="0"/>
-          <w:sz w:val="24"/>
-        </w:rPr>
-        <w:t>一、依據「電子採購作業辦法」第十三條規定辦理，旨揭格式由主管機關公開於指定之資訊系統。</w:t>
-      </w:r>
-    </w:p>
-    <w:p>
-      <w:pPr>
-        <w:pStyle w:val="a9"/>
-        <w:ind w:left="720" w:hanging="480"/>
-        <w:jc w:val="both"/>
-      </w:pPr>
-      <w:r>
-        <w:rPr>
-          <w:rFonts w:ascii="新細明體" w:hAnsi="新細明體" w:eastAsia="新細明體"/>
-          <w:b w:val="0"/>
-          <w:sz w:val="24"/>
-        </w:rPr>
-        <w:t>二、旨揭電子押標金及電子保證金係配合本會「政府採購電子領投標系統」，由金融機構提供電子憑證，交由廠商於電子投標時使用，以符合政府採購法第三十條繳納押標金或第三十七條第二項廠商之財力資格連帶保證之規定。</w:t>
-      </w:r>
-    </w:p>
-    <w:p/>
-    <w:p>
-      <w:pPr>
-        <w:pStyle w:val="a9"/>
-        <w:ind w:left="720" w:hanging="720"/>
-        <w:jc w:val="both"/>
-      </w:pPr>
-      <w:r>
-        <w:rPr>
-          <w:rFonts w:ascii="微軟正黑體" w:hAnsi="微軟正黑體" w:eastAsia="微軟正黑體"/>
-          <w:b/>
-          <w:sz w:val="24"/>
-        </w:rPr>
-        <w:t>行政院公共工程委員會92年07月23日工程企字第09200305371號函</w:t>
-      </w:r>
-    </w:p>
-    <w:p>
-      <w:pPr>
-        <w:pStyle w:val="a9"/>
-        <w:ind w:left="720" w:hanging="720"/>
-        <w:jc w:val="both"/>
-      </w:pPr>
-      <w:r>
-        <w:rPr>
-          <w:rFonts w:ascii="新細明體" w:hAnsi="新細明體" w:eastAsia="新細明體"/>
-          <w:b w:val="0"/>
-          <w:sz w:val="24"/>
-        </w:rPr>
-        <w:t>主旨：「押標金／保證金連帶保證書格式」、「履約保證金／保固保證金連帶保證書格式」、「預付款還款保證連帶保證書格式」及「廠商資格履約及賠償連帶保證書格式」業經本會於九十二年七月二十三日以工程企字第０九二００三０五三七０號令修正發布，茲檢送發布令影本乙份如附件，請查照並轉知所屬（轄）機關。</w:t>
-      </w:r>
-    </w:p>
-    <w:p/>
-    <w:p>
-      <w:pPr>
-        <w:pStyle w:val="a9"/>
-        <w:ind w:left="720" w:hanging="720"/>
-        <w:jc w:val="both"/>
-      </w:pPr>
-      <w:r>
-        <w:rPr>
-          <w:rFonts w:ascii="微軟正黑體" w:hAnsi="微軟正黑體" w:eastAsia="微軟正黑體"/>
-          <w:b/>
-          <w:sz w:val="24"/>
-        </w:rPr>
-        <w:t>行政院公共工程委員會92年10月30日工程企字第09200443351號函</w:t>
-      </w:r>
-    </w:p>
-    <w:p>
-      <w:pPr>
-        <w:pStyle w:val="a9"/>
-        <w:ind w:left="720" w:hanging="720"/>
-        <w:jc w:val="both"/>
-      </w:pPr>
-      <w:r>
-        <w:rPr>
-          <w:rFonts w:ascii="新細明體" w:hAnsi="新細明體" w:eastAsia="新細明體"/>
-          <w:b w:val="0"/>
-          <w:sz w:val="24"/>
-        </w:rPr>
-        <w:t>主旨：「定期存款單質權設定申請書格式」、「定期存款單質權設定覆函格式」業經本會於九十二年十月三十日以工程企字０９２００４４３３５０號令修正發布，茲檢送發布令影本乙份如附件，請查照並轉知所屬（轄）機關。</w:t>
-      </w:r>
-    </w:p>
-    <w:p/>
-    <w:p>
-      <w:pPr>
-        <w:pStyle w:val="a9"/>
-        <w:ind w:left="720" w:hanging="720"/>
-        <w:jc w:val="both"/>
-      </w:pPr>
-      <w:r>
-        <w:rPr>
-          <w:rFonts w:ascii="微軟正黑體" w:hAnsi="微軟正黑體" w:eastAsia="微軟正黑體"/>
-          <w:b/>
-          <w:sz w:val="24"/>
-        </w:rPr>
-        <w:t>行政院公共工程委員會94年03月10日工程管字第09400079440號函</w:t>
-      </w:r>
-    </w:p>
-    <w:p>
-      <w:pPr>
-        <w:pStyle w:val="a9"/>
-        <w:ind w:left="720" w:hanging="720"/>
-        <w:jc w:val="both"/>
-      </w:pPr>
-      <w:r>
-        <w:rPr>
-          <w:rFonts w:ascii="新細明體" w:hAnsi="新細明體" w:eastAsia="新細明體"/>
-          <w:b w:val="0"/>
-          <w:sz w:val="24"/>
-        </w:rPr>
-        <w:t>主旨：請依「公共工程金質獎頒發作業要點」第9點規定辦理押標金或保證金之減收，並得於招標文件中規定繳納後方為金質獎得獎或入圍廠商者，不予減收，請查照並轉知所屬。</w:t>
-      </w:r>
-    </w:p>
-    <w:p>
-      <w:pPr>
-        <w:pStyle w:val="a9"/>
-        <w:ind w:left="720" w:hanging="720"/>
-        <w:jc w:val="both"/>
-      </w:pPr>
-      <w:r>
-        <w:rPr>
-          <w:rFonts w:ascii="新細明體" w:hAnsi="新細明體" w:eastAsia="新細明體"/>
-          <w:b w:val="0"/>
-          <w:sz w:val="24"/>
-        </w:rPr>
-        <w:t>說明：</w:t>
-      </w:r>
-    </w:p>
-    <w:p>
-      <w:pPr>
-        <w:pStyle w:val="a9"/>
-        <w:ind w:left="720" w:hanging="480"/>
-        <w:jc w:val="both"/>
-      </w:pPr>
-      <w:r>
-        <w:rPr>
-          <w:rFonts w:ascii="新細明體" w:hAnsi="新細明體" w:eastAsia="新細明體"/>
-          <w:b w:val="0"/>
-          <w:sz w:val="24"/>
-        </w:rPr>
-        <w:t>一、依榮民工程股份有限公司94年2月1日榮工業一字第0940001296號函及交通部鐵路改建工程局94年1月31日鐵工工字第0940000989號函辦理。</w:t>
-      </w:r>
-    </w:p>
-    <w:p>
-      <w:pPr>
-        <w:pStyle w:val="a9"/>
-        <w:ind w:left="720" w:hanging="480"/>
-        <w:jc w:val="both"/>
-      </w:pPr>
-      <w:r>
-        <w:rPr>
-          <w:rFonts w:ascii="新細明體" w:hAnsi="新細明體" w:eastAsia="新細明體"/>
-          <w:b w:val="0"/>
-          <w:sz w:val="24"/>
-        </w:rPr>
-        <w:t>二、依旨揭金質獎要點第9點第1項第1款第3目及第2款第3目規定，各機關得於招標文件中明訂對工程採購得獎廠商，自頒獎之次年1月1日起1年內；對工程採購入圍廠商，自頒獎之次年1月1日起半年內，其應繳納之押標金、履約保證金或保固保證金金額得予減收。減收額度於招標文件中載明，但以不逾原定應繳納總額之百分之五十為限。繳納後方為得獎或入圍廠商者，依招標文件規定適用之。查本會業以93年7月13日工程管字第09300273130號函及93年12月16日工程管字第09300476912號函，請各機關依上開獎勵規定辦理在案，諒達。</w:t>
-      </w:r>
-    </w:p>
-    <w:p>
-      <w:pPr>
-        <w:pStyle w:val="a9"/>
-        <w:ind w:left="720" w:hanging="480"/>
-        <w:jc w:val="both"/>
-      </w:pPr>
-      <w:r>
-        <w:rPr>
-          <w:rFonts w:ascii="新細明體" w:hAnsi="新細明體" w:eastAsia="新細明體"/>
-          <w:b w:val="0"/>
-          <w:sz w:val="24"/>
-        </w:rPr>
-        <w:t>三、有關第五屆公共工程金質獎得獎及入圍廠商名單業公告於政府採購公告資訊網站，請轉知所屬(轄)各工程主辦機關，依旨揭金質獎要點第9點獎勵規定辦理，並得於招標文件中規定繳納後方為金質獎得獎或入圍廠商者，不予減收押標金或保證金之優惠。</w:t>
-      </w:r>
-    </w:p>
-    <w:p/>
-    <w:p>
-      <w:pPr>
-        <w:pStyle w:val="a9"/>
-        <w:ind w:left="720" w:hanging="720"/>
-        <w:jc w:val="both"/>
-      </w:pPr>
-      <w:r>
-        <w:rPr>
-          <w:rFonts w:ascii="微軟正黑體" w:hAnsi="微軟正黑體" w:eastAsia="微軟正黑體"/>
-          <w:b/>
-          <w:sz w:val="24"/>
-        </w:rPr>
-        <w:t>行政院公共工程委員會95年07月26日工程企字第09500279830號函</w:t>
-      </w:r>
-    </w:p>
-    <w:p>
-      <w:pPr>
-        <w:pStyle w:val="a9"/>
-        <w:ind w:left="720" w:hanging="720"/>
-        <w:jc w:val="both"/>
-      </w:pPr>
-      <w:r>
-        <w:rPr>
-          <w:rFonts w:ascii="新細明體" w:hAnsi="新細明體" w:eastAsia="新細明體"/>
-          <w:b w:val="0"/>
-          <w:sz w:val="24"/>
-        </w:rPr>
-        <w:t>主旨：為利民間團體協助政府推動社會福利工作，各機關辦理限以身心障礙者、身心障礙福利機構及社福團體為投標對象之採購，建請考量其採購個案性質，依政府採購法（以下簡稱本法）第30條第1項規定免收取押標金、保證金，請查照。</w:t>
-      </w:r>
-    </w:p>
-    <w:p>
-      <w:pPr>
-        <w:pStyle w:val="a9"/>
-        <w:ind w:left="720" w:hanging="720"/>
-        <w:jc w:val="both"/>
-      </w:pPr>
-      <w:r>
-        <w:rPr>
-          <w:rFonts w:ascii="新細明體" w:hAnsi="新細明體" w:eastAsia="新細明體"/>
-          <w:b w:val="0"/>
-          <w:sz w:val="24"/>
-        </w:rPr>
-        <w:t>說明：</w:t>
-      </w:r>
-    </w:p>
-    <w:p>
-      <w:pPr>
-        <w:pStyle w:val="a9"/>
-        <w:ind w:left="720" w:hanging="480"/>
-        <w:jc w:val="both"/>
-      </w:pPr>
-      <w:r>
-        <w:rPr>
-          <w:rFonts w:ascii="新細明體" w:hAnsi="新細明體" w:eastAsia="新細明體"/>
-          <w:b w:val="0"/>
-          <w:sz w:val="24"/>
-        </w:rPr>
-        <w:t>一、依行政院社會福利推動委員會95年7月14日台院福推字第095008號函辦理。</w:t>
-      </w:r>
-    </w:p>
-    <w:p>
-      <w:pPr>
-        <w:pStyle w:val="a9"/>
-        <w:ind w:left="720" w:hanging="480"/>
-        <w:jc w:val="both"/>
-      </w:pPr>
-      <w:r>
-        <w:rPr>
-          <w:rFonts w:ascii="新細明體" w:hAnsi="新細明體" w:eastAsia="新細明體"/>
-          <w:b w:val="0"/>
-          <w:sz w:val="24"/>
-        </w:rPr>
-        <w:t>二、依政府採購法第30條第1項規定，機關辦理勞務採購（不限金額）、未達公告金額之財物採購，得免收取押標金、保證金；以議價方式辦理之採購，得免收取押標金。準此，針對限以身心障礙者、身心障礙福利機構及社福團體為投標對象（包括議、比價）之採購，機關可依上開規定於招標文件載明免收取押標金或保證金，以減少社福團體參與政府採購障礙。</w:t>
-      </w:r>
-    </w:p>
-    <w:p>
-      <w:pPr>
-        <w:pStyle w:val="a9"/>
-        <w:ind w:left="720" w:hanging="720"/>
-        <w:jc w:val="both"/>
-      </w:pPr>
-      <w:r>
-        <w:rPr>
-          <w:rFonts w:ascii="新細明體" w:hAnsi="新細明體" w:eastAsia="新細明體"/>
-          <w:b w:val="0"/>
-          <w:sz w:val="24"/>
-        </w:rPr>
-        <w:t>備註：1. 108年5月22日總統華總一義字第10800049691號令公布修正政府採購法部分條文，其第30條第1項第1款修正為：「勞務採購，以免收押標金、保證金為原則」。</w:t>
-      </w:r>
-    </w:p>
-    <w:p/>
-    <w:p>
-      <w:pPr>
-        <w:pStyle w:val="a9"/>
-        <w:ind w:left="720" w:hanging="720"/>
-        <w:jc w:val="both"/>
-      </w:pPr>
-      <w:r>
-        <w:rPr>
-          <w:rFonts w:ascii="微軟正黑體" w:hAnsi="微軟正黑體" w:eastAsia="微軟正黑體"/>
-          <w:b/>
-          <w:sz w:val="24"/>
-        </w:rPr>
-        <w:t>行政院公共工程委員會95年12月21日工程企字第09500499370號函</w:t>
-      </w:r>
-    </w:p>
-    <w:p>
-      <w:pPr>
-        <w:pStyle w:val="a9"/>
-        <w:ind w:left="720" w:hanging="720"/>
-        <w:jc w:val="both"/>
-      </w:pPr>
-      <w:r>
-        <w:rPr>
-          <w:rFonts w:ascii="新細明體" w:hAnsi="新細明體" w:eastAsia="新細明體"/>
-          <w:b w:val="0"/>
-          <w:sz w:val="24"/>
-        </w:rPr>
-        <w:t>主旨：檢送本會95年12月18日「研商以國（公）庫支票及國庫專戶存款支票繳納押標金保證金之適法性問題」會議紀錄乙份，請查照。</w:t>
-      </w:r>
-    </w:p>
-    <w:p/>
-    <w:p>
-      <w:pPr>
-        <w:pStyle w:val="a9"/>
-        <w:ind w:left="720" w:hanging="720"/>
-        <w:jc w:val="both"/>
-      </w:pPr>
-      <w:r>
-        <w:rPr>
-          <w:rFonts w:ascii="微軟正黑體" w:hAnsi="微軟正黑體" w:eastAsia="微軟正黑體"/>
-          <w:b/>
-          <w:sz w:val="24"/>
-        </w:rPr>
-        <w:t>行政院公共工程委員會96年03月22日工程企字第09600114640號函</w:t>
-      </w:r>
-    </w:p>
-    <w:p>
-      <w:pPr>
-        <w:pStyle w:val="a9"/>
-        <w:ind w:left="720" w:hanging="720"/>
-        <w:jc w:val="both"/>
-      </w:pPr>
-      <w:r>
-        <w:rPr>
-          <w:rFonts w:ascii="新細明體" w:hAnsi="新細明體" w:eastAsia="新細明體"/>
-          <w:b w:val="0"/>
-          <w:sz w:val="24"/>
-        </w:rPr>
-        <w:t>主旨：為健全履約保證金之效力，機關得視個案情形及實際需要於招標文件中規定如說明，請查照並轉知所屬（轄）機關（構）。</w:t>
-      </w:r>
-    </w:p>
-    <w:p>
-      <w:pPr>
-        <w:pStyle w:val="a9"/>
-        <w:ind w:left="720" w:hanging="720"/>
-        <w:jc w:val="both"/>
-      </w:pPr>
-      <w:r>
-        <w:rPr>
-          <w:rFonts w:ascii="新細明體" w:hAnsi="新細明體" w:eastAsia="新細明體"/>
-          <w:b w:val="0"/>
-          <w:sz w:val="24"/>
-        </w:rPr>
-        <w:t>說明：機關依契約規定有不發還廠商履約保證金情形，為免廠商之書面連帶保證銀行推諉拖延拒不付款，致機關必須提出訴訟請求，造成機關人力、物力浪費，並防杜銀行、廠商藉興訟拖延付款時日之行為，機關得視個案情形及實際需要於招標文件中規定：「廠商如以銀行之書面連帶保證或開發或保兌之不可撤銷擔保信用狀繳納履約保證金者，機關得視該銀行之債信、過去履行連帶保證之紀錄等，經機關審核後始予接受。廠商以押標金轉換為履約保證金時，亦同。」。</w:t>
-      </w:r>
-    </w:p>
-    <w:p/>
-    <w:p>
-      <w:pPr>
-        <w:pStyle w:val="a9"/>
-        <w:ind w:left="720" w:hanging="720"/>
-        <w:jc w:val="both"/>
-      </w:pPr>
-      <w:r>
-        <w:rPr>
-          <w:rFonts w:ascii="微軟正黑體" w:hAnsi="微軟正黑體" w:eastAsia="微軟正黑體"/>
-          <w:b/>
-          <w:sz w:val="24"/>
-        </w:rPr>
-        <w:t>行政院公共工程委員會99年02月12日工程企字第09800574960號函</w:t>
-      </w:r>
-    </w:p>
-    <w:p>
-      <w:pPr>
-        <w:pStyle w:val="a9"/>
-        <w:ind w:left="720" w:hanging="720"/>
-        <w:jc w:val="both"/>
-      </w:pPr>
-      <w:r>
-        <w:rPr>
-          <w:rFonts w:ascii="新細明體" w:hAnsi="新細明體" w:eastAsia="新細明體"/>
-          <w:b w:val="0"/>
-          <w:sz w:val="24"/>
-        </w:rPr>
-        <w:t>主旨：貴公司函詢得否繼受榮民工程股份有限公司（下稱榮民公司）既有之優良廠商資格參與政府採購案件乙節，復如說明，請查照。</w:t>
-      </w:r>
-    </w:p>
-    <w:p>
-      <w:pPr>
-        <w:pStyle w:val="a9"/>
-        <w:ind w:left="720" w:hanging="720"/>
-        <w:jc w:val="both"/>
-      </w:pPr>
-      <w:r>
-        <w:rPr>
-          <w:rFonts w:ascii="新細明體" w:hAnsi="新細明體" w:eastAsia="新細明體"/>
-          <w:b w:val="0"/>
-          <w:sz w:val="24"/>
-        </w:rPr>
-        <w:t>說明：</w:t>
-      </w:r>
-    </w:p>
-    <w:p>
-      <w:pPr>
-        <w:pStyle w:val="a9"/>
-        <w:ind w:left="720" w:hanging="480"/>
-        <w:jc w:val="both"/>
-      </w:pPr>
-      <w:r>
-        <w:rPr>
-          <w:rFonts w:ascii="新細明體" w:hAnsi="新細明體" w:eastAsia="新細明體"/>
-          <w:b w:val="0"/>
-          <w:sz w:val="24"/>
-        </w:rPr>
-        <w:t>一、復貴公司98年12月28日（2009）榮工字第0090號函。</w:t>
-      </w:r>
-    </w:p>
-    <w:p>
-      <w:pPr>
-        <w:pStyle w:val="a9"/>
-        <w:ind w:left="720" w:hanging="480"/>
-        <w:jc w:val="both"/>
-      </w:pPr>
-      <w:r>
-        <w:rPr>
-          <w:rFonts w:ascii="新細明體" w:hAnsi="新細明體" w:eastAsia="新細明體"/>
-          <w:b w:val="0"/>
-          <w:sz w:val="24"/>
-        </w:rPr>
-        <w:t>二、茲提供下列意見供參考：</w:t>
-      </w:r>
-    </w:p>
-    <w:p>
-      <w:pPr>
-        <w:pStyle w:val="a9"/>
-        <w:ind w:left="964" w:hanging="680"/>
-        <w:jc w:val="both"/>
-      </w:pPr>
-      <w:r>
-        <w:rPr>
-          <w:rFonts w:ascii="新細明體" w:hAnsi="新細明體" w:eastAsia="新細明體"/>
-          <w:b w:val="0"/>
-          <w:sz w:val="24"/>
-        </w:rPr>
-        <w:t>（一）「押標金保證金暨其他擔保作業辦法」第33條之5第2項規定「前項優良廠商，指經主管機關或相關中央目的事業主管機關依履約成果等評為優良，並經主管機關認定而於指定之資料庫公告，且在獎勵期間內者」。</w:t>
-      </w:r>
-    </w:p>
-    <w:p>
-      <w:pPr>
-        <w:pStyle w:val="a9"/>
-        <w:ind w:left="964" w:hanging="680"/>
-        <w:jc w:val="both"/>
-      </w:pPr>
-      <w:r>
-        <w:rPr>
-          <w:rFonts w:ascii="新細明體" w:hAnsi="新細明體" w:eastAsia="新細明體"/>
-          <w:b w:val="0"/>
-          <w:sz w:val="24"/>
-        </w:rPr>
-        <w:t>（二）來函所述榮民公司仍然存在，原經相關中央目的事業主管機關依履約成果等評為優良之對象為榮民公司，榮民公司之履約成果亦難謂係貴公司之履約成果，自不生繼受榮民公司既有之優良廠商資格問題。</w:t>
-      </w:r>
-    </w:p>
-    <w:p/>
-    <w:p>
-      <w:pPr>
-        <w:pStyle w:val="a9"/>
-        <w:ind w:left="720" w:hanging="720"/>
-        <w:jc w:val="both"/>
-      </w:pPr>
-      <w:r>
-        <w:rPr>
-          <w:rFonts w:ascii="微軟正黑體" w:hAnsi="微軟正黑體" w:eastAsia="微軟正黑體"/>
-          <w:b/>
-          <w:sz w:val="24"/>
-        </w:rPr>
-        <w:t>行政院公共工程委員會101年04月10日工程企字第10100102920號函</w:t>
-      </w:r>
-    </w:p>
-    <w:p>
-      <w:pPr>
-        <w:pStyle w:val="a9"/>
-        <w:ind w:left="720" w:hanging="720"/>
-        <w:jc w:val="both"/>
-      </w:pPr>
-      <w:r>
-        <w:rPr>
-          <w:rFonts w:ascii="新細明體" w:hAnsi="新細明體" w:eastAsia="新細明體"/>
-          <w:b w:val="0"/>
-          <w:sz w:val="24"/>
-        </w:rPr>
-        <w:t>主旨：廠商或其代表人、代理人、受雇人或其他從業人員參與政府採購，對公務員行求、期約或交付賄賂或其他不正利益者，茲依政府採購法（下稱本法）第31條第2項第8款認定該廠商有影響採購公正之違反法令行為，請查照並轉知所屬機關。</w:t>
-      </w:r>
-    </w:p>
-    <w:p>
-      <w:pPr>
-        <w:pStyle w:val="a9"/>
-        <w:ind w:left="720" w:hanging="720"/>
-        <w:jc w:val="both"/>
-      </w:pPr>
-      <w:r>
-        <w:rPr>
-          <w:rFonts w:ascii="新細明體" w:hAnsi="新細明體" w:eastAsia="新細明體"/>
-          <w:b w:val="0"/>
-          <w:sz w:val="24"/>
-        </w:rPr>
-        <w:t>說明：</w:t>
-      </w:r>
-    </w:p>
-    <w:p>
-      <w:pPr>
-        <w:pStyle w:val="a9"/>
-        <w:ind w:left="720" w:hanging="480"/>
-        <w:jc w:val="both"/>
-      </w:pPr>
-      <w:r>
-        <w:rPr>
-          <w:rFonts w:ascii="新細明體" w:hAnsi="新細明體" w:eastAsia="新細明體"/>
-          <w:b w:val="0"/>
-          <w:sz w:val="24"/>
-        </w:rPr>
-        <w:t>一、本法第31條第2項第8款規定：「機關得於招標文件中規定，廠商有下列情形之一者，其所繳納之押標金，不予發還，其已發還者，並予追繳︰...八、其他經主管機關認定有影響採購公正之違反法令行為者。」</w:t>
-      </w:r>
-    </w:p>
-    <w:p>
-      <w:pPr>
-        <w:pStyle w:val="a9"/>
-        <w:ind w:left="720" w:hanging="480"/>
-        <w:jc w:val="both"/>
-      </w:pPr>
-      <w:r>
-        <w:rPr>
-          <w:rFonts w:ascii="新細明體" w:hAnsi="新細明體" w:eastAsia="新細明體"/>
-          <w:b w:val="0"/>
-          <w:sz w:val="24"/>
-        </w:rPr>
-        <w:t>二、貪污治罪條例第11條第1項及100年6月29日修正公布增訂之第2項規定：「對於第二條人員，關於違背職務之行為，行求、期約或交付賄賂或其他不正利益者，處一年以上七年以下有期徒刑，得併科新臺幣三百萬元以下罰金（第1項）。對於第二條人員，關於不違背職務之行為，行求、期約或交付賄賂或其他不正利益者，處三年以下有期徒刑、拘役或科或併科新臺幣五十萬元以下罰金（第2項）。」</w:t>
-      </w:r>
-    </w:p>
-    <w:p>
-      <w:pPr>
-        <w:pStyle w:val="a9"/>
-        <w:ind w:left="960" w:hanging="960"/>
-        <w:jc w:val="both"/>
-      </w:pPr>
-      <w:r>
-        <w:rPr>
-          <w:rFonts w:ascii="新細明體" w:hAnsi="新細明體" w:eastAsia="新細明體"/>
-          <w:b w:val="0"/>
-          <w:sz w:val="24"/>
-        </w:rPr>
-        <w:t>備註：1. 政府採購法第31條第2項第8款「其他經主管機關認定有影響採購公正之違反法令行為」，本會已於104年7月17日以工程企字第10400225210號令發布。</w:t>
-      </w:r>
-    </w:p>
-    <w:p>
-      <w:pPr>
-        <w:pStyle w:val="a9"/>
-        <w:ind w:left="960" w:hanging="240"/>
-        <w:jc w:val="both"/>
-      </w:pPr>
-      <w:r>
-        <w:rPr>
-          <w:rFonts w:ascii="新細明體" w:hAnsi="新細明體" w:eastAsia="新細明體"/>
-          <w:b w:val="0"/>
-          <w:sz w:val="24"/>
-        </w:rPr>
-        <w:t>2. 本會111年12月23日工程企字第1110100798號令修正政府採購法公告金額為150萬元，及中央機關小額採購金額為15萬元，並自112年1月1日生效。</w:t>
-      </w:r>
-    </w:p>
-    <w:p/>
-    <w:p>
-      <w:pPr>
-        <w:pStyle w:val="a9"/>
-        <w:ind w:left="720" w:hanging="720"/>
-        <w:jc w:val="both"/>
-      </w:pPr>
-      <w:r>
-        <w:rPr>
-          <w:rFonts w:ascii="微軟正黑體" w:hAnsi="微軟正黑體" w:eastAsia="微軟正黑體"/>
-          <w:b/>
-          <w:sz w:val="24"/>
-        </w:rPr>
-        <w:t>行政院公共工程委員會103年03月06日工程企字第10300065503號函</w:t>
-      </w:r>
-    </w:p>
-    <w:p>
-      <w:pPr>
-        <w:pStyle w:val="a9"/>
-        <w:ind w:left="720" w:hanging="720"/>
-        <w:jc w:val="both"/>
-      </w:pPr>
-      <w:r>
-        <w:rPr>
-          <w:rFonts w:ascii="新細明體" w:hAnsi="新細明體" w:eastAsia="新細明體"/>
-          <w:b w:val="0"/>
-          <w:sz w:val="24"/>
-        </w:rPr>
-        <w:t>主旨：「工程技術顧問業全球化廠商審定作業要點」業經本會於103年3月6日以工程技字第10300065500號令訂定發布，檢附發布令影本（含法規條文）乙份，請查照並轉知所屬（轄）機關。</w:t>
-      </w:r>
-    </w:p>
-    <w:p>
-      <w:pPr>
-        <w:pStyle w:val="a9"/>
-        <w:ind w:left="720" w:hanging="720"/>
-        <w:jc w:val="both"/>
-      </w:pPr>
-      <w:r>
-        <w:rPr>
-          <w:rFonts w:ascii="新細明體" w:hAnsi="新細明體" w:eastAsia="新細明體"/>
-          <w:b w:val="0"/>
-          <w:sz w:val="24"/>
-        </w:rPr>
-        <w:t>說明：</w:t>
-      </w:r>
-    </w:p>
-    <w:p>
-      <w:pPr>
-        <w:pStyle w:val="a9"/>
-        <w:ind w:left="720" w:hanging="480"/>
-        <w:jc w:val="both"/>
-      </w:pPr>
-      <w:r>
-        <w:rPr>
-          <w:rFonts w:ascii="新細明體" w:hAnsi="新細明體" w:eastAsia="新細明體"/>
-          <w:b w:val="0"/>
-          <w:sz w:val="24"/>
-        </w:rPr>
-        <w:t>一、配合執行押標金保證金暨其他擔保作業辦法第33條之6第2項規定，辦理工程技術顧問公司及技師事務所申請審定為全球化廠商，爰訂定旨揭要點，其要點如下：</w:t>
-      </w:r>
-    </w:p>
-    <w:p>
-      <w:pPr>
-        <w:pStyle w:val="a9"/>
-        <w:ind w:left="964" w:hanging="680"/>
-        <w:jc w:val="both"/>
-      </w:pPr>
-      <w:r>
-        <w:rPr>
-          <w:rFonts w:ascii="新細明體" w:hAnsi="新細明體" w:eastAsia="新細明體"/>
-          <w:b w:val="0"/>
-          <w:sz w:val="24"/>
-        </w:rPr>
-        <w:t>（一）明定工程技術顧問公司及技師事務所向本會申請為全球化廠商之適用條件及期限。</w:t>
-      </w:r>
-    </w:p>
-    <w:p>
-      <w:pPr>
-        <w:pStyle w:val="a9"/>
-        <w:ind w:left="964" w:hanging="680"/>
-        <w:jc w:val="both"/>
-      </w:pPr>
-      <w:r>
-        <w:rPr>
-          <w:rFonts w:ascii="新細明體" w:hAnsi="新細明體" w:eastAsia="新細明體"/>
-          <w:b w:val="0"/>
-          <w:sz w:val="24"/>
-        </w:rPr>
-        <w:t>（二）明定工程技術顧問公司及技師事務所向本會申請前，應先將得標我國以外之政府工程技術服務採購標案資訊，傳輸至本會「技師與工程技術顧問公司管理資訊系統」，並應檢附申請表及相關證明文件。</w:t>
-      </w:r>
-    </w:p>
-    <w:p>
-      <w:pPr>
-        <w:pStyle w:val="a9"/>
-        <w:ind w:left="964" w:hanging="680"/>
-        <w:jc w:val="both"/>
-      </w:pPr>
-      <w:r>
-        <w:rPr>
-          <w:rFonts w:ascii="新細明體" w:hAnsi="新細明體" w:eastAsia="新細明體"/>
-          <w:b w:val="0"/>
-          <w:sz w:val="24"/>
-        </w:rPr>
-        <w:t>（三）為利審查認定及登錄公告工程技術顧問業全球化廠商，明定工程技術顧問公司及技師事務所向本會申請全球化廠商應檢附申請表、「得標我國以外之政府採購標案」證明文件；證明文件為外文者，應檢附相關中文譯本。</w:t>
-      </w:r>
-    </w:p>
-    <w:p>
-      <w:pPr>
-        <w:pStyle w:val="a9"/>
-        <w:ind w:left="964" w:hanging="680"/>
-        <w:jc w:val="both"/>
-      </w:pPr>
-      <w:r>
-        <w:rPr>
-          <w:rFonts w:ascii="新細明體" w:hAnsi="新細明體" w:eastAsia="新細明體"/>
-          <w:b w:val="0"/>
-          <w:sz w:val="24"/>
-        </w:rPr>
-        <w:t>（四）明定本會審查期間及審查結果之通知、補正及取消全球化廠商資格情形。</w:t>
-      </w:r>
-    </w:p>
-    <w:p>
-      <w:pPr>
-        <w:pStyle w:val="a9"/>
-        <w:ind w:left="720" w:hanging="480"/>
-        <w:jc w:val="both"/>
-      </w:pPr>
-      <w:r>
-        <w:rPr>
-          <w:rFonts w:ascii="新細明體" w:hAnsi="新細明體" w:eastAsia="新細明體"/>
-          <w:b w:val="0"/>
-          <w:sz w:val="24"/>
-        </w:rPr>
-        <w:t>二、另依旨揭要點第5點第1款規定，訂定「工程技術顧問公司」申請審定為全球化廠商申請表及「技師事務所」申請審定為全球化廠商申請表。</w:t>
-      </w:r>
-    </w:p>
-    <w:p/>
-    <w:p>
-      <w:pPr>
-        <w:pStyle w:val="a9"/>
-        <w:ind w:left="720" w:hanging="720"/>
-        <w:jc w:val="both"/>
-      </w:pPr>
-      <w:r>
-        <w:rPr>
-          <w:rFonts w:ascii="微軟正黑體" w:hAnsi="微軟正黑體" w:eastAsia="微軟正黑體"/>
-          <w:b/>
-          <w:sz w:val="24"/>
-        </w:rPr>
-        <w:t>行政院公共工程委員會104年07月17日工程企字第10400225210號令函</w:t>
-      </w:r>
-    </w:p>
-    <w:p>
-      <w:pPr>
-        <w:pStyle w:val="a9"/>
-        <w:ind w:left="720" w:hanging="720"/>
-        <w:jc w:val="both"/>
-      </w:pPr>
-      <w:r>
-        <w:rPr>
-          <w:rFonts w:ascii="新細明體" w:hAnsi="新細明體" w:eastAsia="新細明體"/>
-          <w:b w:val="0"/>
-          <w:sz w:val="24"/>
-        </w:rPr>
-        <w:t>機關辦理採購，廠商有下列情形之一者，依政府採購法第三十一條第二項第八款認定屬「其他經主管機關認定有影響採購公正之違反法令行為者」情形，並自即日生效：一、有政府採購法第四十八條第一項第二款之「足以影響採購公正之違法行為者」情形。二、有政府採購法第五十條第一項第三款至第五款、第七款情形之一。三、容許他人借用本人名義或證件參加投標。四、廠商或其代表人、代理人、受雇人或其他從業人員有政府採購法第八十七條各項構成要件事實之一。五、廠商或其代表人、代理人、受雇人或其他從業人員，就有關招標、審標、決標事項，對公務員行求、期約或交付賄賂或其他不正利益。</w:t>
-      </w:r>
-    </w:p>
-    <w:p>
-      <w:pPr>
-        <w:pStyle w:val="a9"/>
-        <w:ind w:left="960" w:hanging="960"/>
-        <w:jc w:val="both"/>
-      </w:pPr>
-      <w:r>
-        <w:rPr>
-          <w:rFonts w:ascii="新細明體" w:hAnsi="新細明體" w:eastAsia="新細明體"/>
-          <w:b w:val="0"/>
-          <w:sz w:val="24"/>
-        </w:rPr>
-        <w:t>備註：1. 一、108年5月22日總統華總一義字第10800049691號令公布修正政府採購法第31條，該條第2項第8款移列為第7款。另「依政府採購法第三十一條第二項第七款認定屬影響採購公正之違反法令行為」，業經本會108年9月16日工程企字第1080100733號令修正發布。</w:t>
-      </w:r>
-    </w:p>
-    <w:p>
-      <w:pPr>
-        <w:pStyle w:val="a9"/>
-        <w:ind w:left="960" w:hanging="240"/>
-        <w:jc w:val="both"/>
-      </w:pPr>
-      <w:r>
-        <w:rPr>
-          <w:rFonts w:ascii="新細明體" w:hAnsi="新細明體" w:eastAsia="新細明體"/>
-          <w:b w:val="0"/>
-          <w:sz w:val="24"/>
-        </w:rPr>
-        <w:t>2. 二、「依政府採購法第三十一條第二項第七款認定屬影響採購公正之違反法令行為」，本會業於114年7月10日工程企字第 1140100343號令修正發布。</w:t>
-      </w:r>
-    </w:p>
-    <w:p/>
-    <w:p>
-      <w:pPr>
-        <w:pStyle w:val="a9"/>
-        <w:ind w:left="720" w:hanging="720"/>
-        <w:jc w:val="both"/>
-      </w:pPr>
-      <w:r>
-        <w:rPr>
-          <w:rFonts w:ascii="微軟正黑體" w:hAnsi="微軟正黑體" w:eastAsia="微軟正黑體"/>
-          <w:b/>
-          <w:sz w:val="24"/>
-        </w:rPr>
-        <w:t>行政院公共工程委員會104年07月17日工程企字第10400225215號函</w:t>
-      </w:r>
-    </w:p>
-    <w:p>
-      <w:pPr>
-        <w:pStyle w:val="a9"/>
-        <w:ind w:left="720" w:hanging="720"/>
-        <w:jc w:val="both"/>
-      </w:pPr>
-      <w:r>
-        <w:rPr>
-          <w:rFonts w:ascii="新細明體" w:hAnsi="新細明體" w:eastAsia="新細明體"/>
-          <w:b w:val="0"/>
-          <w:sz w:val="24"/>
-        </w:rPr>
-        <w:t>主旨：「依政府採購法第三十一條第二項第八款認定屬影響採購公正之違反法令行為」業經本會於104年7月17日以工程企字第10400225210號令發布，茲檢送發布令影本乙份，請查照並轉知所屬（轄）機關。</w:t>
-      </w:r>
-    </w:p>
-    <w:p>
-      <w:pPr>
-        <w:pStyle w:val="a9"/>
-        <w:ind w:left="720" w:hanging="720"/>
-        <w:jc w:val="both"/>
-      </w:pPr>
-      <w:r>
-        <w:rPr>
-          <w:rFonts w:ascii="新細明體" w:hAnsi="新細明體" w:eastAsia="新細明體"/>
-          <w:b w:val="0"/>
-          <w:sz w:val="24"/>
-        </w:rPr>
-        <w:t>說明：旨揭令係彙整本會歷年依政府採購法第31條第2項第8款認定之行為。</w:t>
-      </w:r>
-    </w:p>
-    <w:p/>
-    <w:p>
-      <w:pPr>
-        <w:pStyle w:val="a9"/>
-        <w:ind w:left="720" w:hanging="720"/>
-        <w:jc w:val="both"/>
-      </w:pPr>
-      <w:r>
-        <w:rPr>
-          <w:rFonts w:ascii="微軟正黑體" w:hAnsi="微軟正黑體" w:eastAsia="微軟正黑體"/>
-          <w:b/>
-          <w:sz w:val="24"/>
-        </w:rPr>
-        <w:t>行政院公共工程委員會108年06月11日工程企字第1080100518號函</w:t>
-      </w:r>
-    </w:p>
-    <w:p>
-      <w:pPr>
-        <w:pStyle w:val="a9"/>
-        <w:ind w:left="720" w:hanging="720"/>
-        <w:jc w:val="both"/>
-      </w:pPr>
-      <w:r>
-        <w:rPr>
-          <w:rFonts w:ascii="新細明體" w:hAnsi="新細明體" w:eastAsia="新細明體"/>
-          <w:b w:val="0"/>
-          <w:sz w:val="24"/>
-        </w:rPr>
-        <w:t>主旨：為利廠商以電子化方式繳納押標金，本會將自108年7月1日起啟用政府電子採購網「線上繳納押標金」服務，機關後續招標作業詳如說明，請查照並轉知所屬機關。</w:t>
-      </w:r>
-    </w:p>
-    <w:p>
-      <w:pPr>
-        <w:pStyle w:val="a9"/>
-        <w:ind w:left="720" w:hanging="720"/>
-        <w:jc w:val="both"/>
-      </w:pPr>
-      <w:r>
-        <w:rPr>
-          <w:rFonts w:ascii="新細明體" w:hAnsi="新細明體" w:eastAsia="新細明體"/>
-          <w:b w:val="0"/>
-          <w:sz w:val="24"/>
-        </w:rPr>
-        <w:t>說明：</w:t>
-      </w:r>
-    </w:p>
-    <w:p>
-      <w:pPr>
-        <w:pStyle w:val="a9"/>
-        <w:ind w:left="720" w:hanging="480"/>
-        <w:jc w:val="both"/>
-      </w:pPr>
-      <w:r>
-        <w:rPr>
-          <w:rFonts w:ascii="新細明體" w:hAnsi="新細明體" w:eastAsia="新細明體"/>
-          <w:b w:val="0"/>
-          <w:sz w:val="24"/>
-        </w:rPr>
-        <w:t>一、按政府採購法第30條第2項規定略以：「押標金及保證金應由廠商以現金、金融機構簽發之本票或支票、......為之。」；押標金保證金暨其他擔保作業辦法第5條規定略以：「廠商得以本法第30條第2項規定之二種以上方式繳納押標金或保證金。...... 」，第11條規定略以：「廠商得將繳納押標金之單據附於下列投標文件檢送。但現金應繳納至指定之收受處所或金融機構帳號。......」，爰繳納押標金之方式，係由廠商選擇，合先敘明。</w:t>
-      </w:r>
-    </w:p>
-    <w:p>
-      <w:pPr>
-        <w:pStyle w:val="a9"/>
-        <w:ind w:left="720" w:hanging="480"/>
-        <w:jc w:val="both"/>
-      </w:pPr>
-      <w:r>
-        <w:rPr>
-          <w:rFonts w:ascii="新細明體" w:hAnsi="新細明體" w:eastAsia="新細明體"/>
-          <w:b w:val="0"/>
-          <w:sz w:val="24"/>
-        </w:rPr>
-        <w:t>二、經本會訪談廠商表示，繳納押標金時，廠商多需親至金融機構辦理，相當耗時且費力，希望能有便捷之電子化繳納方式。</w:t>
-      </w:r>
-    </w:p>
-    <w:p>
-      <w:pPr>
-        <w:pStyle w:val="a9"/>
-        <w:ind w:left="720" w:hanging="480"/>
-        <w:jc w:val="both"/>
-      </w:pPr>
-      <w:r>
-        <w:rPr>
-          <w:rFonts w:ascii="新細明體" w:hAnsi="新細明體" w:eastAsia="新細明體"/>
-          <w:b w:val="0"/>
-          <w:sz w:val="24"/>
-        </w:rPr>
-        <w:t>三、基上需求，本會業與台灣票據交換所合作，由政府電子採購網介接該所「金融業即時代收服務繳費平臺」(eFCS)，提供「線上繳納押標金」服務（下稱本服務，說明簡報如附件一），提供廠商於政府電子採購網線上即時繳納押標金；機關開標時可線上查詢及審查廠商繳納押標金情形之功能，以節省廠商及機關之人力與時間，並可減少錯誤。復本會自107年起，已就本服務陸續向機關及廠商說明逾20場次，各界皆認同其方式與效益，並希望本會儘速推動機關辦理。四、目前本服務介接eFCS之合作銀行包括臺灣銀行、臺灣土地銀行、彰化銀行、上海商業儲蓄銀行、台北富邦銀行、兆豐國際商業銀行、臺灣中小企業銀行、新光銀行、台新銀行計9家，爰各機關收受押標金之帳戶如屬前開9家合作銀行者，請於108年6月底前至政府電子採購網完成押標金收款帳戶設定；自108年7月1日起，有收取押標金者，請允許廠商線上繳納押標金，以利廠商參與政府採購。</w:t>
-      </w:r>
-    </w:p>
-    <w:p>
-      <w:pPr>
-        <w:pStyle w:val="a9"/>
-        <w:ind w:left="720" w:hanging="480"/>
-        <w:jc w:val="both"/>
-      </w:pPr>
-      <w:r>
-        <w:rPr>
-          <w:rFonts w:ascii="新細明體" w:hAnsi="新細明體" w:eastAsia="新細明體"/>
-          <w:b w:val="0"/>
-          <w:sz w:val="24"/>
-        </w:rPr>
-        <w:t>五、另配合本服務上線，「公開取得電子報價單」採購機制亦將同步擴大適用至須繳納押標金之案件，惟108年度達成率計算方式不變（如附件二），且目標維持為20%。</w:t>
-      </w:r>
-    </w:p>
-    <w:p>
-      <w:pPr>
-        <w:pStyle w:val="a9"/>
-        <w:ind w:left="720" w:hanging="480"/>
-        <w:jc w:val="both"/>
-      </w:pPr>
-      <w:r>
-        <w:rPr>
-          <w:rFonts w:ascii="新細明體" w:hAnsi="新細明體" w:eastAsia="新細明體"/>
-          <w:b w:val="0"/>
-          <w:sz w:val="24"/>
-        </w:rPr>
-        <w:t>六、有關本服務之系統操作問題，請多加利用政府電子採購網「首頁如何使用線上教學」瀏覽教學影片，或至「首頁下載專區系統使用手冊」下載系統使用手冊。如有其他系統操作問題，請逕洽政府電子採購網客服專線電話：0800-080512。</w:t>
-      </w:r>
-    </w:p>
-    <w:p>
-      <w:pPr>
-        <w:pStyle w:val="a9"/>
-        <w:ind w:left="720" w:hanging="480"/>
-        <w:jc w:val="both"/>
-      </w:pPr>
-      <w:r>
-        <w:rPr>
-          <w:rFonts w:ascii="新細明體" w:hAnsi="新細明體" w:eastAsia="新細明體"/>
-          <w:b w:val="0"/>
-          <w:sz w:val="24"/>
-        </w:rPr>
-        <w:t>七、本會將請政府電子採購網營運廠商（中華電信股份有限公司數據通信分公司）擇期辦理本服務之機關說明會，詳細資訊由該公司另函通知，屆時請各機關踴躍參加。</w:t>
-      </w:r>
-    </w:p>
-    <w:p/>
-    <w:p>
-      <w:pPr>
-        <w:pStyle w:val="a9"/>
-        <w:ind w:left="720" w:hanging="720"/>
-        <w:jc w:val="both"/>
-      </w:pPr>
-      <w:r>
-        <w:rPr>
-          <w:rFonts w:ascii="微軟正黑體" w:hAnsi="微軟正黑體" w:eastAsia="微軟正黑體"/>
-          <w:b/>
-          <w:sz w:val="24"/>
-        </w:rPr>
         <w:t>行政院公共工程委員會108年09月16日工程企字第1080100733號令函</w:t>
       </w:r>
     </w:p>
@@ -9074,7 +9673,52 @@
           <w:b w:val="0"/>
           <w:sz w:val="24"/>
         </w:rPr>
-        <w:t>依政府採購法第三十一條第二項第七款規定修正認定機關辦理採購，廠商有下列情形之一者，屬「其他經主管機關認定有影響採購公正之違反法令行為」情形，並自即日生效：一、有政府採購法第四十八條第一項第二款之「足以影響採購公正之違法行為者」情形。二、有政府採購法第五十條第一項第五款、第七款情形之一。三、廠商或其代表人、代理人、受雇人或其他從業人員有政府採購法第八十七條各項構成要件事實之一。</w:t>
+        <w:t>依政府採購法第三十一條第二項第七款規定修正認定機關辦理採購，廠商有下列情形之一者，屬「其他經主管機關認定有影響採購公正之違反法令行為」情形，並自即日生效：</w:t>
+      </w:r>
+    </w:p>
+    <w:p>
+      <w:pPr>
+        <w:pStyle w:val="a9"/>
+        <w:ind w:left="720" w:hanging="480"/>
+        <w:jc w:val="both"/>
+      </w:pPr>
+      <w:r>
+        <w:rPr>
+          <w:rFonts w:ascii="新細明體" w:hAnsi="新細明體" w:eastAsia="新細明體"/>
+          <w:b w:val="0"/>
+          <w:sz w:val="24"/>
+        </w:rPr>
+        <w:t>一、有政府採購法第四十八條第一項第二款之「足以影響採購公正之違法行為者」情形。</w:t>
+      </w:r>
+    </w:p>
+    <w:p>
+      <w:pPr>
+        <w:pStyle w:val="a9"/>
+        <w:ind w:left="720" w:hanging="480"/>
+        <w:jc w:val="both"/>
+      </w:pPr>
+      <w:r>
+        <w:rPr>
+          <w:rFonts w:ascii="新細明體" w:hAnsi="新細明體" w:eastAsia="新細明體"/>
+          <w:b w:val="0"/>
+          <w:sz w:val="24"/>
+        </w:rPr>
+        <w:t>二、有政府採購法第五十條第一項第五款、第七款情形之一。</w:t>
+      </w:r>
+    </w:p>
+    <w:p>
+      <w:pPr>
+        <w:pStyle w:val="a9"/>
+        <w:ind w:left="720" w:hanging="480"/>
+        <w:jc w:val="both"/>
+      </w:pPr>
+      <w:r>
+        <w:rPr>
+          <w:rFonts w:ascii="新細明體" w:hAnsi="新細明體" w:eastAsia="新細明體"/>
+          <w:b w:val="0"/>
+          <w:sz w:val="24"/>
+        </w:rPr>
+        <w:t>三、廠商或其代表人、代理人、受雇人或其他從業人員有政府採購法第八十七條各項構成要件事實之一。</w:t>
       </w:r>
     </w:p>
     <w:p>
@@ -9856,7 +10500,7 @@
     <w:p>
       <w:pPr>
         <w:pStyle w:val="a9"/>
-        <w:ind w:left="960" w:hanging="960"/>
+        <w:ind w:left="720" w:hanging="720"/>
         <w:jc w:val="both"/>
       </w:pPr>
       <w:r>
@@ -9866,21 +10510,6 @@
           <w:sz w:val="24"/>
         </w:rPr>
         <w:t>備註：1. 「機關主(會)計單位會同監辦採購辦法」業於九十一年八月七日以行政院主計處處會字第〇九一〇〇五四〇七號令及行政院公共工程委員會工程企字第〇九一〇〇三二五一三〇號令修正為「機關主會計及有關單位會同監辦採購辦法」，本函所稱該辦法第三條，與原第四條合併修正為第四條。</w:t>
-      </w:r>
-    </w:p>
-    <w:p>
-      <w:pPr>
-        <w:pStyle w:val="a9"/>
-        <w:ind w:left="960" w:hanging="240"/>
-        <w:jc w:val="both"/>
-      </w:pPr>
-      <w:r>
-        <w:rPr>
-          <w:rFonts w:ascii="新細明體" w:hAnsi="新細明體" w:eastAsia="新細明體"/>
-          <w:b w:val="0"/>
-          <w:sz w:val="24"/>
-        </w:rPr>
-        <w:t>2. 「機關主(會)計單位會同監辦採購辦法」業於九十一年八月七日以行政院主計處處會字第○九一○○五四○七號令及行政院公共工程委員會工程企字第○九一○○三二五一三○號令修正為「機關主會計及有關單位會同監辦採購辦法」，本函所稱該辦法第三條，與原第四條合併修正為第四條。</w:t>
       </w:r>
     </w:p>
     <w:p/>
@@ -12567,22 +13196,37 @@
           <w:b w:val="0"/>
           <w:sz w:val="24"/>
         </w:rPr>
-        <w:t>主旨：有關95年1月6日多家傳媒刊載，少數郵務人員涉嫌為建商偷竊、竄改標單，請本公司加強內部管理，避免於政府採購案件發生相同情事乙案，已加強防範措施如說明，請核備</w:t>
-      </w:r>
-    </w:p>
-    <w:p>
-      <w:pPr>
-        <w:pStyle w:val="a9"/>
-        <w:ind w:left="720" w:hanging="720"/>
-        <w:jc w:val="both"/>
-      </w:pPr>
-      <w:r>
-        <w:rPr>
-          <w:rFonts w:ascii="新細明體" w:hAnsi="新細明體" w:eastAsia="新細明體"/>
-          <w:b w:val="0"/>
-          <w:sz w:val="24"/>
-        </w:rPr>
-        <w:t>說明：ㄧ、依據大會95年1月11日工程企字第09500014830號函及交通部95年1月16日交郵字第0950017669號函辦理。</w:t>
+        <w:t>主旨：有關95年1月6日多家傳媒刊載，少數郵務人員涉嫌為建商偷竊、竄改標單，請本公司加強內部管理，避免於政府採購案件發生相同情事乙案，已加強防範措施如說明，請核備。</w:t>
+      </w:r>
+    </w:p>
+    <w:p>
+      <w:pPr>
+        <w:pStyle w:val="a9"/>
+        <w:ind w:left="720" w:hanging="720"/>
+        <w:jc w:val="both"/>
+      </w:pPr>
+      <w:r>
+        <w:rPr>
+          <w:rFonts w:ascii="新細明體" w:hAnsi="新細明體" w:eastAsia="新細明體"/>
+          <w:b w:val="0"/>
+          <w:sz w:val="24"/>
+        </w:rPr>
+        <w:t>說明：</w:t>
+      </w:r>
+    </w:p>
+    <w:p>
+      <w:pPr>
+        <w:pStyle w:val="a9"/>
+        <w:ind w:left="720" w:hanging="480"/>
+        <w:jc w:val="both"/>
+      </w:pPr>
+      <w:r>
+        <w:rPr>
+          <w:rFonts w:ascii="新細明體" w:hAnsi="新細明體" w:eastAsia="新細明體"/>
+          <w:b w:val="0"/>
+          <w:sz w:val="24"/>
+        </w:rPr>
+        <w:t>一、依據大會95年1月11日工程企字第09500014830號函及交通部95年1月16日交郵字第0950017669號函辦理。</w:t>
       </w:r>
     </w:p>
     <w:p>
@@ -12799,61 +13443,16 @@
     <w:p>
       <w:pPr>
         <w:pStyle w:val="a9"/>
-        <w:ind w:left="960" w:hanging="960"/>
-        <w:jc w:val="both"/>
-      </w:pPr>
-      <w:r>
-        <w:rPr>
-          <w:rFonts w:ascii="新細明體" w:hAnsi="新細明體" w:eastAsia="新細明體"/>
-          <w:b w:val="0"/>
-          <w:sz w:val="24"/>
-        </w:rPr>
-        <w:t>備註：1. 為配合本會101年12月27日修正發布之機關委託技術服務廠商評選及計費辦法第9條第2項規定，本會業以103年5月9日工程企字第10300155850號函修正旨揭建議事項表之項次4-2，並依本會相關解釋函補充其</w:t>
-      </w:r>
-    </w:p>
-    <w:p>
-      <w:pPr>
-        <w:pStyle w:val="a9"/>
-        <w:ind w:left="960" w:hanging="240"/>
-        <w:jc w:val="both"/>
-      </w:pPr>
-      <w:r>
-        <w:rPr>
-          <w:rFonts w:ascii="新細明體" w:hAnsi="新細明體" w:eastAsia="新細明體"/>
-          <w:b w:val="0"/>
-          <w:sz w:val="24"/>
-        </w:rPr>
-        <w:t>2. 內容，及增列說明三：「機關將設計及監造服務委由同一廠商時，應留意該廠商工程設計圖說之正確性、完整性、合理性，及是否有不必要、超量、浪費公帑、錯誤、限制競爭之設計；施工履約階段有無對技術、工法、材料、設備或規格為違反法令之限制或審查；設計圖說如經施工廠商反映錯誤或工程項目數量錯誤時，機關應公正審查，不得刁難施工廠商自行吸收額外費用，並追究設計監造廠商之相關責任。」(修正函及修正附表均已公開於本網站)，請逕另依上開函釋號上網查察。</w:t>
-      </w:r>
-    </w:p>
-    <w:p>
-      <w:pPr>
-        <w:pStyle w:val="a9"/>
-        <w:ind w:left="960" w:hanging="240"/>
-        <w:jc w:val="both"/>
-      </w:pPr>
-      <w:r>
-        <w:rPr>
-          <w:rFonts w:ascii="新細明體" w:hAnsi="新細明體" w:eastAsia="新細明體"/>
-          <w:b w:val="0"/>
-          <w:sz w:val="24"/>
-        </w:rPr>
-        <w:t>3. 為配合本會101年12月27日修正發布之機關委託技術服務廠商評選及計費辦法第9條第2項規定，業以103年5月9日工程企字第10300155850號函(公開於本會網站)修正旨揭建議事項表之項次4-2，並依本會相關解釋函補充其</w:t>
-      </w:r>
-    </w:p>
-    <w:p>
-      <w:pPr>
-        <w:pStyle w:val="a9"/>
-        <w:ind w:left="960" w:hanging="240"/>
-        <w:jc w:val="both"/>
-      </w:pPr>
-      <w:r>
-        <w:rPr>
-          <w:rFonts w:ascii="新細明體" w:hAnsi="新細明體" w:eastAsia="新細明體"/>
-          <w:b w:val="0"/>
-          <w:sz w:val="24"/>
-        </w:rPr>
-        <w:t>4. 內容，請逕依上開函號上網查察。</w:t>
+        <w:ind w:left="720" w:hanging="720"/>
+        <w:jc w:val="both"/>
+      </w:pPr>
+      <w:r>
+        <w:rPr>
+          <w:rFonts w:ascii="新細明體" w:hAnsi="新細明體" w:eastAsia="新細明體"/>
+          <w:b w:val="0"/>
+          <w:sz w:val="24"/>
+        </w:rPr>
+        <w:t>備註：1. 為配合本會101年12月27日修正發布之機關委託技術服務廠商評選及計費辦法第9條第2項規定，本會業以103年5月9日工程企字第10300155850號函修正旨揭建議事項表之項次4-2，並依本會相關解釋函補充其註2及註4內容，及增列說明三：「機關將設計及監造服務委由同一廠商時，應留意該廠商工程設計圖說之正確性、完整性、合理性，及是否有不必要、超量、浪費公帑、錯誤、限制競爭之設計；施工履約階段有無對技術、工法、材料、設備或規格為違反法令之限制或審查；設計圖說如經施工廠商反映錯誤或工程項目數量錯誤時，機關應公正審查，不得刁難施工廠商自行吸收額外費用，並追究設計監造廠商之相關責任。」(修正函及修正附表均已公開於本網站)，請逕另依上開函釋號上網查察。</w:t>
       </w:r>
     </w:p>
     <w:p/>

</xml_diff>

<commit_message>
Update Chapter 4 JSON and DOCX with manually corrected values
</commit_message>
<xml_diff>
--- a/第四章/第四章.docx
+++ b/第四章/第四章.docx
@@ -6312,15 +6312,40 @@
         <w:ind w:hanging="480"/>
         <w:jc w:val="both"/>
         <w:rPr>
-          <w:lang w:eastAsia="zh-TW"/>
-        </w:rPr>
-      </w:pPr>
-      <w:r>
-        <w:rPr>
-          <w:rFonts w:ascii="新細明體" w:eastAsia="新細明體" w:hAnsi="新細明體"/>
-          <w:lang w:eastAsia="zh-TW"/>
-        </w:rPr>
-        <w:t>二、查將於明（八十八）年五月二十七日施行之「政府採購法」第三十三條第一項規定：「廠商之投標文件，應以書面密封，於投標截止期限前，以郵遞或專人送達招標機關或其指定之場所。」亦即係由廠商自行選擇遞送方式，機關不予限定。3.目前部分機關之招標文件仍有規定廠商付郵地點之情形，本會配合政府採購法之施行，業於本(八十七)年六月二十四日以工程企字第八七Ｏ七三Ｏ四號函洽各機關採取調適措施。</w:t>
+          <w:rFonts w:ascii="新細明體" w:eastAsia="新細明體" w:hAnsi="新細明體"/>
+          <w:lang w:eastAsia="zh-TW"/>
+        </w:rPr>
+      </w:pPr>
+      <w:r>
+        <w:rPr>
+          <w:rFonts w:ascii="新細明體" w:eastAsia="新細明體" w:hAnsi="新細明體"/>
+          <w:lang w:eastAsia="zh-TW"/>
+        </w:rPr>
+        <w:t>二、查將於明（八十八）年五月二十七日施行之「政府採購法」第三十三條第一項規定：「廠商之投標文件，應以書面密封，於投標截止期限前，以郵遞或專人送達招標機關或其指定之場所。」亦即係由廠商自行選擇遞送方式，機關不予限定。</w:t>
+      </w:r>
+    </w:p>
+    <w:p>
+      <w:pPr>
+        <w:pStyle w:val="a9"/>
+        <w:ind w:hanging="480"/>
+        <w:jc w:val="both"/>
+        <w:rPr>
+          <w:lang w:eastAsia="zh-TW"/>
+        </w:rPr>
+      </w:pPr>
+      <w:r>
+        <w:rPr>
+          <w:rFonts w:ascii="新細明體" w:eastAsia="新細明體" w:hAnsi="新細明體" w:hint="eastAsia"/>
+          <w:lang w:eastAsia="zh-TW"/>
+        </w:rPr>
+        <w:t>三、</w:t>
+      </w:r>
+      <w:r>
+        <w:rPr>
+          <w:rFonts w:ascii="新細明體" w:eastAsia="新細明體" w:hAnsi="新細明體"/>
+          <w:lang w:eastAsia="zh-TW"/>
+        </w:rPr>
+        <w:t>目前部分機關之招標文件仍有規定廠商付郵地點之情形，本會配合政府採購法之施行，業於本(八十七)年六月二十四日以工程企字第八七Ｏ七三Ｏ四號函洽各機關採取調適措施。</w:t>
       </w:r>
     </w:p>
     <w:p>
@@ -15883,7 +15908,6 @@
     <w:p>
       <w:pPr>
         <w:rPr>
-          <w:rFonts w:hint="eastAsia"/>
           <w:lang w:eastAsia="zh-TW"/>
         </w:rPr>
       </w:pPr>
@@ -16058,15 +16082,13 @@
     <w:p>
       <w:pPr>
         <w:rPr>
-          <w:rFonts w:hint="eastAsia"/>
-          <w:lang w:eastAsia="zh-TW"/>
-        </w:rPr>
-      </w:pPr>
-    </w:p>
-    <w:p>
-      <w:pPr>
-        <w:rPr>
-          <w:rFonts w:hint="eastAsia"/>
+          <w:lang w:eastAsia="zh-TW"/>
+        </w:rPr>
+      </w:pPr>
+    </w:p>
+    <w:p>
+      <w:pPr>
+        <w:rPr>
           <w:lang w:eastAsia="zh-TW"/>
         </w:rPr>
       </w:pPr>
@@ -16114,7 +16136,6 @@
     <w:p>
       <w:pPr>
         <w:rPr>
-          <w:rFonts w:hint="eastAsia"/>
           <w:lang w:eastAsia="zh-TW"/>
         </w:rPr>
       </w:pPr>
@@ -17258,7 +17279,8 @@
     <w:p>
       <w:pPr>
         <w:pStyle w:val="a9"/>
-        <w:ind w:hanging="480"/>
+        <w:wordWrap w:val="0"/>
+        <w:ind w:hanging="482"/>
         <w:jc w:val="both"/>
       </w:pPr>
       <w:r>
@@ -18933,7 +18955,7 @@
         <w:ind w:hanging="480"/>
         <w:jc w:val="both"/>
         <w:rPr>
-          <w:rFonts w:ascii="新細明體" w:eastAsia="新細明體" w:hAnsi="新細明體" w:hint="eastAsia"/>
+          <w:rFonts w:ascii="新細明體" w:eastAsia="新細明體" w:hAnsi="新細明體"/>
           <w:lang w:eastAsia="zh-TW"/>
         </w:rPr>
       </w:pPr>
@@ -18968,12 +18990,6 @@
         <w:gridCol w:w="3710"/>
       </w:tblGrid>
       <w:tr>
-        <w:tblPrEx>
-          <w:tblCellMar>
-            <w:top w:w="0" w:type="dxa"/>
-            <w:bottom w:w="0" w:type="dxa"/>
-          </w:tblCellMar>
-        </w:tblPrEx>
         <w:trPr>
           <w:trHeight w:val="535"/>
           <w:tblHeader/>
@@ -18987,7 +19003,7 @@
             <w:pPr>
               <w:jc w:val="center"/>
               <w:rPr>
-                <w:rFonts w:ascii="新細明體" w:eastAsia="新細明體" w:hAnsi="新細明體" w:hint="eastAsia"/>
+                <w:rFonts w:ascii="新細明體" w:eastAsia="新細明體" w:hAnsi="新細明體"/>
                 <w:szCs w:val="24"/>
               </w:rPr>
             </w:pPr>
@@ -19009,7 +19025,7 @@
             <w:pPr>
               <w:jc w:val="center"/>
               <w:rPr>
-                <w:rFonts w:ascii="新細明體" w:eastAsia="新細明體" w:hAnsi="新細明體" w:hint="eastAsia"/>
+                <w:rFonts w:ascii="新細明體" w:eastAsia="新細明體" w:hAnsi="新細明體"/>
                 <w:szCs w:val="24"/>
                 <w:lang w:eastAsia="zh-TW"/>
               </w:rPr>
@@ -19033,7 +19049,7 @@
             <w:pPr>
               <w:jc w:val="center"/>
               <w:rPr>
-                <w:rFonts w:ascii="新細明體" w:eastAsia="新細明體" w:hAnsi="新細明體" w:hint="eastAsia"/>
+                <w:rFonts w:ascii="新細明體" w:eastAsia="新細明體" w:hAnsi="新細明體"/>
                 <w:szCs w:val="24"/>
                 <w:lang w:eastAsia="zh-TW"/>
               </w:rPr>
@@ -19050,12 +19066,6 @@
         </w:tc>
       </w:tr>
       <w:tr>
-        <w:tblPrEx>
-          <w:tblCellMar>
-            <w:top w:w="0" w:type="dxa"/>
-            <w:bottom w:w="0" w:type="dxa"/>
-          </w:tblCellMar>
-        </w:tblPrEx>
         <w:tc>
           <w:tcPr>
             <w:tcW w:w="1648" w:type="dxa"/>
@@ -19066,7 +19076,7 @@
               <w:ind w:left="240" w:hangingChars="100" w:hanging="240"/>
               <w:jc w:val="both"/>
               <w:rPr>
-                <w:rFonts w:ascii="新細明體" w:eastAsia="新細明體" w:hAnsi="新細明體" w:hint="eastAsia"/>
+                <w:rFonts w:ascii="新細明體" w:eastAsia="新細明體" w:hAnsi="新細明體"/>
                 <w:szCs w:val="24"/>
                 <w:lang w:eastAsia="zh-TW"/>
               </w:rPr>
@@ -19091,7 +19101,7 @@
               <w:ind w:left="240" w:hangingChars="100" w:hanging="240"/>
               <w:jc w:val="both"/>
               <w:rPr>
-                <w:rFonts w:ascii="新細明體" w:eastAsia="新細明體" w:hAnsi="新細明體" w:hint="eastAsia"/>
+                <w:rFonts w:ascii="新細明體" w:eastAsia="新細明體" w:hAnsi="新細明體"/>
                 <w:szCs w:val="24"/>
                 <w:lang w:eastAsia="zh-TW"/>
               </w:rPr>
@@ -19116,7 +19126,7 @@
               <w:ind w:left="240" w:hangingChars="100" w:hanging="240"/>
               <w:jc w:val="both"/>
               <w:rPr>
-                <w:rFonts w:ascii="新細明體" w:eastAsia="新細明體" w:hAnsi="新細明體" w:hint="eastAsia"/>
+                <w:rFonts w:ascii="新細明體" w:eastAsia="新細明體" w:hAnsi="新細明體"/>
                 <w:szCs w:val="24"/>
                 <w:lang w:eastAsia="zh-TW"/>
               </w:rPr>
@@ -19133,12 +19143,6 @@
         </w:tc>
       </w:tr>
       <w:tr>
-        <w:tblPrEx>
-          <w:tblCellMar>
-            <w:top w:w="0" w:type="dxa"/>
-            <w:bottom w:w="0" w:type="dxa"/>
-          </w:tblCellMar>
-        </w:tblPrEx>
         <w:tc>
           <w:tcPr>
             <w:tcW w:w="1648" w:type="dxa"/>
@@ -19149,7 +19153,7 @@
               <w:ind w:left="240" w:hangingChars="100" w:hanging="240"/>
               <w:jc w:val="both"/>
               <w:rPr>
-                <w:rFonts w:ascii="新細明體" w:eastAsia="新細明體" w:hAnsi="新細明體" w:hint="eastAsia"/>
+                <w:rFonts w:ascii="新細明體" w:eastAsia="新細明體" w:hAnsi="新細明體"/>
                 <w:szCs w:val="24"/>
                 <w:lang w:eastAsia="zh-TW"/>
               </w:rPr>
@@ -19174,7 +19178,7 @@
               <w:ind w:left="480" w:hangingChars="200" w:hanging="480"/>
               <w:jc w:val="both"/>
               <w:rPr>
-                <w:rFonts w:ascii="新細明體" w:eastAsia="新細明體" w:hAnsi="新細明體" w:hint="eastAsia"/>
+                <w:rFonts w:ascii="新細明體" w:eastAsia="新細明體" w:hAnsi="新細明體"/>
                 <w:szCs w:val="24"/>
                 <w:lang w:eastAsia="zh-TW"/>
               </w:rPr>
@@ -19194,7 +19198,7 @@
               <w:ind w:left="480" w:hangingChars="200" w:hanging="480"/>
               <w:jc w:val="both"/>
               <w:rPr>
-                <w:rFonts w:ascii="新細明體" w:eastAsia="新細明體" w:hAnsi="新細明體" w:hint="eastAsia"/>
+                <w:rFonts w:ascii="新細明體" w:eastAsia="新細明體" w:hAnsi="新細明體"/>
                 <w:szCs w:val="24"/>
                 <w:lang w:eastAsia="zh-TW"/>
               </w:rPr>
@@ -19219,7 +19223,7 @@
               <w:ind w:left="240" w:hangingChars="100" w:hanging="240"/>
               <w:jc w:val="both"/>
               <w:rPr>
-                <w:rFonts w:ascii="新細明體" w:eastAsia="新細明體" w:hAnsi="新細明體" w:hint="eastAsia"/>
+                <w:rFonts w:ascii="新細明體" w:eastAsia="新細明體" w:hAnsi="新細明體"/>
                 <w:szCs w:val="24"/>
                 <w:lang w:eastAsia="zh-TW"/>
               </w:rPr>
@@ -19236,12 +19240,6 @@
         </w:tc>
       </w:tr>
       <w:tr>
-        <w:tblPrEx>
-          <w:tblCellMar>
-            <w:top w:w="0" w:type="dxa"/>
-            <w:bottom w:w="0" w:type="dxa"/>
-          </w:tblCellMar>
-        </w:tblPrEx>
         <w:tc>
           <w:tcPr>
             <w:tcW w:w="1648" w:type="dxa"/>
@@ -19252,7 +19250,7 @@
               <w:ind w:left="240" w:hangingChars="100" w:hanging="240"/>
               <w:jc w:val="both"/>
               <w:rPr>
-                <w:rFonts w:ascii="新細明體" w:eastAsia="新細明體" w:hAnsi="新細明體" w:hint="eastAsia"/>
+                <w:rFonts w:ascii="新細明體" w:eastAsia="新細明體" w:hAnsi="新細明體"/>
                 <w:szCs w:val="24"/>
                 <w:lang w:eastAsia="zh-TW"/>
               </w:rPr>
@@ -19277,7 +19275,7 @@
               <w:ind w:left="480" w:hangingChars="200" w:hanging="480"/>
               <w:jc w:val="both"/>
               <w:rPr>
-                <w:rFonts w:ascii="新細明體" w:eastAsia="新細明體" w:hAnsi="新細明體" w:hint="eastAsia"/>
+                <w:rFonts w:ascii="新細明體" w:eastAsia="新細明體" w:hAnsi="新細明體"/>
                 <w:szCs w:val="24"/>
                 <w:lang w:eastAsia="zh-TW"/>
               </w:rPr>
@@ -19297,7 +19295,7 @@
               <w:ind w:left="480" w:hangingChars="200" w:hanging="480"/>
               <w:jc w:val="both"/>
               <w:rPr>
-                <w:rFonts w:ascii="新細明體" w:eastAsia="新細明體" w:hAnsi="新細明體" w:hint="eastAsia"/>
+                <w:rFonts w:ascii="新細明體" w:eastAsia="新細明體" w:hAnsi="新細明體"/>
                 <w:szCs w:val="24"/>
                 <w:lang w:eastAsia="zh-TW"/>
               </w:rPr>
@@ -19317,7 +19315,7 @@
               <w:ind w:left="480" w:hangingChars="200" w:hanging="480"/>
               <w:jc w:val="both"/>
               <w:rPr>
-                <w:rFonts w:ascii="新細明體" w:eastAsia="新細明體" w:hAnsi="新細明體" w:hint="eastAsia"/>
+                <w:rFonts w:ascii="新細明體" w:eastAsia="新細明體" w:hAnsi="新細明體"/>
                 <w:szCs w:val="24"/>
                 <w:lang w:eastAsia="zh-TW"/>
               </w:rPr>
@@ -19358,7 +19356,7 @@
               <w:ind w:left="480" w:hangingChars="200" w:hanging="480"/>
               <w:jc w:val="both"/>
               <w:rPr>
-                <w:rFonts w:ascii="新細明體" w:eastAsia="新細明體" w:hAnsi="新細明體" w:hint="eastAsia"/>
+                <w:rFonts w:ascii="新細明體" w:eastAsia="新細明體" w:hAnsi="新細明體"/>
                 <w:szCs w:val="24"/>
                 <w:lang w:eastAsia="zh-TW"/>
               </w:rPr>
@@ -19378,7 +19376,7 @@
               <w:ind w:left="506" w:hangingChars="211" w:hanging="506"/>
               <w:jc w:val="both"/>
               <w:rPr>
-                <w:rFonts w:ascii="新細明體" w:eastAsia="新細明體" w:hAnsi="新細明體" w:hint="eastAsia"/>
+                <w:rFonts w:ascii="新細明體" w:eastAsia="新細明體" w:hAnsi="新細明體"/>
                 <w:szCs w:val="24"/>
                 <w:lang w:eastAsia="zh-TW"/>
               </w:rPr>
@@ -19398,7 +19396,7 @@
               <w:ind w:left="480" w:hangingChars="200" w:hanging="480"/>
               <w:jc w:val="both"/>
               <w:rPr>
-                <w:rFonts w:ascii="新細明體" w:eastAsia="新細明體" w:hAnsi="新細明體" w:hint="eastAsia"/>
+                <w:rFonts w:ascii="新細明體" w:eastAsia="新細明體" w:hAnsi="新細明體"/>
                 <w:szCs w:val="24"/>
                 <w:lang w:eastAsia="zh-TW"/>
               </w:rPr>
@@ -19431,12 +19429,6 @@
         </w:tc>
       </w:tr>
       <w:tr>
-        <w:tblPrEx>
-          <w:tblCellMar>
-            <w:top w:w="0" w:type="dxa"/>
-            <w:bottom w:w="0" w:type="dxa"/>
-          </w:tblCellMar>
-        </w:tblPrEx>
         <w:tc>
           <w:tcPr>
             <w:tcW w:w="1648" w:type="dxa"/>
@@ -19447,7 +19439,7 @@
               <w:ind w:left="240" w:hangingChars="100" w:hanging="240"/>
               <w:jc w:val="both"/>
               <w:rPr>
-                <w:rFonts w:ascii="新細明體" w:eastAsia="新細明體" w:hAnsi="新細明體" w:hint="eastAsia"/>
+                <w:rFonts w:ascii="新細明體" w:eastAsia="新細明體" w:hAnsi="新細明體"/>
                 <w:szCs w:val="24"/>
               </w:rPr>
             </w:pPr>
@@ -19470,7 +19462,7 @@
               <w:ind w:left="480" w:hangingChars="200" w:hanging="480"/>
               <w:jc w:val="both"/>
               <w:rPr>
-                <w:rFonts w:ascii="新細明體" w:eastAsia="新細明體" w:hAnsi="新細明體" w:hint="eastAsia"/>
+                <w:rFonts w:ascii="新細明體" w:eastAsia="新細明體" w:hAnsi="新細明體"/>
                 <w:szCs w:val="24"/>
                 <w:lang w:eastAsia="zh-TW"/>
               </w:rPr>
@@ -19490,7 +19482,7 @@
               <w:ind w:left="480" w:hangingChars="200" w:hanging="480"/>
               <w:jc w:val="both"/>
               <w:rPr>
-                <w:rFonts w:ascii="新細明體" w:eastAsia="新細明體" w:hAnsi="新細明體" w:hint="eastAsia"/>
+                <w:rFonts w:ascii="新細明體" w:eastAsia="新細明體" w:hAnsi="新細明體"/>
                 <w:szCs w:val="24"/>
                 <w:lang w:eastAsia="zh-TW"/>
               </w:rPr>
@@ -19515,7 +19507,7 @@
               <w:ind w:left="480" w:hangingChars="200" w:hanging="480"/>
               <w:jc w:val="both"/>
               <w:rPr>
-                <w:rFonts w:ascii="新細明體" w:eastAsia="新細明體" w:hAnsi="新細明體" w:hint="eastAsia"/>
+                <w:rFonts w:ascii="新細明體" w:eastAsia="新細明體" w:hAnsi="新細明體"/>
                 <w:szCs w:val="24"/>
                 <w:lang w:eastAsia="zh-TW"/>
               </w:rPr>
@@ -19535,7 +19527,7 @@
               <w:ind w:left="480" w:hangingChars="200" w:hanging="480"/>
               <w:jc w:val="both"/>
               <w:rPr>
-                <w:rFonts w:ascii="新細明體" w:eastAsia="新細明體" w:hAnsi="新細明體" w:hint="eastAsia"/>
+                <w:rFonts w:ascii="新細明體" w:eastAsia="新細明體" w:hAnsi="新細明體"/>
                 <w:szCs w:val="24"/>
                 <w:lang w:eastAsia="zh-TW"/>
               </w:rPr>
@@ -19558,304 +19550,303 @@
         <w:ind w:hanging="480"/>
         <w:jc w:val="both"/>
         <w:rPr>
+          <w:rFonts w:ascii="新細明體" w:eastAsia="新細明體" w:hAnsi="新細明體"/>
+          <w:lang w:eastAsia="zh-TW"/>
+        </w:rPr>
+      </w:pPr>
+      <w:r>
+        <w:rPr>
           <w:rFonts w:ascii="新細明體" w:eastAsia="新細明體" w:hAnsi="新細明體" w:hint="eastAsia"/>
           <w:lang w:eastAsia="zh-TW"/>
         </w:rPr>
+        <w:t>註1：現行法令對於機關委託設計、監造之採購，並無應分別辦理招標之限制規定（法務部90年3月20日法九十政字第005261號函釋例，公開於本會網站）。</w:t>
+      </w:r>
+    </w:p>
+    <w:p>
+      <w:pPr>
+        <w:pStyle w:val="a9"/>
+        <w:ind w:hanging="480"/>
+        <w:jc w:val="both"/>
+        <w:rPr>
+          <w:rFonts w:ascii="新細明體" w:eastAsia="新細明體" w:hAnsi="新細明體"/>
+          <w:lang w:eastAsia="zh-TW"/>
+        </w:rPr>
       </w:pPr>
       <w:r>
         <w:rPr>
           <w:rFonts w:ascii="新細明體" w:eastAsia="新細明體" w:hAnsi="新細明體" w:hint="eastAsia"/>
           <w:lang w:eastAsia="zh-TW"/>
         </w:rPr>
-        <w:t>註1：現行法令對於機關委託設計、監造之採購，並無應分別辦理招標之限制規定（法務部90年3月20日法九十政字第005261號函釋例，公開於本會網站）。</w:t>
-      </w:r>
-    </w:p>
-    <w:p>
-      <w:pPr>
-        <w:pStyle w:val="a9"/>
-        <w:ind w:hanging="480"/>
-        <w:jc w:val="both"/>
+        <w:t>註2：如機關將設計與監造服務分開辦理，前階段設計之成果若予「公開」，並</w:t>
+      </w:r>
+      <w:r>
+        <w:rPr>
+          <w:rFonts w:ascii="新細明體" w:eastAsia="新細明體" w:hAnsi="新細明體"/>
+          <w:lang w:eastAsia="zh-TW"/>
+        </w:rPr>
+        <w:t>經機關同意者</w:t>
+      </w:r>
+      <w:r>
         <w:rPr>
           <w:rFonts w:ascii="新細明體" w:eastAsia="新細明體" w:hAnsi="新細明體" w:hint="eastAsia"/>
           <w:lang w:eastAsia="zh-TW"/>
         </w:rPr>
-      </w:pPr>
+        <w:t>，該設計廠商得參與後階段之監造服務工作（本會92年6月20日工程企字第09200237740號函及96</w:t>
+      </w:r>
+      <w:r>
+        <w:rPr>
+          <w:rFonts w:ascii="新細明體" w:eastAsia="新細明體" w:hAnsi="新細明體"/>
+          <w:lang w:eastAsia="zh-TW"/>
+        </w:rPr>
+        <w:t>年</w:t>
+      </w:r>
       <w:r>
         <w:rPr>
           <w:rFonts w:ascii="新細明體" w:eastAsia="新細明體" w:hAnsi="新細明體" w:hint="eastAsia"/>
           <w:lang w:eastAsia="zh-TW"/>
         </w:rPr>
-        <w:t>註2：如機關將設計與監造服務分開辦理，前階段設計之成果若予「公開」，並</w:t>
-      </w:r>
-      <w:r>
-        <w:rPr>
-          <w:rFonts w:ascii="新細明體" w:eastAsia="新細明體" w:hAnsi="新細明體"/>
-          <w:lang w:eastAsia="zh-TW"/>
-        </w:rPr>
-        <w:t>經機關同意者</w:t>
+        <w:t>4</w:t>
+      </w:r>
+      <w:r>
+        <w:rPr>
+          <w:rFonts w:ascii="新細明體" w:eastAsia="新細明體" w:hAnsi="新細明體"/>
+          <w:lang w:eastAsia="zh-TW"/>
+        </w:rPr>
+        <w:t>月</w:t>
       </w:r>
       <w:r>
         <w:rPr>
           <w:rFonts w:ascii="新細明體" w:eastAsia="新細明體" w:hAnsi="新細明體" w:hint="eastAsia"/>
           <w:lang w:eastAsia="zh-TW"/>
         </w:rPr>
-        <w:t>，該設計廠商得參與後階段之監造服務工作（本會92年6月20日工程企字第09200237740號函及96</w:t>
-      </w:r>
-      <w:r>
-        <w:rPr>
-          <w:rFonts w:ascii="新細明體" w:eastAsia="新細明體" w:hAnsi="新細明體"/>
+        <w:t>13</w:t>
+      </w:r>
+      <w:r>
+        <w:rPr>
+          <w:rFonts w:ascii="新細明體" w:eastAsia="新細明體" w:hAnsi="新細明體"/>
+          <w:lang w:eastAsia="zh-TW"/>
+        </w:rPr>
+        <w:t>日工程企字第</w:t>
+      </w:r>
+      <w:r>
+        <w:rPr>
+          <w:rFonts w:ascii="新細明體" w:eastAsia="新細明體" w:hAnsi="新細明體" w:hint="eastAsia"/>
+          <w:lang w:eastAsia="zh-TW"/>
+        </w:rPr>
+        <w:t>09600124770</w:t>
+      </w:r>
+      <w:r>
+        <w:rPr>
+          <w:rFonts w:ascii="新細明體" w:eastAsia="新細明體" w:hAnsi="新細明體"/>
+          <w:lang w:eastAsia="zh-TW"/>
+        </w:rPr>
+        <w:t>號</w:t>
+      </w:r>
+      <w:r>
+        <w:rPr>
+          <w:rFonts w:ascii="新細明體" w:eastAsia="新細明體" w:hAnsi="新細明體" w:hint="eastAsia"/>
+          <w:lang w:eastAsia="zh-TW"/>
+        </w:rPr>
+        <w:t>函釋例，均公開於本會網站）。</w:t>
+      </w:r>
+    </w:p>
+    <w:p>
+      <w:pPr>
+        <w:pStyle w:val="a9"/>
+        <w:ind w:hanging="480"/>
+        <w:jc w:val="both"/>
+        <w:rPr>
+          <w:rFonts w:ascii="新細明體" w:eastAsia="新細明體" w:hAnsi="新細明體"/>
+          <w:lang w:eastAsia="zh-TW"/>
+        </w:rPr>
+      </w:pPr>
+      <w:r>
+        <w:rPr>
+          <w:rFonts w:ascii="新細明體" w:eastAsia="新細明體" w:hAnsi="新細明體" w:hint="eastAsia"/>
+          <w:lang w:eastAsia="zh-TW"/>
+        </w:rPr>
+        <w:t>註3：如發現技師或建築師有涉及違反其專技人員相關法規而涉及懲戒者，請依本會95年2月27日工程企字第09500069150號函釋例辦理（公開於本會網站）。</w:t>
+      </w:r>
+    </w:p>
+    <w:p>
+      <w:pPr>
+        <w:pStyle w:val="a9"/>
+        <w:ind w:hanging="480"/>
+        <w:jc w:val="both"/>
+        <w:rPr>
+          <w:rFonts w:ascii="新細明體" w:eastAsia="新細明體" w:hAnsi="新細明體"/>
+          <w:lang w:eastAsia="zh-TW"/>
+        </w:rPr>
+      </w:pPr>
+      <w:r>
+        <w:rPr>
+          <w:rFonts w:ascii="新細明體" w:eastAsia="新細明體" w:hAnsi="新細明體" w:hint="eastAsia"/>
+          <w:lang w:eastAsia="zh-TW"/>
+        </w:rPr>
+        <w:t>註4：為</w:t>
+      </w:r>
+      <w:r>
+        <w:rPr>
+          <w:rFonts w:ascii="新細明體" w:eastAsia="新細明體" w:hAnsi="新細明體"/>
+          <w:lang w:eastAsia="zh-TW"/>
+        </w:rPr>
+        <w:t>提醒廠商並預防爭議之產生，</w:t>
+      </w:r>
+      <w:r>
+        <w:rPr>
+          <w:rFonts w:ascii="新細明體" w:eastAsia="新細明體" w:hAnsi="新細明體" w:hint="eastAsia"/>
+          <w:lang w:eastAsia="zh-TW"/>
+        </w:rPr>
+        <w:t>本會業以95年3月15日工程企字第09500090960號函</w:t>
+      </w:r>
+      <w:r>
+        <w:rPr>
+          <w:rFonts w:ascii="新細明體" w:eastAsia="新細明體" w:hAnsi="新細明體"/>
+          <w:lang w:eastAsia="zh-TW"/>
+        </w:rPr>
+        <w:t>各機關</w:t>
+      </w:r>
+      <w:r>
+        <w:rPr>
+          <w:rFonts w:ascii="新細明體" w:eastAsia="新細明體" w:hAnsi="新細明體" w:hint="eastAsia"/>
+          <w:lang w:eastAsia="zh-TW"/>
+        </w:rPr>
+        <w:t>，</w:t>
+      </w:r>
+      <w:r>
+        <w:rPr>
+          <w:rFonts w:ascii="新細明體" w:eastAsia="新細明體" w:hAnsi="新細明體"/>
+          <w:lang w:eastAsia="zh-TW"/>
+        </w:rPr>
+        <w:t>建議</w:t>
+      </w:r>
+      <w:r>
+        <w:rPr>
+          <w:rFonts w:ascii="新細明體" w:eastAsia="新細明體" w:hAnsi="新細明體" w:hint="eastAsia"/>
+          <w:lang w:eastAsia="zh-TW"/>
+        </w:rPr>
+        <w:t>其</w:t>
+      </w:r>
+      <w:r>
+        <w:rPr>
+          <w:rFonts w:ascii="新細明體" w:eastAsia="新細明體" w:hAnsi="新細明體"/>
+          <w:lang w:eastAsia="zh-TW"/>
+        </w:rPr>
+        <w:t>辦理技術服務採購或工程採購</w:t>
+      </w:r>
+      <w:r>
+        <w:rPr>
+          <w:rFonts w:ascii="新細明體" w:eastAsia="新細明體" w:hAnsi="新細明體" w:hint="eastAsia"/>
+          <w:lang w:eastAsia="zh-TW"/>
+        </w:rPr>
+        <w:t>時，</w:t>
+      </w:r>
+      <w:r>
+        <w:rPr>
+          <w:rFonts w:ascii="新細明體" w:eastAsia="新細明體" w:hAnsi="新細明體"/>
+          <w:lang w:eastAsia="zh-TW"/>
+        </w:rPr>
+        <w:t>於招標文件規定廠商分別於投標時、開工前檢附相關切結書</w:t>
+      </w:r>
+      <w:r>
+        <w:rPr>
+          <w:rFonts w:ascii="新細明體" w:eastAsia="新細明體" w:hAnsi="新細明體" w:hint="eastAsia"/>
+          <w:lang w:eastAsia="zh-TW"/>
+        </w:rPr>
+        <w:t>，並以101年1月13日工程企字第10100017900號函</w:t>
+      </w:r>
+      <w:r>
+        <w:rPr>
+          <w:rFonts w:ascii="新細明體" w:eastAsia="新細明體" w:hAnsi="新細明體"/>
+          <w:lang w:eastAsia="zh-TW"/>
+        </w:rPr>
+        <w:t>修正「廠商參與公共工程可能涉及之法律責任」及廠商或其人員切結書</w:t>
+      </w:r>
+      <w:r>
+        <w:rPr>
+          <w:rFonts w:ascii="新細明體" w:eastAsia="新細明體" w:hAnsi="新細明體" w:hint="eastAsia"/>
+          <w:lang w:eastAsia="zh-TW"/>
+        </w:rPr>
+        <w:t>（均公開於本會網站）。</w:t>
+      </w:r>
+    </w:p>
+    <w:p>
+      <w:pPr>
+        <w:pStyle w:val="a9"/>
+        <w:ind w:hanging="480"/>
+        <w:jc w:val="both"/>
+        <w:rPr>
+          <w:rFonts w:ascii="新細明體" w:eastAsia="新細明體" w:hAnsi="新細明體"/>
+          <w:lang w:eastAsia="zh-TW"/>
+        </w:rPr>
+      </w:pPr>
+      <w:r>
+        <w:rPr>
+          <w:rFonts w:ascii="新細明體" w:eastAsia="新細明體" w:hAnsi="新細明體" w:hint="eastAsia"/>
+          <w:lang w:eastAsia="zh-TW"/>
+        </w:rPr>
+        <w:t>註5：</w:t>
+      </w:r>
+      <w:r>
+        <w:rPr>
+          <w:rFonts w:ascii="新細明體" w:eastAsia="新細明體" w:hAnsi="新細明體"/>
+          <w:lang w:eastAsia="zh-TW"/>
+        </w:rPr>
+        <w:t>中華民國營造工程工業同業公會全國聯合會</w:t>
+      </w:r>
+      <w:r>
+        <w:rPr>
+          <w:rFonts w:ascii="新細明體" w:eastAsia="新細明體" w:hAnsi="新細明體" w:hint="eastAsia"/>
+          <w:lang w:eastAsia="zh-TW"/>
+        </w:rPr>
+        <w:t>及</w:t>
+      </w:r>
+      <w:r>
+        <w:rPr>
+          <w:rFonts w:ascii="新細明體" w:eastAsia="新細明體" w:hAnsi="新細明體"/>
+          <w:lang w:eastAsia="zh-TW"/>
+        </w:rPr>
+        <w:t>台灣區營造工程工業同業公會91</w:t>
+      </w:r>
+      <w:r>
+        <w:rPr>
+          <w:rFonts w:ascii="新細明體" w:eastAsia="新細明體" w:hAnsi="新細明體" w:hint="eastAsia"/>
           <w:lang w:eastAsia="zh-TW"/>
         </w:rPr>
         <w:t>年</w:t>
       </w:r>
       <w:r>
         <w:rPr>
+          <w:rFonts w:ascii="新細明體" w:eastAsia="新細明體" w:hAnsi="新細明體"/>
+          <w:lang w:eastAsia="zh-TW"/>
+        </w:rPr>
+        <w:t>12</w:t>
+      </w:r>
+      <w:r>
+        <w:rPr>
           <w:rFonts w:ascii="新細明體" w:eastAsia="新細明體" w:hAnsi="新細明體" w:hint="eastAsia"/>
           <w:lang w:eastAsia="zh-TW"/>
         </w:rPr>
-        <w:t>4</w:t>
-      </w:r>
-      <w:r>
-        <w:rPr>
-          <w:rFonts w:ascii="新細明體" w:eastAsia="新細明體" w:hAnsi="新細明體"/>
-          <w:lang w:eastAsia="zh-TW"/>
-        </w:rPr>
         <w:t>月</w:t>
       </w:r>
       <w:r>
         <w:rPr>
+          <w:rFonts w:ascii="新細明體" w:eastAsia="新細明體" w:hAnsi="新細明體"/>
+          <w:lang w:eastAsia="zh-TW"/>
+        </w:rPr>
+        <w:t>5</w:t>
+      </w:r>
+      <w:r>
+        <w:rPr>
           <w:rFonts w:ascii="新細明體" w:eastAsia="新細明體" w:hAnsi="新細明體" w:hint="eastAsia"/>
           <w:lang w:eastAsia="zh-TW"/>
         </w:rPr>
-        <w:t>13</w:t>
-      </w:r>
-      <w:r>
-        <w:rPr>
-          <w:rFonts w:ascii="新細明體" w:eastAsia="新細明體" w:hAnsi="新細明體"/>
-          <w:lang w:eastAsia="zh-TW"/>
-        </w:rPr>
-        <w:t>日工程企字第</w:t>
-      </w:r>
-      <w:r>
-        <w:rPr>
-          <w:rFonts w:ascii="新細明體" w:eastAsia="新細明體" w:hAnsi="新細明體" w:hint="eastAsia"/>
-          <w:lang w:eastAsia="zh-TW"/>
-        </w:rPr>
-        <w:t>09600124770</w:t>
-      </w:r>
-      <w:r>
-        <w:rPr>
-          <w:rFonts w:ascii="新細明體" w:eastAsia="新細明體" w:hAnsi="新細明體"/>
-          <w:lang w:eastAsia="zh-TW"/>
-        </w:rPr>
-        <w:t>號</w:t>
-      </w:r>
-      <w:r>
-        <w:rPr>
-          <w:rFonts w:ascii="新細明體" w:eastAsia="新細明體" w:hAnsi="新細明體" w:hint="eastAsia"/>
-          <w:lang w:eastAsia="zh-TW"/>
-        </w:rPr>
-        <w:t>函釋例，均公開於本會網站）。</w:t>
-      </w:r>
-    </w:p>
-    <w:p>
-      <w:pPr>
-        <w:pStyle w:val="a9"/>
-        <w:ind w:hanging="480"/>
-        <w:jc w:val="both"/>
-        <w:rPr>
-          <w:rFonts w:ascii="新細明體" w:eastAsia="新細明體" w:hAnsi="新細明體" w:hint="eastAsia"/>
-          <w:lang w:eastAsia="zh-TW"/>
-        </w:rPr>
-      </w:pPr>
-      <w:r>
-        <w:rPr>
-          <w:rFonts w:ascii="新細明體" w:eastAsia="新細明體" w:hAnsi="新細明體" w:hint="eastAsia"/>
-          <w:lang w:eastAsia="zh-TW"/>
-        </w:rPr>
-        <w:t>註3：如發現技師或建築師有涉及違反其專技人員相關法規而涉及懲戒者，請依本會95年2月27日工程企字第09500069150號函釋例辦理（公開於本會網站）。</w:t>
-      </w:r>
-    </w:p>
-    <w:p>
-      <w:pPr>
-        <w:pStyle w:val="a9"/>
-        <w:ind w:hanging="480"/>
-        <w:jc w:val="both"/>
-        <w:rPr>
-          <w:rFonts w:ascii="新細明體" w:eastAsia="新細明體" w:hAnsi="新細明體" w:hint="eastAsia"/>
-          <w:lang w:eastAsia="zh-TW"/>
-        </w:rPr>
-      </w:pPr>
-      <w:r>
-        <w:rPr>
-          <w:rFonts w:ascii="新細明體" w:eastAsia="新細明體" w:hAnsi="新細明體" w:hint="eastAsia"/>
-          <w:lang w:eastAsia="zh-TW"/>
-        </w:rPr>
-        <w:t>註4：為</w:t>
-      </w:r>
-      <w:r>
-        <w:rPr>
-          <w:rFonts w:ascii="新細明體" w:eastAsia="新細明體" w:hAnsi="新細明體"/>
-          <w:lang w:eastAsia="zh-TW"/>
-        </w:rPr>
-        <w:t>提醒廠商並預防爭議之產生，</w:t>
-      </w:r>
-      <w:r>
-        <w:rPr>
-          <w:rFonts w:ascii="新細明體" w:eastAsia="新細明體" w:hAnsi="新細明體" w:hint="eastAsia"/>
-          <w:lang w:eastAsia="zh-TW"/>
-        </w:rPr>
-        <w:t>本會業以95年3月15日工程企字第09500090960號函</w:t>
-      </w:r>
-      <w:r>
-        <w:rPr>
-          <w:rFonts w:ascii="新細明體" w:eastAsia="新細明體" w:hAnsi="新細明體"/>
-          <w:lang w:eastAsia="zh-TW"/>
-        </w:rPr>
-        <w:t>各機關</w:t>
-      </w:r>
-      <w:r>
-        <w:rPr>
-          <w:rFonts w:ascii="新細明體" w:eastAsia="新細明體" w:hAnsi="新細明體" w:hint="eastAsia"/>
-          <w:lang w:eastAsia="zh-TW"/>
-        </w:rPr>
-        <w:t>，</w:t>
-      </w:r>
-      <w:r>
-        <w:rPr>
-          <w:rFonts w:ascii="新細明體" w:eastAsia="新細明體" w:hAnsi="新細明體"/>
-          <w:lang w:eastAsia="zh-TW"/>
-        </w:rPr>
-        <w:t>建議</w:t>
-      </w:r>
-      <w:r>
-        <w:rPr>
-          <w:rFonts w:ascii="新細明體" w:eastAsia="新細明體" w:hAnsi="新細明體" w:hint="eastAsia"/>
-          <w:lang w:eastAsia="zh-TW"/>
-        </w:rPr>
-        <w:t>其</w:t>
-      </w:r>
-      <w:r>
-        <w:rPr>
-          <w:rFonts w:ascii="新細明體" w:eastAsia="新細明體" w:hAnsi="新細明體"/>
-          <w:lang w:eastAsia="zh-TW"/>
-        </w:rPr>
-        <w:t>辦理技術服務採購或工程採購</w:t>
-      </w:r>
-      <w:r>
-        <w:rPr>
-          <w:rFonts w:ascii="新細明體" w:eastAsia="新細明體" w:hAnsi="新細明體" w:hint="eastAsia"/>
-          <w:lang w:eastAsia="zh-TW"/>
-        </w:rPr>
-        <w:t>時，</w:t>
-      </w:r>
-      <w:r>
-        <w:rPr>
-          <w:rFonts w:ascii="新細明體" w:eastAsia="新細明體" w:hAnsi="新細明體"/>
-          <w:lang w:eastAsia="zh-TW"/>
-        </w:rPr>
-        <w:t>於招標文件規定廠商分別於投標時、開工前檢附相關切結書</w:t>
-      </w:r>
-      <w:r>
-        <w:rPr>
-          <w:rFonts w:ascii="新細明體" w:eastAsia="新細明體" w:hAnsi="新細明體" w:hint="eastAsia"/>
-          <w:lang w:eastAsia="zh-TW"/>
-        </w:rPr>
-        <w:t>，並以101年1月13日工程企字第10100017900號函</w:t>
-      </w:r>
-      <w:r>
-        <w:rPr>
-          <w:rFonts w:ascii="新細明體" w:eastAsia="新細明體" w:hAnsi="新細明體"/>
-          <w:lang w:eastAsia="zh-TW"/>
-        </w:rPr>
-        <w:t>修正「廠商參與公共工程可能涉及之法律責任」及廠商或其人員切結書</w:t>
-      </w:r>
-      <w:r>
-        <w:rPr>
-          <w:rFonts w:ascii="新細明體" w:eastAsia="新細明體" w:hAnsi="新細明體" w:hint="eastAsia"/>
-          <w:lang w:eastAsia="zh-TW"/>
-        </w:rPr>
-        <w:t>（均公開於本會網站）。</w:t>
-      </w:r>
-    </w:p>
-    <w:p>
-      <w:pPr>
-        <w:pStyle w:val="a9"/>
-        <w:ind w:hanging="480"/>
-        <w:jc w:val="both"/>
-        <w:rPr>
-          <w:rFonts w:ascii="新細明體" w:eastAsia="新細明體" w:hAnsi="新細明體" w:hint="eastAsia"/>
-          <w:lang w:eastAsia="zh-TW"/>
-        </w:rPr>
-      </w:pPr>
-      <w:r>
-        <w:rPr>
-          <w:rFonts w:ascii="新細明體" w:eastAsia="新細明體" w:hAnsi="新細明體" w:hint="eastAsia"/>
-          <w:lang w:eastAsia="zh-TW"/>
-        </w:rPr>
-        <w:t>註5：</w:t>
-      </w:r>
-      <w:r>
-        <w:rPr>
-          <w:rFonts w:ascii="新細明體" w:eastAsia="新細明體" w:hAnsi="新細明體"/>
-          <w:lang w:eastAsia="zh-TW"/>
-        </w:rPr>
-        <w:t>中華民國營造工程工業同業公會全國聯合會</w:t>
-      </w:r>
-      <w:r>
-        <w:rPr>
-          <w:rFonts w:ascii="新細明體" w:eastAsia="新細明體" w:hAnsi="新細明體" w:hint="eastAsia"/>
-          <w:lang w:eastAsia="zh-TW"/>
-        </w:rPr>
-        <w:t>及</w:t>
-      </w:r>
-      <w:r>
-        <w:rPr>
-          <w:rFonts w:ascii="新細明體" w:eastAsia="新細明體" w:hAnsi="新細明體"/>
-          <w:lang w:eastAsia="zh-TW"/>
-        </w:rPr>
-        <w:t>台灣區營造工程工業同業公會91</w:t>
-      </w:r>
-      <w:r>
-        <w:rPr>
-          <w:rFonts w:ascii="新細明體" w:eastAsia="新細明體" w:hAnsi="新細明體" w:hint="eastAsia"/>
-          <w:lang w:eastAsia="zh-TW"/>
-        </w:rPr>
-        <w:t>年</w:t>
-      </w:r>
-      <w:r>
-        <w:rPr>
-          <w:rFonts w:ascii="新細明體" w:eastAsia="新細明體" w:hAnsi="新細明體"/>
-          <w:lang w:eastAsia="zh-TW"/>
-        </w:rPr>
-        <w:t>12</w:t>
-      </w:r>
-      <w:r>
-        <w:rPr>
-          <w:rFonts w:ascii="新細明體" w:eastAsia="新細明體" w:hAnsi="新細明體" w:hint="eastAsia"/>
-          <w:lang w:eastAsia="zh-TW"/>
-        </w:rPr>
-        <w:t>月</w:t>
-      </w:r>
-      <w:r>
-        <w:rPr>
-          <w:rFonts w:ascii="新細明體" w:eastAsia="新細明體" w:hAnsi="新細明體"/>
-          <w:lang w:eastAsia="zh-TW"/>
-        </w:rPr>
-        <w:t>5</w:t>
-      </w:r>
-      <w:r>
-        <w:rPr>
-          <w:rFonts w:ascii="新細明體" w:eastAsia="新細明體" w:hAnsi="新細明體" w:hint="eastAsia"/>
-          <w:lang w:eastAsia="zh-TW"/>
-        </w:rPr>
         <w:t>日來函建議將公共工程設計與監造分開委由不同廠商辦理乙案，本會業以91年12月27日工程企字第09100566170號函請各機關注意防範在案（公開於本會網站）。</w:t>
       </w:r>
     </w:p>
     <w:p>
       <w:pPr>
         <w:rPr>
-          <w:rFonts w:hint="eastAsia"/>
           <w:lang w:eastAsia="zh-TW"/>
         </w:rPr>
       </w:pPr>
@@ -19918,7 +19909,7 @@
         <w:ind w:hanging="720"/>
         <w:jc w:val="both"/>
         <w:rPr>
-          <w:rFonts w:ascii="新細明體" w:eastAsia="新細明體" w:hAnsi="新細明體" w:hint="eastAsia"/>
+          <w:rFonts w:ascii="新細明體" w:eastAsia="新細明體" w:hAnsi="新細明體"/>
           <w:lang w:eastAsia="zh-TW"/>
         </w:rPr>
       </w:pPr>
@@ -20028,7 +20019,7 @@
             <w:pPr>
               <w:jc w:val="both"/>
               <w:rPr>
-                <w:rFonts w:ascii="新細明體" w:hAnsi="新細明體" w:hint="eastAsia"/>
+                <w:rFonts w:ascii="新細明體" w:hAnsi="新細明體"/>
                 <w:sz w:val="24"/>
                 <w:szCs w:val="24"/>
                 <w:lang w:eastAsia="zh-TW"/>
@@ -20049,7 +20040,7 @@
               <w:ind w:left="480" w:hangingChars="200" w:hanging="480"/>
               <w:jc w:val="both"/>
               <w:rPr>
-                <w:rFonts w:ascii="新細明體" w:hAnsi="新細明體" w:hint="eastAsia"/>
+                <w:rFonts w:ascii="新細明體" w:hAnsi="新細明體"/>
                 <w:sz w:val="24"/>
                 <w:szCs w:val="24"/>
                 <w:lang w:eastAsia="zh-TW"/>
@@ -20070,7 +20061,7 @@
               <w:ind w:left="480" w:hangingChars="200" w:hanging="480"/>
               <w:jc w:val="both"/>
               <w:rPr>
-                <w:rFonts w:ascii="新細明體" w:hAnsi="新細明體" w:hint="eastAsia"/>
+                <w:rFonts w:ascii="新細明體" w:hAnsi="新細明體"/>
                 <w:sz w:val="24"/>
                 <w:szCs w:val="24"/>
                 <w:lang w:eastAsia="zh-TW"/>
@@ -20101,7 +20092,7 @@
               <w:spacing w:line="360" w:lineRule="exact"/>
               <w:jc w:val="both"/>
               <w:rPr>
-                <w:rFonts w:ascii="新細明體" w:hAnsi="新細明體" w:hint="eastAsia"/>
+                <w:rFonts w:ascii="新細明體" w:hAnsi="新細明體"/>
                 <w:sz w:val="24"/>
                 <w:szCs w:val="24"/>
                 <w:lang w:eastAsia="zh-TW"/>
@@ -20126,7 +20117,7 @@
               <w:spacing w:line="360" w:lineRule="exact"/>
               <w:jc w:val="both"/>
               <w:rPr>
-                <w:rFonts w:ascii="新細明體" w:hAnsi="新細明體" w:hint="eastAsia"/>
+                <w:rFonts w:ascii="新細明體" w:hAnsi="新細明體"/>
                 <w:sz w:val="24"/>
                 <w:szCs w:val="24"/>
               </w:rPr>
@@ -20158,7 +20149,7 @@
               <w:spacing w:line="360" w:lineRule="exact"/>
               <w:jc w:val="both"/>
               <w:rPr>
-                <w:rFonts w:ascii="新細明體" w:hAnsi="新細明體" w:hint="eastAsia"/>
+                <w:rFonts w:ascii="新細明體" w:hAnsi="新細明體"/>
                 <w:sz w:val="24"/>
                 <w:szCs w:val="24"/>
                 <w:lang w:eastAsia="zh-TW"/>
@@ -20188,7 +20179,7 @@
             <w:pPr>
               <w:jc w:val="both"/>
               <w:rPr>
-                <w:rFonts w:ascii="新細明體" w:hAnsi="新細明體" w:hint="eastAsia"/>
+                <w:rFonts w:ascii="新細明體" w:hAnsi="新細明體"/>
                 <w:sz w:val="24"/>
                 <w:szCs w:val="24"/>
                 <w:lang w:eastAsia="zh-TW"/>
@@ -20208,7 +20199,7 @@
             <w:pPr>
               <w:jc w:val="both"/>
               <w:rPr>
-                <w:rFonts w:ascii="新細明體" w:hAnsi="新細明體" w:hint="eastAsia"/>
+                <w:rFonts w:ascii="新細明體" w:hAnsi="新細明體"/>
                 <w:sz w:val="24"/>
                 <w:szCs w:val="24"/>
                 <w:lang w:eastAsia="zh-TW"/>
@@ -20239,7 +20230,7 @@
               <w:spacing w:line="360" w:lineRule="exact"/>
               <w:jc w:val="both"/>
               <w:rPr>
-                <w:rFonts w:ascii="新細明體" w:hAnsi="新細明體" w:hint="eastAsia"/>
+                <w:rFonts w:ascii="新細明體" w:hAnsi="新細明體"/>
                 <w:sz w:val="24"/>
                 <w:szCs w:val="24"/>
                 <w:lang w:eastAsia="zh-TW"/>
@@ -20264,7 +20255,7 @@
               <w:spacing w:line="360" w:lineRule="exact"/>
               <w:jc w:val="both"/>
               <w:rPr>
-                <w:rFonts w:ascii="新細明體" w:hAnsi="新細明體" w:hint="eastAsia"/>
+                <w:rFonts w:ascii="新細明體" w:hAnsi="新細明體"/>
                 <w:sz w:val="24"/>
                 <w:szCs w:val="24"/>
                 <w:lang w:eastAsia="zh-TW"/>
@@ -20325,7 +20316,7 @@
               <w:spacing w:line="360" w:lineRule="exact"/>
               <w:jc w:val="both"/>
               <w:rPr>
-                <w:rFonts w:ascii="新細明體" w:hAnsi="新細明體" w:hint="eastAsia"/>
+                <w:rFonts w:ascii="新細明體" w:hAnsi="新細明體"/>
                 <w:sz w:val="24"/>
                 <w:szCs w:val="24"/>
                 <w:lang w:eastAsia="zh-TW"/>
@@ -20355,7 +20346,7 @@
             <w:pPr>
               <w:jc w:val="both"/>
               <w:rPr>
-                <w:rFonts w:ascii="新細明體" w:hAnsi="新細明體" w:hint="eastAsia"/>
+                <w:rFonts w:ascii="新細明體" w:hAnsi="新細明體"/>
                 <w:sz w:val="24"/>
                 <w:szCs w:val="24"/>
                 <w:lang w:eastAsia="zh-TW"/>
@@ -20375,7 +20366,7 @@
             <w:pPr>
               <w:jc w:val="both"/>
               <w:rPr>
-                <w:rFonts w:ascii="新細明體" w:hAnsi="新細明體" w:hint="eastAsia"/>
+                <w:rFonts w:ascii="新細明體" w:hAnsi="新細明體"/>
                 <w:sz w:val="24"/>
                 <w:szCs w:val="24"/>
                 <w:lang w:eastAsia="zh-TW"/>
@@ -20406,7 +20397,7 @@
               <w:spacing w:line="360" w:lineRule="exact"/>
               <w:jc w:val="both"/>
               <w:rPr>
-                <w:rFonts w:ascii="新細明體" w:hAnsi="新細明體" w:hint="eastAsia"/>
+                <w:rFonts w:ascii="新細明體" w:hAnsi="新細明體"/>
                 <w:sz w:val="24"/>
                 <w:szCs w:val="24"/>
                 <w:lang w:eastAsia="zh-TW"/>
@@ -20431,7 +20422,7 @@
               <w:spacing w:line="360" w:lineRule="exact"/>
               <w:jc w:val="both"/>
               <w:rPr>
-                <w:rFonts w:ascii="新細明體" w:hAnsi="新細明體" w:hint="eastAsia"/>
+                <w:rFonts w:ascii="新細明體" w:hAnsi="新細明體"/>
                 <w:sz w:val="24"/>
                 <w:szCs w:val="24"/>
                 <w:lang w:eastAsia="zh-TW"/>
@@ -20453,7 +20444,7 @@
               <w:ind w:left="720" w:hangingChars="300" w:hanging="720"/>
               <w:jc w:val="both"/>
               <w:rPr>
-                <w:rFonts w:ascii="新細明體" w:hAnsi="新細明體" w:hint="eastAsia"/>
+                <w:rFonts w:ascii="新細明體" w:hAnsi="新細明體"/>
                 <w:sz w:val="24"/>
                 <w:szCs w:val="24"/>
                 <w:lang w:eastAsia="zh-TW"/>
@@ -20503,7 +20494,7 @@
               <w:ind w:left="720" w:hangingChars="300" w:hanging="720"/>
               <w:jc w:val="both"/>
               <w:rPr>
-                <w:rFonts w:ascii="新細明體" w:hAnsi="新細明體" w:hint="eastAsia"/>
+                <w:rFonts w:ascii="新細明體" w:hAnsi="新細明體"/>
                 <w:sz w:val="24"/>
                 <w:szCs w:val="24"/>
                 <w:lang w:eastAsia="zh-TW"/>
@@ -20569,7 +20560,7 @@
             <w:pPr>
               <w:jc w:val="both"/>
               <w:rPr>
-                <w:rFonts w:ascii="新細明體" w:hAnsi="新細明體" w:hint="eastAsia"/>
+                <w:rFonts w:ascii="新細明體" w:hAnsi="新細明體"/>
                 <w:sz w:val="24"/>
                 <w:szCs w:val="24"/>
                 <w:lang w:eastAsia="zh-TW"/>
@@ -20589,7 +20580,7 @@
             <w:pPr>
               <w:jc w:val="both"/>
               <w:rPr>
-                <w:rFonts w:ascii="新細明體" w:hAnsi="新細明體" w:hint="eastAsia"/>
+                <w:rFonts w:ascii="新細明體" w:hAnsi="新細明體"/>
                 <w:sz w:val="24"/>
                 <w:szCs w:val="24"/>
                 <w:lang w:eastAsia="zh-TW"/>
@@ -20620,7 +20611,7 @@
               <w:spacing w:line="360" w:lineRule="exact"/>
               <w:jc w:val="both"/>
               <w:rPr>
-                <w:rFonts w:ascii="新細明體" w:hAnsi="新細明體" w:hint="eastAsia"/>
+                <w:rFonts w:ascii="新細明體" w:hAnsi="新細明體"/>
                 <w:sz w:val="24"/>
                 <w:szCs w:val="24"/>
                 <w:lang w:eastAsia="zh-TW"/>
@@ -20645,7 +20636,7 @@
               <w:spacing w:line="360" w:lineRule="exact"/>
               <w:jc w:val="both"/>
               <w:rPr>
-                <w:rFonts w:ascii="新細明體" w:hAnsi="新細明體" w:hint="eastAsia"/>
+                <w:rFonts w:ascii="新細明體" w:hAnsi="新細明體"/>
                 <w:sz w:val="24"/>
                 <w:szCs w:val="24"/>
                 <w:lang w:eastAsia="zh-TW"/>
@@ -20675,7 +20666,7 @@
             <w:pPr>
               <w:jc w:val="both"/>
               <w:rPr>
-                <w:rFonts w:ascii="新細明體" w:hAnsi="新細明體" w:hint="eastAsia"/>
+                <w:rFonts w:ascii="新細明體" w:hAnsi="新細明體"/>
                 <w:sz w:val="24"/>
                 <w:szCs w:val="24"/>
                 <w:lang w:eastAsia="zh-TW"/>
@@ -20695,7 +20686,7 @@
             <w:pPr>
               <w:jc w:val="both"/>
               <w:rPr>
-                <w:rFonts w:ascii="新細明體" w:hAnsi="新細明體" w:hint="eastAsia"/>
+                <w:rFonts w:ascii="新細明體" w:hAnsi="新細明體"/>
                 <w:sz w:val="24"/>
                 <w:szCs w:val="24"/>
                 <w:lang w:eastAsia="zh-TW"/>
@@ -20722,7 +20713,7 @@
               <w:spacing w:line="360" w:lineRule="exact"/>
               <w:jc w:val="both"/>
               <w:rPr>
-                <w:rFonts w:ascii="新細明體" w:hAnsi="新細明體" w:hint="eastAsia"/>
+                <w:rFonts w:ascii="新細明體" w:hAnsi="新細明體"/>
                 <w:sz w:val="24"/>
                 <w:szCs w:val="24"/>
                 <w:lang w:eastAsia="zh-TW"/>
@@ -21392,7 +21383,6 @@
         <w:ind w:hanging="720"/>
         <w:jc w:val="both"/>
         <w:rPr>
-          <w:rFonts w:hint="eastAsia"/>
           <w:lang w:eastAsia="zh-TW"/>
         </w:rPr>
       </w:pPr>

</xml_diff>